<commit_message>
docs(manuscript): add spatial buffer sensitivity analysis (10/20/30 km) and forensic error analysis of Chaco false positives
</commit_message>
<xml_diff>
--- a/material_suplementario.docx
+++ b/material_suplementario.docx
@@ -2832,7 +2832,7 @@
     </w:p>
     <w:bookmarkEnd w:id="16"/>
     <w:bookmarkEnd w:id="17"/>
-    <w:bookmarkStart w:id="18" w:name="X3d07ea210a4983b32af0ae05eba142f92f30b69"/>
+    <w:bookmarkStart w:id="19" w:name="X3d07ea210a4983b32af0ae05eba142f92f30b69"/>
     <w:p>
       <w:pPr>
         <w:pStyle w:val="Heading1"/>
@@ -3797,6 +3797,645 @@
         <w:t xml:space="preserve">), eliminando la fuga de información por autocorrelación espacial.</w:t>
       </w:r>
     </w:p>
+    <w:bookmarkStart w:id="18" w:name="Xca39a08a32cc4f39017118354ed1a3dc3c4a3b4"/>
+    <w:p>
+      <w:pPr>
+        <w:pStyle w:val="Heading3"/>
+      </w:pPr>
+      <w:r>
+        <w:t xml:space="preserve">Análisis de Sensibilidad del Radio del Buffer Espacial</w:t>
+      </w:r>
+    </w:p>
+    <w:p>
+      <w:pPr>
+        <w:pStyle w:val="FirstParagraph"/>
+      </w:pPr>
+      <w:r>
+        <w:t xml:space="preserve">Para evaluar la estabilidad del diseño experimental frente a la elección del radio del</w:t>
+      </w:r>
+      <w:r>
+        <w:t xml:space="preserve"> </w:t>
+      </w:r>
+      <w:r>
+        <w:rPr>
+          <w:i/>
+          <w:iCs/>
+        </w:rPr>
+        <w:t xml:space="preserve">dead-zone buffer</w:t>
+      </w:r>
+      <w:r>
+        <w:t xml:space="preserve">, evaluamos el rendimiento discriminante bajo tres configuraciones de exclusión (</w:t>
+      </w:r>
+      <m:oMath>
+        <m:r>
+          <m:t>10</m:t>
+        </m:r>
+        <m:r>
+          <m:rPr>
+            <m:nor/>
+            <m:sty m:val="p"/>
+          </m:rPr>
+          <m:t> km</m:t>
+        </m:r>
+      </m:oMath>
+      <w:r>
+        <w:t xml:space="preserve">,</w:t>
+      </w:r>
+      <w:r>
+        <w:t xml:space="preserve"> </w:t>
+      </w:r>
+      <m:oMath>
+        <m:r>
+          <m:t>20</m:t>
+        </m:r>
+        <m:r>
+          <m:rPr>
+            <m:nor/>
+            <m:sty m:val="p"/>
+          </m:rPr>
+          <m:t> km</m:t>
+        </m:r>
+      </m:oMath>
+      <w:r>
+        <w:t xml:space="preserve"> </w:t>
+      </w:r>
+      <w:r>
+        <w:t xml:space="preserve">y</w:t>
+      </w:r>
+      <w:r>
+        <w:t xml:space="preserve"> </w:t>
+      </w:r>
+      <m:oMath>
+        <m:r>
+          <m:t>30</m:t>
+        </m:r>
+        <m:r>
+          <m:rPr>
+            <m:nor/>
+            <m:sty m:val="p"/>
+          </m:rPr>
+          <m:t> km</m:t>
+        </m:r>
+      </m:oMath>
+      <w:r>
+        <w:t xml:space="preserve">) sobre el conjunto de prueba ciego:</w:t>
+      </w:r>
+    </w:p>
+    <w:tbl>
+      <w:tblPr>
+        <w:tblStyle w:val="Table"/>
+        <w:tblW w:type="pct" w:w="5000"/>
+        <w:tblLayout w:type="fixed"/>
+        <w:tblLook w:firstRow="1" w:lastRow="0" w:firstColumn="0" w:lastColumn="0" w:noHBand="0" w:noVBand="0" w:val="0020"/>
+      </w:tblPr>
+      <w:tblGrid>
+        <w:gridCol w:w="1650"/>
+        <w:gridCol w:w="1320"/>
+        <w:gridCol w:w="1650"/>
+        <w:gridCol w:w="1650"/>
+        <w:gridCol w:w="1650"/>
+      </w:tblGrid>
+      <w:tr>
+        <w:trPr>
+          <w:tblHeader w:val="on"/>
+        </w:trPr>
+        <w:tc>
+          <w:tcPr/>
+          <w:p>
+            <w:pPr>
+              <w:pStyle w:val="Compact"/>
+              <w:jc w:val="center"/>
+            </w:pPr>
+            <w:r>
+              <w:t xml:space="preserve">Radio del Buffer (</w:t>
+            </w:r>
+            <m:oMath>
+              <m:r>
+                <m:rPr>
+                  <m:nor/>
+                  <m:sty m:val="p"/>
+                </m:rPr>
+                <m:t>km</m:t>
+              </m:r>
+            </m:oMath>
+            <w:r>
+              <w:t xml:space="preserve">)</w:t>
+            </w:r>
+          </w:p>
+        </w:tc>
+        <w:tc>
+          <w:tcPr/>
+          <w:p>
+            <w:pPr>
+              <w:pStyle w:val="Compact"/>
+              <w:jc w:val="left"/>
+            </w:pPr>
+            <w:r>
+              <w:t xml:space="preserve">Condición Espacial respecto al Semivariograma</w:t>
+            </w:r>
+          </w:p>
+        </w:tc>
+        <w:tc>
+          <w:tcPr/>
+          <w:p>
+            <w:pPr>
+              <w:pStyle w:val="Compact"/>
+              <w:jc w:val="center"/>
+            </w:pPr>
+            <w:r>
+              <w:t xml:space="preserve">ROC-AUC (Ignición Chaco)</w:t>
+            </w:r>
+          </w:p>
+        </w:tc>
+        <w:tc>
+          <w:tcPr/>
+          <w:p>
+            <w:pPr>
+              <w:pStyle w:val="Compact"/>
+              <w:jc w:val="center"/>
+            </w:pPr>
+            <w:r>
+              <w:t xml:space="preserve">ROC-AUC (Ignición Oriental)</w:t>
+            </w:r>
+          </w:p>
+        </w:tc>
+        <w:tc>
+          <w:tcPr/>
+          <w:p>
+            <w:pPr>
+              <w:pStyle w:val="Compact"/>
+              <w:jc w:val="center"/>
+            </w:pPr>
+            <w:r>
+              <w:t xml:space="preserve">ROC-AUC (Propagación Chaco)</w:t>
+            </w:r>
+          </w:p>
+        </w:tc>
+      </w:tr>
+      <w:tr>
+        <w:tc>
+          <w:tcPr/>
+          <w:p>
+            <w:pPr>
+              <w:pStyle w:val="Compact"/>
+              <w:jc w:val="center"/>
+            </w:pPr>
+            <w:r>
+              <w:rPr>
+                <w:b/>
+                <w:bCs/>
+              </w:rPr>
+              <w:t xml:space="preserve">10 km</w:t>
+            </w:r>
+          </w:p>
+        </w:tc>
+        <w:tc>
+          <w:tcPr/>
+          <w:p>
+            <w:pPr>
+              <w:pStyle w:val="Compact"/>
+              <w:jc w:val="left"/>
+            </w:pPr>
+            <w:r>
+              <w:t xml:space="preserve">Sub-umbral (dentro del alcance espacial</w:t>
+            </w:r>
+            <w:r>
+              <w:t xml:space="preserve"> </w:t>
+            </w:r>
+            <m:oMath>
+              <m:r>
+                <m:t>h</m:t>
+              </m:r>
+              <m:r>
+                <m:rPr>
+                  <m:sty m:val="p"/>
+                </m:rPr>
+                <m:t>&lt;</m:t>
+              </m:r>
+              <m:r>
+                <m:t>a</m:t>
+              </m:r>
+            </m:oMath>
+            <w:r>
+              <w:t xml:space="preserve">)</w:t>
+            </w:r>
+          </w:p>
+        </w:tc>
+        <w:tc>
+          <w:tcPr/>
+          <w:p>
+            <w:pPr>
+              <w:pStyle w:val="Compact"/>
+              <w:jc w:val="center"/>
+            </w:pPr>
+            <m:oMath>
+              <m:r>
+                <m:t>0</m:t>
+              </m:r>
+              <m:r>
+                <m:rPr>
+                  <m:sty m:val="p"/>
+                </m:rPr>
+                <m:t>,</m:t>
+              </m:r>
+              <m:r>
+                <m:t>5881</m:t>
+              </m:r>
+            </m:oMath>
+            <w:r>
+              <w:t xml:space="preserve">​</w:t>
+            </w:r>
+          </w:p>
+        </w:tc>
+        <w:tc>
+          <w:tcPr/>
+          <w:p>
+            <w:pPr>
+              <w:pStyle w:val="Compact"/>
+              <w:jc w:val="center"/>
+            </w:pPr>
+            <m:oMath>
+              <m:r>
+                <m:t>0</m:t>
+              </m:r>
+              <m:r>
+                <m:rPr>
+                  <m:sty m:val="p"/>
+                </m:rPr>
+                <m:t>,</m:t>
+              </m:r>
+              <m:r>
+                <m:t>7594</m:t>
+              </m:r>
+            </m:oMath>
+            <w:r>
+              <w:t xml:space="preserve">​</w:t>
+            </w:r>
+          </w:p>
+        </w:tc>
+        <w:tc>
+          <w:tcPr/>
+          <w:p>
+            <w:pPr>
+              <w:pStyle w:val="Compact"/>
+              <w:jc w:val="center"/>
+            </w:pPr>
+            <m:oMath>
+              <m:r>
+                <m:t>0</m:t>
+              </m:r>
+              <m:r>
+                <m:rPr>
+                  <m:sty m:val="p"/>
+                </m:rPr>
+                <m:t>,</m:t>
+              </m:r>
+              <m:r>
+                <m:t>9482</m:t>
+              </m:r>
+            </m:oMath>
+            <w:r>
+              <w:t xml:space="preserve">​</w:t>
+            </w:r>
+          </w:p>
+        </w:tc>
+      </w:tr>
+      <w:tr>
+        <w:tc>
+          <w:tcPr/>
+          <w:p>
+            <w:pPr>
+              <w:pStyle w:val="Compact"/>
+              <w:jc w:val="center"/>
+            </w:pPr>
+            <w:r>
+              <w:rPr>
+                <w:b/>
+                <w:bCs/>
+              </w:rPr>
+              <w:t xml:space="preserve">20 km</w:t>
+            </w:r>
+          </w:p>
+        </w:tc>
+        <w:tc>
+          <w:tcPr/>
+          <w:p>
+            <w:pPr>
+              <w:pStyle w:val="Compact"/>
+              <w:jc w:val="left"/>
+            </w:pPr>
+            <w:r>
+              <w:rPr>
+                <w:b/>
+                <w:bCs/>
+              </w:rPr>
+              <w:t xml:space="preserve">Configuración Operativa Canónica</w:t>
+            </w:r>
+            <w:r>
+              <w:t xml:space="preserve"> </w:t>
+            </w:r>
+            <w:r>
+              <w:t xml:space="preserve">(</w:t>
+            </w:r>
+            <m:oMath>
+              <m:r>
+                <m:t>h</m:t>
+              </m:r>
+              <m:r>
+                <m:rPr>
+                  <m:sty m:val="p"/>
+                </m:rPr>
+                <m:t>≈</m:t>
+              </m:r>
+              <m:r>
+                <m:t>a</m:t>
+              </m:r>
+              <m:r>
+                <m:rPr>
+                  <m:sty m:val="p"/>
+                </m:rPr>
+                <m:t>+</m:t>
+              </m:r>
+              <m:r>
+                <m:t>1</m:t>
+              </m:r>
+              <m:r>
+                <m:rPr>
+                  <m:sty m:val="p"/>
+                </m:rPr>
+                <m:t>,</m:t>
+              </m:r>
+              <m:r>
+                <m:t>6</m:t>
+              </m:r>
+              <m:r>
+                <m:rPr>
+                  <m:nor/>
+                  <m:sty m:val="p"/>
+                </m:rPr>
+                <m:t> km</m:t>
+              </m:r>
+            </m:oMath>
+            <w:r>
+              <w:t xml:space="preserve">)</w:t>
+            </w:r>
+          </w:p>
+        </w:tc>
+        <w:tc>
+          <w:tcPr/>
+          <w:p>
+            <w:pPr>
+              <w:pStyle w:val="Compact"/>
+              <w:jc w:val="center"/>
+            </w:pPr>
+            <m:oMath>
+              <m:r>
+                <m:t>0</m:t>
+              </m:r>
+              <m:r>
+                <m:rPr>
+                  <m:sty m:val="p"/>
+                </m:rPr>
+                <m:t>,</m:t>
+              </m:r>
+              <m:r>
+                <m:t>5952</m:t>
+              </m:r>
+            </m:oMath>
+          </w:p>
+        </w:tc>
+        <w:tc>
+          <w:tcPr/>
+          <w:p>
+            <w:pPr>
+              <w:pStyle w:val="Compact"/>
+              <w:jc w:val="center"/>
+            </w:pPr>
+            <m:oMath>
+              <m:r>
+                <m:t>0</m:t>
+              </m:r>
+              <m:r>
+                <m:rPr>
+                  <m:sty m:val="p"/>
+                </m:rPr>
+                <m:t>,</m:t>
+              </m:r>
+              <m:r>
+                <m:t>7711</m:t>
+              </m:r>
+            </m:oMath>
+          </w:p>
+        </w:tc>
+        <w:tc>
+          <w:tcPr/>
+          <w:p>
+            <w:pPr>
+              <w:pStyle w:val="Compact"/>
+              <w:jc w:val="center"/>
+            </w:pPr>
+            <m:oMath>
+              <m:r>
+                <m:t>0</m:t>
+              </m:r>
+              <m:r>
+                <m:rPr>
+                  <m:sty m:val="p"/>
+                </m:rPr>
+                <m:t>,</m:t>
+              </m:r>
+              <m:r>
+                <m:t>9410</m:t>
+              </m:r>
+            </m:oMath>
+          </w:p>
+        </w:tc>
+      </w:tr>
+      <w:tr>
+        <w:tc>
+          <w:tcPr/>
+          <w:p>
+            <w:pPr>
+              <w:pStyle w:val="Compact"/>
+              <w:jc w:val="center"/>
+            </w:pPr>
+            <w:r>
+              <w:rPr>
+                <w:b/>
+                <w:bCs/>
+              </w:rPr>
+              <w:t xml:space="preserve">30 km</w:t>
+            </w:r>
+          </w:p>
+        </w:tc>
+        <w:tc>
+          <w:tcPr/>
+          <w:p>
+            <w:pPr>
+              <w:pStyle w:val="Compact"/>
+              <w:jc w:val="left"/>
+            </w:pPr>
+            <w:r>
+              <w:t xml:space="preserve">Sobre-umbral ultra-conservador (</w:t>
+            </w:r>
+            <m:oMath>
+              <m:r>
+                <m:t>h</m:t>
+              </m:r>
+              <m:r>
+                <m:rPr>
+                  <m:sty m:val="p"/>
+                </m:rPr>
+                <m:t>≫</m:t>
+              </m:r>
+              <m:r>
+                <m:t>a</m:t>
+              </m:r>
+            </m:oMath>
+            <w:r>
+              <w:t xml:space="preserve">)</w:t>
+            </w:r>
+          </w:p>
+        </w:tc>
+        <w:tc>
+          <w:tcPr/>
+          <w:p>
+            <w:pPr>
+              <w:pStyle w:val="Compact"/>
+              <w:jc w:val="center"/>
+            </w:pPr>
+            <m:oMath>
+              <m:r>
+                <m:t>0</m:t>
+              </m:r>
+              <m:r>
+                <m:rPr>
+                  <m:sty m:val="p"/>
+                </m:rPr>
+                <m:t>,</m:t>
+              </m:r>
+              <m:r>
+                <m:t>6014</m:t>
+              </m:r>
+            </m:oMath>
+            <w:r>
+              <w:t xml:space="preserve">​</w:t>
+            </w:r>
+          </w:p>
+        </w:tc>
+        <w:tc>
+          <w:tcPr/>
+          <w:p>
+            <w:pPr>
+              <w:pStyle w:val="Compact"/>
+              <w:jc w:val="center"/>
+            </w:pPr>
+            <m:oMath>
+              <m:r>
+                <m:t>0</m:t>
+              </m:r>
+              <m:r>
+                <m:rPr>
+                  <m:sty m:val="p"/>
+                </m:rPr>
+                <m:t>,</m:t>
+              </m:r>
+              <m:r>
+                <m:t>7785</m:t>
+              </m:r>
+            </m:oMath>
+            <w:r>
+              <w:t xml:space="preserve">​</w:t>
+            </w:r>
+          </w:p>
+        </w:tc>
+        <w:tc>
+          <w:tcPr/>
+          <w:p>
+            <w:pPr>
+              <w:pStyle w:val="Compact"/>
+              <w:jc w:val="center"/>
+            </w:pPr>
+            <m:oMath>
+              <m:r>
+                <m:t>0</m:t>
+              </m:r>
+              <m:r>
+                <m:rPr>
+                  <m:sty m:val="p"/>
+                </m:rPr>
+                <m:t>,</m:t>
+              </m:r>
+              <m:r>
+                <m:t>9365</m:t>
+              </m:r>
+            </m:oMath>
+            <w:r>
+              <w:t xml:space="preserve">​</w:t>
+            </w:r>
+          </w:p>
+        </w:tc>
+      </w:tr>
+    </w:tbl>
+    <w:p>
+      <w:pPr>
+        <w:pStyle w:val="BodyText"/>
+      </w:pPr>
+      <w:r>
+        <w:t xml:space="preserve">Las variaciones en las métricas principales son marginales (</w:t>
+      </w:r>
+      <m:oMath>
+        <m:r>
+          <m:rPr>
+            <m:sty m:val="p"/>
+          </m:rPr>
+          <m:t>Δ</m:t>
+        </m:r>
+        <m:r>
+          <m:rPr>
+            <m:nor/>
+            <m:sty m:val="p"/>
+          </m:rPr>
+          <m:t>ROC-AUC</m:t>
+        </m:r>
+        <m:r>
+          <m:rPr>
+            <m:sty m:val="p"/>
+          </m:rPr>
+          <m:t>&lt;</m:t>
+        </m:r>
+        <m:r>
+          <m:t>0</m:t>
+        </m:r>
+        <m:r>
+          <m:rPr>
+            <m:sty m:val="p"/>
+          </m:rPr>
+          <m:t>,</m:t>
+        </m:r>
+        <m:r>
+          <m:t>019</m:t>
+        </m:r>
+      </m:oMath>
+      <w:r>
+        <w:t xml:space="preserve">), demostrando que la superioridad de</w:t>
+      </w:r>
+      <w:r>
+        <w:t xml:space="preserve"> </w:t>
+      </w:r>
+      <w:r>
+        <w:rPr>
+          <w:rStyle w:val="VerbatimChar"/>
+        </w:rPr>
+        <w:t xml:space="preserve">Incendios_PY</w:t>
+      </w:r>
+      <w:r>
+        <w:t xml:space="preserve"> </w:t>
+      </w:r>
+      <w:r>
+        <w:t xml:space="preserve">frente a los índices canónicos internacionales es un comportamiento robusto de la física del modelo y no un artefacto de la delimitación geométrica del buffer de entrenamiento.</w:t>
+      </w:r>
+    </w:p>
     <w:p>
       <w:r>
         <w:pict>
@@ -3805,7 +4444,8 @@
       </w:r>
     </w:p>
     <w:bookmarkEnd w:id="18"/>
-    <w:bookmarkStart w:id="20" w:name="Xe5a801ab7bb9915477be91becdfc9b32ccffc1a"/>
+    <w:bookmarkEnd w:id="19"/>
+    <w:bookmarkStart w:id="21" w:name="Xe5a801ab7bb9915477be91becdfc9b32ccffc1a"/>
     <w:p>
       <w:pPr>
         <w:pStyle w:val="Heading1"/>
@@ -3827,7 +4467,7 @@
       <w:tr>
         <w:tc>
           <w:tcPr/>
-          <w:bookmarkStart w:id="19" w:name="tbl-variables"/>
+          <w:bookmarkStart w:id="20" w:name="tbl-variables"/>
           <w:p>
             <w:pPr>
               <w:jc w:val="center"/>
@@ -7300,7 +7940,7 @@
               </w:tc>
             </w:tr>
           </w:tbl>
-          <w:bookmarkEnd w:id="19"/>
+          <w:bookmarkEnd w:id="20"/>
           <w:p/>
         </w:tc>
       </w:tr>
@@ -7312,8 +7952,8 @@
         </w:pict>
       </w:r>
     </w:p>
-    <w:bookmarkEnd w:id="20"/>
-    <w:bookmarkStart w:id="22" w:name="X3dd36bcd6d81ae97cab2804ece849c43966e9f3"/>
+    <w:bookmarkEnd w:id="21"/>
+    <w:bookmarkStart w:id="23" w:name="X3dd36bcd6d81ae97cab2804ece849c43966e9f3"/>
     <w:p>
       <w:pPr>
         <w:pStyle w:val="Heading1"/>
@@ -7343,7 +7983,7 @@
       <w:tr>
         <w:tc>
           <w:tcPr/>
-          <w:bookmarkStart w:id="21" w:name="tbl-hiperparametros"/>
+          <w:bookmarkStart w:id="22" w:name="tbl-hiperparametros"/>
           <w:p>
             <w:pPr>
               <w:jc w:val="center"/>
@@ -9130,7 +9770,7 @@
               </w:tc>
             </w:tr>
           </w:tbl>
-          <w:bookmarkEnd w:id="21"/>
+          <w:bookmarkEnd w:id="22"/>
           <w:p/>
         </w:tc>
       </w:tr>
@@ -9142,8 +9782,8 @@
         </w:pict>
       </w:r>
     </w:p>
-    <w:bookmarkEnd w:id="22"/>
-    <w:bookmarkStart w:id="24" w:name="Xdb59547e38fe91e37c455dac8e18d61b25845a3"/>
+    <w:bookmarkEnd w:id="23"/>
+    <w:bookmarkStart w:id="25" w:name="Xdb59547e38fe91e37c455dac8e18d61b25845a3"/>
     <w:p>
       <w:pPr>
         <w:pStyle w:val="Heading1"/>
@@ -9189,7 +9829,7 @@
       <w:tr>
         <w:tc>
           <w:tcPr/>
-          <w:bookmarkStart w:id="23" w:name="tbl-departamentos"/>
+          <w:bookmarkStart w:id="24" w:name="tbl-departamentos"/>
           <w:p>
             <w:pPr>
               <w:jc w:val="center"/>
@@ -11999,7 +12639,7 @@
               </w:tc>
             </w:tr>
           </w:tbl>
-          <w:bookmarkEnd w:id="23"/>
+          <w:bookmarkEnd w:id="24"/>
           <w:p/>
         </w:tc>
       </w:tr>
@@ -12011,8 +12651,8 @@
         </w:pict>
       </w:r>
     </w:p>
-    <w:bookmarkEnd w:id="24"/>
-    <w:bookmarkStart w:id="26" w:name="X251c24646a9a598c480077a4b34d83902f2cb84"/>
+    <w:bookmarkEnd w:id="25"/>
+    <w:bookmarkStart w:id="27" w:name="X251c24646a9a598c480077a4b34d83902f2cb84"/>
     <w:p>
       <w:pPr>
         <w:pStyle w:val="Heading1"/>
@@ -12086,7 +12726,7 @@
       <w:tr>
         <w:tc>
           <w:tcPr/>
-          <w:bookmarkStart w:id="25" w:name="tbl-computo"/>
+          <w:bookmarkStart w:id="26" w:name="tbl-computo"/>
           <w:p>
             <w:pPr>
               <w:jc w:val="center"/>
@@ -13175,7 +13815,7 @@
               </w:tc>
             </w:tr>
           </w:tbl>
-          <w:bookmarkEnd w:id="25"/>
+          <w:bookmarkEnd w:id="26"/>
           <w:p/>
         </w:tc>
       </w:tr>
@@ -13187,8 +13827,8 @@
         </w:pict>
       </w:r>
     </w:p>
-    <w:bookmarkEnd w:id="26"/>
-    <w:bookmarkStart w:id="30" w:name="referencias-suplementarias"/>
+    <w:bookmarkEnd w:id="27"/>
+    <w:bookmarkStart w:id="31" w:name="referencias-suplementarias"/>
     <w:p>
       <w:pPr>
         <w:pStyle w:val="Heading1"/>
@@ -13197,8 +13837,8 @@
         <w:t xml:space="preserve">Referencias Suplementarias</w:t>
       </w:r>
     </w:p>
-    <w:bookmarkStart w:id="29" w:name="refs"/>
-    <w:bookmarkStart w:id="28" w:name="ref-schroeder2014"/>
+    <w:bookmarkStart w:id="30" w:name="refs"/>
+    <w:bookmarkStart w:id="29" w:name="ref-schroeder2014"/>
     <w:p>
       <w:pPr>
         <w:pStyle w:val="Bibliography"/>
@@ -13247,7 +13887,7 @@
       <w:r>
         <w:t xml:space="preserve"> </w:t>
       </w:r>
-      <w:hyperlink r:id="rId27">
+      <w:hyperlink r:id="rId28">
         <w:r>
           <w:rPr>
             <w:rStyle w:val="Hyperlink"/>
@@ -13256,9 +13896,9 @@
         </w:r>
       </w:hyperlink>
     </w:p>
-    <w:bookmarkEnd w:id="28"/>
     <w:bookmarkEnd w:id="29"/>
     <w:bookmarkEnd w:id="30"/>
+    <w:bookmarkEnd w:id="31"/>
     <w:sectPr>
       <w:footnotePr>
         <w:numRestart w:val="eachSect"/>

</xml_diff>

<commit_message>
fix(audit): full numerical and mathematical synchronization between code, figures, and manuscript, with reproducible script 14
</commit_message>
<xml_diff>
--- a/material_suplementario.docx
+++ b/material_suplementario.docx
@@ -2596,7 +2596,7 @@
         <w:pStyle w:val="FirstParagraph"/>
       </w:pPr>
       <w:r>
-        <w:t xml:space="preserve">Para inmunizar al sistema contra esta falla, formulamos el calibrador mediante optimización acotada (algoritmo L-BFGS-B implementado en</w:t>
+        <w:t xml:space="preserve">Para inmunizar al sistema contra esta falla, formulamos el calibrador mediante optimización acotada del error cuadrático medio de Brier (algoritmo L-BFGS-B implementado en</w:t>
       </w:r>
       <w:r>
         <w:t xml:space="preserve"> </w:t>
@@ -2646,37 +2646,174 @@
               </m:r>
             </m:lim>
           </m:limLow>
-          <m:r>
-            <m:rPr>
-              <m:scr m:val="script"/>
-              <m:sty m:val="p"/>
-            </m:rPr>
-            <m:t>L</m:t>
-          </m:r>
-          <m:r>
-            <m:rPr>
-              <m:sty m:val="p"/>
-            </m:rPr>
-            <m:t>(</m:t>
-          </m:r>
-          <m:r>
-            <m:t>w</m:t>
-          </m:r>
-          <m:r>
-            <m:rPr>
-              <m:sty m:val="p"/>
-            </m:rPr>
-            <m:t>,</m:t>
-          </m:r>
-          <m:r>
-            <m:t>b</m:t>
-          </m:r>
-          <m:r>
-            <m:rPr>
-              <m:sty m:val="p"/>
-            </m:rPr>
-            <m:t>)</m:t>
-          </m:r>
+          <m:f>
+            <m:fPr>
+              <m:type m:val="bar"/>
+            </m:fPr>
+            <m:num>
+              <m:r>
+                <m:t>1</m:t>
+              </m:r>
+            </m:num>
+            <m:den>
+              <m:r>
+                <m:t>M</m:t>
+              </m:r>
+            </m:den>
+          </m:f>
+          <m:nary>
+            <m:naryPr>
+              <m:chr m:val="∑"/>
+              <m:limLoc m:val="undOvr"/>
+              <m:subHide m:val="off"/>
+              <m:supHide m:val="off"/>
+            </m:naryPr>
+            <m:sub>
+              <m:r>
+                <m:t>i</m:t>
+              </m:r>
+              <m:r>
+                <m:rPr>
+                  <m:sty m:val="p"/>
+                </m:rPr>
+                <m:t>=</m:t>
+              </m:r>
+              <m:r>
+                <m:t>1</m:t>
+              </m:r>
+            </m:sub>
+            <m:sup>
+              <m:r>
+                <m:t>M</m:t>
+              </m:r>
+            </m:sup>
+            <m:e>
+              <m:sSup>
+                <m:e>
+                  <m:d>
+                    <m:dPr>
+                      <m:begChr m:val="("/>
+                      <m:sepChr m:val=""/>
+                      <m:endChr m:val=")"/>
+                      <m:grow/>
+                    </m:dPr>
+                    <m:e>
+                      <m:sSub>
+                        <m:e>
+                          <m:r>
+                            <m:t>y</m:t>
+                          </m:r>
+                        </m:e>
+                        <m:sub>
+                          <m:r>
+                            <m:t>i</m:t>
+                          </m:r>
+                        </m:sub>
+                      </m:sSub>
+                      <m:r>
+                        <m:rPr>
+                          <m:sty m:val="p"/>
+                        </m:rPr>
+                        <m:t>−</m:t>
+                      </m:r>
+                      <m:f>
+                        <m:fPr>
+                          <m:type m:val="bar"/>
+                        </m:fPr>
+                        <m:num>
+                          <m:r>
+                            <m:t>1</m:t>
+                          </m:r>
+                        </m:num>
+                        <m:den>
+                          <m:r>
+                            <m:t>1</m:t>
+                          </m:r>
+                          <m:r>
+                            <m:rPr>
+                              <m:sty m:val="p"/>
+                            </m:rPr>
+                            <m:t>+</m:t>
+                          </m:r>
+                          <m:r>
+                            <m:rPr>
+                              <m:sty m:val="p"/>
+                            </m:rPr>
+                            <m:t>exp</m:t>
+                          </m:r>
+                          <m:r>
+                            <m:rPr>
+                              <m:sty m:val="p"/>
+                            </m:rPr>
+                            <m:t>(</m:t>
+                          </m:r>
+                          <m:r>
+                            <m:rPr>
+                              <m:sty m:val="p"/>
+                            </m:rPr>
+                            <m:t>−</m:t>
+                          </m:r>
+                          <m:r>
+                            <m:rPr>
+                              <m:sty m:val="p"/>
+                            </m:rPr>
+                            <m:t>(</m:t>
+                          </m:r>
+                          <m:r>
+                            <m:t>w</m:t>
+                          </m:r>
+                          <m:r>
+                            <m:rPr>
+                              <m:sty m:val="p"/>
+                            </m:rPr>
+                            <m:t>⋅</m:t>
+                          </m:r>
+                          <m:sSub>
+                            <m:e>
+                              <m:r>
+                                <m:t>z</m:t>
+                              </m:r>
+                            </m:e>
+                            <m:sub>
+                              <m:r>
+                                <m:t>i</m:t>
+                              </m:r>
+                            </m:sub>
+                          </m:sSub>
+                          <m:r>
+                            <m:rPr>
+                              <m:sty m:val="p"/>
+                            </m:rPr>
+                            <m:t>+</m:t>
+                          </m:r>
+                          <m:r>
+                            <m:t>b</m:t>
+                          </m:r>
+                          <m:r>
+                            <m:rPr>
+                              <m:sty m:val="p"/>
+                            </m:rPr>
+                            <m:t>)</m:t>
+                          </m:r>
+                          <m:r>
+                            <m:rPr>
+                              <m:sty m:val="p"/>
+                            </m:rPr>
+                            <m:t>)</m:t>
+                          </m:r>
+                        </m:den>
+                      </m:f>
+                    </m:e>
+                  </m:d>
+                </m:e>
+                <m:sup>
+                  <m:r>
+                    <m:t>2</m:t>
+                  </m:r>
+                </m:sup>
+              </m:sSup>
+            </m:e>
+          </m:nary>
           <m:r>
             <m:t> </m:t>
           </m:r>
@@ -2742,7 +2879,7 @@
             <m:t>−</m:t>
           </m:r>
           <m:r>
-            <m:t>20</m:t>
+            <m:t>10</m:t>
           </m:r>
           <m:r>
             <m:rPr>
@@ -2769,7 +2906,7 @@
             <m:t>≤</m:t>
           </m:r>
           <m:r>
-            <m:t>20</m:t>
+            <m:t>10</m:t>
           </m:r>
           <m:r>
             <m:rPr>
@@ -7994,7 +8131,19 @@
               <w:pStyle w:val="ImageCaption"/>
             </w:pPr>
             <w:r>
-              <w:t xml:space="preserve">Tabla 2: Configuración óptima de hiperparámetros por macro-región y modo operativo.</w:t>
+              <w:t xml:space="preserve">Tabla 2: Configuración óptima de hiperparámetros por macro-región y modo operativo (obtenida con</w:t>
+            </w:r>
+            <w:r>
+              <w:t xml:space="preserve"> </w:t>
+            </w:r>
+            <w:r>
+              <w:rPr>
+                <w:rStyle w:val="VerbatimChar"/>
+              </w:rPr>
+              <w:t xml:space="preserve">scripts/06_entrenar_modelos.py</w:t>
+            </w:r>
+            <w:r>
+              <w:t xml:space="preserve">).</w:t>
             </w:r>
           </w:p>
           <w:tbl>
@@ -8253,7 +8402,7 @@
                       <m:t>,</m:t>
                     </m:r>
                     <m:r>
-                      <m:t>15</m:t>
+                      <m:t>10</m:t>
                     </m:r>
                     <m:r>
                       <m:rPr>
@@ -8286,7 +8435,7 @@
                       <m:t>,</m:t>
                     </m:r>
                     <m:r>
-                      <m:t>05</m:t>
+                      <m:t>03</m:t>
                     </m:r>
                   </m:oMath>
                   <w:r>
@@ -8340,7 +8489,7 @@
                       <m:t>,</m:t>
                     </m:r>
                     <m:r>
-                      <m:t>05</m:t>
+                      <m:t>03</m:t>
                     </m:r>
                   </m:oMath>
                   <w:r>
@@ -8409,26 +8558,44 @@
                       <m:t>[</m:t>
                     </m:r>
                     <m:r>
+                      <m:t>10</m:t>
+                    </m:r>
+                    <m:r>
+                      <m:rPr>
+                        <m:sty m:val="p"/>
+                      </m:rPr>
+                      <m:t>;</m:t>
+                    </m:r>
+                    <m:r>
+                      <m:t> </m:t>
+                    </m:r>
+                    <m:r>
+                      <m:t>31</m:t>
+                    </m:r>
+                    <m:r>
+                      <m:rPr>
+                        <m:sty m:val="p"/>
+                      </m:rPr>
+                      <m:t>]</m:t>
+                    </m:r>
+                  </m:oMath>
+                  <w:r>
+                    <w:t xml:space="preserve">​</w:t>
+                  </w:r>
+                </w:p>
+              </w:tc>
+              <w:tc>
+                <w:tcPr/>
+                <w:p>
+                  <w:pPr>
+                    <w:pStyle w:val="Compact"/>
+                    <w:jc w:val="center"/>
+                    <w:jc w:val="center"/>
+                  </w:pPr>
+                  <m:oMath>
+                    <m:r>
                       <m:t>15</m:t>
                     </m:r>
-                    <m:r>
-                      <m:rPr>
-                        <m:sty m:val="p"/>
-                      </m:rPr>
-                      <m:t>;</m:t>
-                    </m:r>
-                    <m:r>
-                      <m:t> </m:t>
-                    </m:r>
-                    <m:r>
-                      <m:t>63</m:t>
-                    </m:r>
-                    <m:r>
-                      <m:rPr>
-                        <m:sty m:val="p"/>
-                      </m:rPr>
-                      <m:t>]</m:t>
-                    </m:r>
                   </m:oMath>
                   <w:r>
                     <w:t xml:space="preserve">​</w:t>
@@ -8445,7 +8612,7 @@
                   </w:pPr>
                   <m:oMath>
                     <m:r>
-                      <m:t>31</m:t>
+                      <m:t>15</m:t>
                     </m:r>
                   </m:oMath>
                   <w:r>
@@ -8463,7 +8630,7 @@
                   </w:pPr>
                   <m:oMath>
                     <m:r>
-                      <m:t>31</m:t>
+                      <m:t>15</m:t>
                     </m:r>
                   </m:oMath>
                   <w:r>
@@ -8481,25 +8648,7 @@
                   </w:pPr>
                   <m:oMath>
                     <m:r>
-                      <m:t>31</m:t>
-                    </m:r>
-                  </m:oMath>
-                  <w:r>
-                    <w:t xml:space="preserve">​</w:t>
-                  </w:r>
-                </w:p>
-              </w:tc>
-              <w:tc>
-                <w:tcPr/>
-                <w:p>
-                  <w:pPr>
-                    <w:pStyle w:val="Compact"/>
-                    <w:jc w:val="center"/>
-                    <w:jc w:val="center"/>
-                  </w:pPr>
-                  <m:oMath>
-                    <m:r>
-                      <m:t>31</m:t>
+                      <m:t>15</m:t>
                     </m:r>
                   </m:oMath>
                   <w:r>
@@ -8541,7 +8690,7 @@
                       <m:t>[</m:t>
                     </m:r>
                     <m:r>
-                      <m:t>4</m:t>
+                      <m:t>3</m:t>
                     </m:r>
                     <m:r>
                       <m:rPr>
@@ -8553,7 +8702,7 @@
                       <m:t> </m:t>
                     </m:r>
                     <m:r>
-                      <m:t>8</m:t>
+                      <m:t>6</m:t>
                     </m:r>
                     <m:r>
                       <m:rPr>
@@ -8577,7 +8726,7 @@
                   </w:pPr>
                   <m:oMath>
                     <m:r>
-                      <m:t>6</m:t>
+                      <m:t>5</m:t>
                     </m:r>
                   </m:oMath>
                   <w:r>
@@ -8613,7 +8762,7 @@
                   </w:pPr>
                   <m:oMath>
                     <m:r>
-                      <m:t>6</m:t>
+                      <m:t>5</m:t>
                     </m:r>
                   </m:oMath>
                   <w:r>
@@ -8653,7 +8802,7 @@
                     <w:rPr>
                       <w:rStyle w:val="VerbatimChar"/>
                     </w:rPr>
-                    <w:t xml:space="preserve">min_data_in_leaf</w:t>
+                    <w:t xml:space="preserve">min_child_samples</w:t>
                   </w:r>
                 </w:p>
               </w:tc>
@@ -8673,8 +8822,149 @@
                       <m:t>[</m:t>
                     </m:r>
                     <m:r>
+                      <m:t>10</m:t>
+                    </m:r>
+                    <m:r>
+                      <m:rPr>
+                        <m:sty m:val="p"/>
+                      </m:rPr>
+                      <m:t>;</m:t>
+                    </m:r>
+                    <m:r>
+                      <m:t> </m:t>
+                    </m:r>
+                    <m:r>
+                      <m:t>50</m:t>
+                    </m:r>
+                    <m:r>
+                      <m:rPr>
+                        <m:sty m:val="p"/>
+                      </m:rPr>
+                      <m:t>]</m:t>
+                    </m:r>
+                  </m:oMath>
+                  <w:r>
+                    <w:t xml:space="preserve">​</w:t>
+                  </w:r>
+                </w:p>
+              </w:tc>
+              <w:tc>
+                <w:tcPr/>
+                <w:p>
+                  <w:pPr>
+                    <w:pStyle w:val="Compact"/>
+                    <w:jc w:val="center"/>
+                    <w:jc w:val="center"/>
+                  </w:pPr>
+                  <m:oMath>
+                    <m:r>
                       <m:t>20</m:t>
                     </m:r>
+                  </m:oMath>
+                  <w:r>
+                    <w:t xml:space="preserve">​</w:t>
+                  </w:r>
+                </w:p>
+              </w:tc>
+              <w:tc>
+                <w:tcPr/>
+                <w:p>
+                  <w:pPr>
+                    <w:pStyle w:val="Compact"/>
+                    <w:jc w:val="center"/>
+                    <w:jc w:val="center"/>
+                  </w:pPr>
+                  <m:oMath>
+                    <m:r>
+                      <m:t>20</m:t>
+                    </m:r>
+                  </m:oMath>
+                  <w:r>
+                    <w:t xml:space="preserve">​</w:t>
+                  </w:r>
+                </w:p>
+              </w:tc>
+              <w:tc>
+                <w:tcPr/>
+                <w:p>
+                  <w:pPr>
+                    <w:pStyle w:val="Compact"/>
+                    <w:jc w:val="center"/>
+                    <w:jc w:val="center"/>
+                  </w:pPr>
+                  <m:oMath>
+                    <m:r>
+                      <m:t>10</m:t>
+                    </m:r>
+                  </m:oMath>
+                  <w:r>
+                    <w:t xml:space="preserve">​</w:t>
+                  </w:r>
+                </w:p>
+              </w:tc>
+              <w:tc>
+                <w:tcPr/>
+                <w:p>
+                  <w:pPr>
+                    <w:pStyle w:val="Compact"/>
+                    <w:jc w:val="center"/>
+                    <w:jc w:val="center"/>
+                  </w:pPr>
+                  <m:oMath>
+                    <m:r>
+                      <m:t>10</m:t>
+                    </m:r>
+                  </m:oMath>
+                  <w:r>
+                    <w:t xml:space="preserve">​</w:t>
+                  </w:r>
+                </w:p>
+              </w:tc>
+            </w:tr>
+            <w:tr>
+              <w:tc>
+                <w:tcPr/>
+                <w:p>
+                  <w:pPr>
+                    <w:pStyle w:val="Compact"/>
+                    <w:jc w:val="left"/>
+                    <w:jc w:val="center"/>
+                  </w:pPr>
+                  <w:r>
+                    <w:rPr>
+                      <w:rStyle w:val="VerbatimChar"/>
+                    </w:rPr>
+                    <w:t xml:space="preserve">scale_pos_weight</w:t>
+                  </w:r>
+                </w:p>
+              </w:tc>
+              <w:tc>
+                <w:tcPr/>
+                <w:p>
+                  <w:pPr>
+                    <w:pStyle w:val="Compact"/>
+                    <w:jc w:val="center"/>
+                    <w:jc w:val="center"/>
+                  </w:pPr>
+                  <m:oMath>
+                    <m:r>
+                      <m:rPr>
+                        <m:sty m:val="p"/>
+                      </m:rPr>
+                      <m:t>[</m:t>
+                    </m:r>
+                    <m:r>
+                      <m:t>1</m:t>
+                    </m:r>
+                    <m:r>
+                      <m:rPr>
+                        <m:sty m:val="p"/>
+                      </m:rPr>
+                      <m:t>,</m:t>
+                    </m:r>
+                    <m:r>
+                      <m:t>0</m:t>
+                    </m:r>
                     <m:r>
                       <m:rPr>
                         <m:sty m:val="p"/>
@@ -8685,7 +8975,16 @@
                       <m:t> </m:t>
                     </m:r>
                     <m:r>
-                      <m:t>200</m:t>
+                      <m:t>5</m:t>
+                    </m:r>
+                    <m:r>
+                      <m:rPr>
+                        <m:sty m:val="p"/>
+                      </m:rPr>
+                      <m:t>,</m:t>
+                    </m:r>
+                    <m:r>
+                      <m:t>0</m:t>
                     </m:r>
                     <m:r>
                       <m:rPr>
@@ -8709,7 +9008,16 @@
                   </w:pPr>
                   <m:oMath>
                     <m:r>
-                      <m:t>50</m:t>
+                      <m:t>1</m:t>
+                    </m:r>
+                    <m:r>
+                      <m:rPr>
+                        <m:sty m:val="p"/>
+                      </m:rPr>
+                      <m:t>,</m:t>
+                    </m:r>
+                    <m:r>
+                      <m:t>00</m:t>
                     </m:r>
                   </m:oMath>
                   <w:r>
@@ -8727,7 +9035,16 @@
                   </w:pPr>
                   <m:oMath>
                     <m:r>
-                      <m:t>30</m:t>
+                      <m:t>1</m:t>
+                    </m:r>
+                    <m:r>
+                      <m:rPr>
+                        <m:sty m:val="p"/>
+                      </m:rPr>
+                      <m:t>,</m:t>
+                    </m:r>
+                    <m:r>
+                      <m:t>00</m:t>
                     </m:r>
                   </m:oMath>
                   <w:r>
@@ -8745,7 +9062,16 @@
                   </w:pPr>
                   <m:oMath>
                     <m:r>
-                      <m:t>50</m:t>
+                      <m:t>2</m:t>
+                    </m:r>
+                    <m:r>
+                      <m:rPr>
+                        <m:sty m:val="p"/>
+                      </m:rPr>
+                      <m:t>,</m:t>
+                    </m:r>
+                    <m:r>
+                      <m:t>00</m:t>
                     </m:r>
                   </m:oMath>
                   <w:r>
@@ -8763,7 +9089,16 @@
                   </w:pPr>
                   <m:oMath>
                     <m:r>
-                      <m:t>30</m:t>
+                      <m:t>2</m:t>
+                    </m:r>
+                    <m:r>
+                      <m:rPr>
+                        <m:sty m:val="p"/>
+                      </m:rPr>
+                      <m:t>,</m:t>
+                    </m:r>
+                    <m:r>
+                      <m:t>00</m:t>
                     </m:r>
                   </m:oMath>
                   <w:r>
@@ -8895,7 +9230,7 @@
                       <m:t>,</m:t>
                     </m:r>
                     <m:r>
-                      <m:t>85</m:t>
+                      <m:t>80</m:t>
                     </m:r>
                   </m:oMath>
                   <w:r>
@@ -8949,7 +9284,7 @@
                       <m:t>,</m:t>
                     </m:r>
                     <m:r>
-                      <m:t>85</m:t>
+                      <m:t>80</m:t>
                     </m:r>
                   </m:oMath>
                   <w:r>
@@ -9081,7 +9416,7 @@
                       <m:t>,</m:t>
                     </m:r>
                     <m:r>
-                      <m:t>90</m:t>
+                      <m:t>80</m:t>
                     </m:r>
                   </m:oMath>
                   <w:r>
@@ -9135,7 +9470,7 @@
                       <m:t>,</m:t>
                     </m:r>
                     <m:r>
-                      <m:t>90</m:t>
+                      <m:t>80</m:t>
                     </m:r>
                   </m:oMath>
                   <w:r>
@@ -9204,7 +9539,7 @@
                       <m:t> </m:t>
                     </m:r>
                     <m:r>
-                      <m:t>10</m:t>
+                      <m:t>5</m:t>
                     </m:r>
                     <m:r>
                       <m:rPr>
@@ -9237,7 +9572,7 @@
                   </w:pPr>
                   <m:oMath>
                     <m:r>
-                      <m:t>1</m:t>
+                      <m:t>0</m:t>
                     </m:r>
                     <m:r>
                       <m:rPr>
@@ -9246,7 +9581,7 @@
                       <m:t>,</m:t>
                     </m:r>
                     <m:r>
-                      <m:t>50</m:t>
+                      <m:t>20</m:t>
                     </m:r>
                   </m:oMath>
                   <w:r>
@@ -9273,7 +9608,7 @@
                       <m:t>,</m:t>
                     </m:r>
                     <m:r>
-                      <m:t>50</m:t>
+                      <m:t>20</m:t>
                     </m:r>
                   </m:oMath>
                   <w:r>
@@ -9291,7 +9626,7 @@
                   </w:pPr>
                   <m:oMath>
                     <m:r>
-                      <m:t>1</m:t>
+                      <m:t>0</m:t>
                     </m:r>
                     <m:r>
                       <m:rPr>
@@ -9327,7 +9662,7 @@
                       <m:t>,</m:t>
                     </m:r>
                     <m:r>
-                      <m:t>50</m:t>
+                      <m:t>20</m:t>
                     </m:r>
                   </m:oMath>
                   <w:r>
@@ -9396,7 +9731,7 @@
                       <m:t> </m:t>
                     </m:r>
                     <m:r>
-                      <m:t>10</m:t>
+                      <m:t>5</m:t>
                     </m:r>
                     <m:r>
                       <m:rPr>
@@ -9429,7 +9764,7 @@
                   </w:pPr>
                   <m:oMath>
                     <m:r>
-                      <m:t>3</m:t>
+                      <m:t>1</m:t>
                     </m:r>
                     <m:r>
                       <m:rPr>
@@ -9456,7 +9791,7 @@
                   </w:pPr>
                   <m:oMath>
                     <m:r>
-                      <m:t>2</m:t>
+                      <m:t>1</m:t>
                     </m:r>
                     <m:r>
                       <m:rPr>
@@ -9483,7 +9818,7 @@
                   </w:pPr>
                   <m:oMath>
                     <m:r>
-                      <m:t>2</m:t>
+                      <m:t>1</m:t>
                     </m:r>
                     <m:r>
                       <m:rPr>
@@ -9492,7 +9827,7 @@
                       <m:t>,</m:t>
                     </m:r>
                     <m:r>
-                      <m:t>50</m:t>
+                      <m:t>00</m:t>
                     </m:r>
                   </m:oMath>
                   <w:r>
@@ -9519,7 +9854,7 @@
                       <m:t>,</m:t>
                     </m:r>
                     <m:r>
-                      <m:t>50</m:t>
+                      <m:t>00</m:t>
                     </m:r>
                   </m:oMath>
                   <w:r>
@@ -9541,34 +9876,45 @@
                     <w:rPr>
                       <w:rStyle w:val="VerbatimChar"/>
                     </w:rPr>
-                    <w:t xml:space="preserve">early_stopping_rounds</w:t>
-                  </w:r>
-                </w:p>
-              </w:tc>
-              <w:tc>
-                <w:tcPr/>
-                <w:p>
-                  <w:pPr>
-                    <w:pStyle w:val="Compact"/>
-                    <w:jc w:val="center"/>
-                    <w:jc w:val="center"/>
-                  </w:pPr>
-                  <w:r>
-                    <w:t xml:space="preserve">—</w:t>
-                  </w:r>
-                </w:p>
-              </w:tc>
-              <w:tc>
-                <w:tcPr/>
-                <w:p>
-                  <w:pPr>
-                    <w:pStyle w:val="Compact"/>
-                    <w:jc w:val="center"/>
-                    <w:jc w:val="center"/>
-                  </w:pPr>
-                  <m:oMath>
-                    <m:r>
-                      <m:t>50</m:t>
+                    <w:t xml:space="preserve">num_boost_round</w:t>
+                  </w:r>
+                </w:p>
+              </w:tc>
+              <w:tc>
+                <w:tcPr/>
+                <w:p>
+                  <w:pPr>
+                    <w:pStyle w:val="Compact"/>
+                    <w:jc w:val="center"/>
+                    <w:jc w:val="center"/>
+                  </w:pPr>
+                  <m:oMath>
+                    <m:r>
+                      <m:rPr>
+                        <m:sty m:val="p"/>
+                      </m:rPr>
+                      <m:t>[</m:t>
+                    </m:r>
+                    <m:r>
+                      <m:t>10</m:t>
+                    </m:r>
+                    <m:r>
+                      <m:rPr>
+                        <m:sty m:val="p"/>
+                      </m:rPr>
+                      <m:t>;</m:t>
+                    </m:r>
+                    <m:r>
+                      <m:t> </m:t>
+                    </m:r>
+                    <m:r>
+                      <m:t>100</m:t>
+                    </m:r>
+                    <m:r>
+                      <m:rPr>
+                        <m:sty m:val="p"/>
+                      </m:rPr>
+                      <m:t>]</m:t>
                     </m:r>
                   </m:oMath>
                   <w:r>
@@ -9586,7 +9932,7 @@
                   </w:pPr>
                   <m:oMath>
                     <m:r>
-                      <m:t>50</m:t>
+                      <m:t>20</m:t>
                     </m:r>
                   </m:oMath>
                   <w:r>
@@ -9604,7 +9950,7 @@
                   </w:pPr>
                   <m:oMath>
                     <m:r>
-                      <m:t>50</m:t>
+                      <m:t>20</m:t>
                     </m:r>
                   </m:oMath>
                   <w:r>
@@ -9622,7 +9968,7 @@
                   </w:pPr>
                   <m:oMath>
                     <m:r>
-                      <m:t>50</m:t>
+                      <m:t>40</m:t>
                     </m:r>
                   </m:oMath>
                   <w:r>
@@ -9630,137 +9976,17 @@
                   </w:r>
                 </w:p>
               </w:tc>
-            </w:tr>
-            <w:tr>
-              <w:tc>
-                <w:tcPr/>
-                <w:p>
-                  <w:pPr>
-                    <w:pStyle w:val="Compact"/>
-                    <w:jc w:val="left"/>
-                    <w:jc w:val="center"/>
-                  </w:pPr>
-                  <w:r>
-                    <w:rPr>
-                      <w:rStyle w:val="VerbatimChar"/>
-                    </w:rPr>
-                    <w:t xml:space="preserve">n_estimators</w:t>
-                  </w:r>
-                  <w:r>
-                    <w:t xml:space="preserve"> </w:t>
-                  </w:r>
-                  <w:r>
-                    <w:t xml:space="preserve">(óptimo)</w:t>
-                  </w:r>
-                </w:p>
-              </w:tc>
-              <w:tc>
-                <w:tcPr/>
-                <w:p>
-                  <w:pPr>
-                    <w:pStyle w:val="Compact"/>
-                    <w:jc w:val="center"/>
-                    <w:jc w:val="center"/>
-                  </w:pPr>
-                  <m:oMath>
-                    <m:r>
-                      <m:rPr>
-                        <m:sty m:val="p"/>
-                      </m:rPr>
-                      <m:t>[</m:t>
-                    </m:r>
-                    <m:r>
-                      <m:t>100</m:t>
-                    </m:r>
-                    <m:r>
-                      <m:rPr>
-                        <m:sty m:val="p"/>
-                      </m:rPr>
-                      <m:t>;</m:t>
-                    </m:r>
-                    <m:r>
-                      <m:t> </m:t>
-                    </m:r>
-                    <m:r>
-                      <m:t>2000</m:t>
-                    </m:r>
-                    <m:r>
-                      <m:rPr>
-                        <m:sty m:val="p"/>
-                      </m:rPr>
-                      <m:t>]</m:t>
-                    </m:r>
-                  </m:oMath>
-                  <w:r>
-                    <w:t xml:space="preserve">​</w:t>
-                  </w:r>
-                </w:p>
-              </w:tc>
-              <w:tc>
-                <w:tcPr/>
-                <w:p>
-                  <w:pPr>
-                    <w:pStyle w:val="Compact"/>
-                    <w:jc w:val="center"/>
-                    <w:jc w:val="center"/>
-                  </w:pPr>
-                  <m:oMath>
-                    <m:r>
-                      <m:t>342</m:t>
-                    </m:r>
-                  </m:oMath>
-                  <w:r>
-                    <w:t xml:space="preserve">​</w:t>
-                  </w:r>
-                </w:p>
-              </w:tc>
-              <w:tc>
-                <w:tcPr/>
-                <w:p>
-                  <w:pPr>
-                    <w:pStyle w:val="Compact"/>
-                    <w:jc w:val="center"/>
-                    <w:jc w:val="center"/>
-                  </w:pPr>
-                  <m:oMath>
-                    <m:r>
-                      <m:t>486</m:t>
-                    </m:r>
-                  </m:oMath>
-                  <w:r>
-                    <w:t xml:space="preserve">​</w:t>
-                  </w:r>
-                </w:p>
-              </w:tc>
-              <w:tc>
-                <w:tcPr/>
-                <w:p>
-                  <w:pPr>
-                    <w:pStyle w:val="Compact"/>
-                    <w:jc w:val="center"/>
-                    <w:jc w:val="center"/>
-                  </w:pPr>
-                  <m:oMath>
-                    <m:r>
-                      <m:t>289</m:t>
-                    </m:r>
-                  </m:oMath>
-                  <w:r>
-                    <w:t xml:space="preserve">​</w:t>
-                  </w:r>
-                </w:p>
-              </w:tc>
-              <w:tc>
-                <w:tcPr/>
-                <w:p>
-                  <w:pPr>
-                    <w:pStyle w:val="Compact"/>
-                    <w:jc w:val="center"/>
-                    <w:jc w:val="center"/>
-                  </w:pPr>
-                  <m:oMath>
-                    <m:r>
-                      <m:t>412</m:t>
+              <w:tc>
+                <w:tcPr/>
+                <w:p>
+                  <w:pPr>
+                    <w:pStyle w:val="Compact"/>
+                    <w:jc w:val="center"/>
+                    <w:jc w:val="center"/>
+                  </w:pPr>
+                  <m:oMath>
+                    <m:r>
+                      <m:t>40</m:t>
                     </m:r>
                   </m:oMath>
                   <w:r>
@@ -12688,7 +12914,7 @@
         <w:t xml:space="preserve"> </w:t>
       </w:r>
       <w:r>
-        <w:t xml:space="preserve">Apple Silicon M5 (10 núcleos CPU, 16 GB memoria unificada, macOS).</w:t>
+        <w:t xml:space="preserve">Apple Silicon ARM64 (Apple M5, 10 núcleos CPU, 16 GB memoria unificada, macOS).</w:t>
       </w:r>
       <w:r>
         <w:t xml:space="preserve"> </w:t>

</xml_diff>

<commit_message>
docs(suplementario): sincronizar tablas S3 departamental y de sensibilidad de buffer en material suplementario
</commit_message>
<xml_diff>
--- a/material_suplementario.docx
+++ b/material_suplementario.docx
@@ -4176,7 +4176,7 @@
                 <m:t>,</m:t>
               </m:r>
               <m:r>
-                <m:t>5881</m:t>
+                <m:t>8241</m:t>
               </m:r>
             </m:oMath>
             <w:r>
@@ -4202,7 +4202,7 @@
                 <m:t>,</m:t>
               </m:r>
               <m:r>
-                <m:t>7594</m:t>
+                <m:t>7025</m:t>
               </m:r>
             </m:oMath>
             <w:r>
@@ -4228,7 +4228,7 @@
                 <m:t>,</m:t>
               </m:r>
               <m:r>
-                <m:t>9482</m:t>
+                <m:t>8540</m:t>
               </m:r>
             </m:oMath>
             <w:r>
@@ -4336,7 +4336,7 @@
                 <m:t>,</m:t>
               </m:r>
               <m:r>
-                <m:t>5952</m:t>
+                <m:t>8305</m:t>
               </m:r>
             </m:oMath>
           </w:p>
@@ -4359,7 +4359,7 @@
                 <m:t>,</m:t>
               </m:r>
               <m:r>
-                <m:t>7711</m:t>
+                <m:t>7106</m:t>
               </m:r>
             </m:oMath>
           </w:p>
@@ -4382,7 +4382,7 @@
                 <m:t>,</m:t>
               </m:r>
               <m:r>
-                <m:t>9410</m:t>
+                <m:t>8494</m:t>
               </m:r>
             </m:oMath>
           </w:p>
@@ -4452,7 +4452,7 @@
                 <m:t>,</m:t>
               </m:r>
               <m:r>
-                <m:t>6014</m:t>
+                <m:t>8362</m:t>
               </m:r>
             </m:oMath>
             <w:r>
@@ -4478,7 +4478,7 @@
                 <m:t>,</m:t>
               </m:r>
               <m:r>
-                <m:t>7785</m:t>
+                <m:t>7180</m:t>
               </m:r>
             </m:oMath>
             <w:r>
@@ -4504,7 +4504,7 @@
                 <m:t>,</m:t>
               </m:r>
               <m:r>
-                <m:t>9365</m:t>
+                <m:t>8431</m:t>
               </m:r>
             </m:oMath>
             <w:r>
@@ -4551,7 +4551,7 @@
           <m:t>,</m:t>
         </m:r>
         <m:r>
-          <m:t>019</m:t>
+          <m:t>013</m:t>
         </m:r>
       </m:oMath>
       <w:r>
@@ -10066,7 +10066,19 @@
               <w:pStyle w:val="ImageCaption"/>
             </w:pPr>
             <w:r>
-              <w:t xml:space="preserve">Tabla 3: Evaluación estratificada por unidad político-administrativa ADM1 en el conjunto de prueba ciego.</w:t>
+              <w:t xml:space="preserve">Tabla 3: Evaluación estratificada por unidad político-administrativa ADM1 en el conjunto de prueba ciego (generada de forma reproducible por</w:t>
+            </w:r>
+            <w:r>
+              <w:t xml:space="preserve"> </w:t>
+            </w:r>
+            <w:r>
+              <w:rPr>
+                <w:rStyle w:val="VerbatimChar"/>
+              </w:rPr>
+              <w:t xml:space="preserve">scripts/14_auditoria_suplementaria.py</w:t>
+            </w:r>
+            <w:r>
+              <w:t xml:space="preserve">).</w:t>
             </w:r>
           </w:p>
           <w:tbl>
@@ -10077,13 +10089,15 @@
               <w:tblLook w:firstRow="1" w:lastRow="0" w:firstColumn="0" w:lastColumn="0" w:noHBand="0" w:noVBand="0" w:val="0020"/>
             </w:tblPr>
             <w:tblGrid>
-              <w:gridCol w:w="1200"/>
-              <w:gridCol w:w="960"/>
-              <w:gridCol w:w="960"/>
-              <w:gridCol w:w="1200"/>
-              <w:gridCol w:w="1200"/>
-              <w:gridCol w:w="1200"/>
-              <w:gridCol w:w="1200"/>
+              <w:gridCol w:w="920"/>
+              <w:gridCol w:w="736"/>
+              <w:gridCol w:w="736"/>
+              <w:gridCol w:w="920"/>
+              <w:gridCol w:w="920"/>
+              <w:gridCol w:w="920"/>
+              <w:gridCol w:w="920"/>
+              <w:gridCol w:w="920"/>
+              <w:gridCol w:w="920"/>
             </w:tblGrid>
             <w:tr>
               <w:trPr>
@@ -10150,6 +10164,32 @@
                     <w:jc w:val="center"/>
                   </w:pPr>
                   <w:r>
+                    <w:t xml:space="preserve">Muestras Test</w:t>
+                  </w:r>
+                </w:p>
+              </w:tc>
+              <w:tc>
+                <w:tcPr/>
+                <w:p>
+                  <w:pPr>
+                    <w:pStyle w:val="Compact"/>
+                    <w:jc w:val="center"/>
+                    <w:jc w:val="center"/>
+                  </w:pPr>
+                  <w:r>
+                    <w:t xml:space="preserve">Fuegos Test</w:t>
+                  </w:r>
+                </w:p>
+              </w:tc>
+              <w:tc>
+                <w:tcPr/>
+                <w:p>
+                  <w:pPr>
+                    <w:pStyle w:val="Compact"/>
+                    <w:jc w:val="center"/>
+                    <w:jc w:val="center"/>
+                  </w:pPr>
+                  <w:r>
                     <w:t xml:space="preserve">ROC-AUC (Ignición)</w:t>
                   </w:r>
                 </w:p>
@@ -10177,6 +10217,205 @@
                   </w:pPr>
                   <w:r>
                     <w:t xml:space="preserve">Precisión Táctica (%)</w:t>
+                  </w:r>
+                </w:p>
+              </w:tc>
+            </w:tr>
+            <w:tr>
+              <w:tc>
+                <w:tcPr/>
+                <w:p>
+                  <w:pPr>
+                    <w:pStyle w:val="Compact"/>
+                    <w:jc w:val="center"/>
+                    <w:jc w:val="center"/>
+                  </w:pPr>
+                  <w:r>
+                    <w:rPr>
+                      <w:b/>
+                      <w:bCs/>
+                    </w:rPr>
+                    <w:t xml:space="preserve">PY-17</w:t>
+                  </w:r>
+                </w:p>
+              </w:tc>
+              <w:tc>
+                <w:tcPr/>
+                <w:p>
+                  <w:pPr>
+                    <w:pStyle w:val="Compact"/>
+                    <w:jc w:val="left"/>
+                    <w:jc w:val="center"/>
+                  </w:pPr>
+                  <w:r>
+                    <w:t xml:space="preserve">Alto Paraguay</w:t>
+                  </w:r>
+                </w:p>
+              </w:tc>
+              <w:tc>
+                <w:tcPr/>
+                <w:p>
+                  <w:pPr>
+                    <w:pStyle w:val="Compact"/>
+                    <w:jc w:val="left"/>
+                    <w:jc w:val="center"/>
+                  </w:pPr>
+                  <w:r>
+                    <w:t xml:space="preserve">Chaco</w:t>
+                  </w:r>
+                </w:p>
+              </w:tc>
+              <w:tc>
+                <w:tcPr/>
+                <w:p>
+                  <w:pPr>
+                    <w:pStyle w:val="Compact"/>
+                    <w:jc w:val="center"/>
+                    <w:jc w:val="center"/>
+                  </w:pPr>
+                  <m:oMath>
+                    <m:r>
+                      <m:t>78.613</m:t>
+                    </m:r>
+                  </m:oMath>
+                  <w:r>
+                    <w:t xml:space="preserve">​</w:t>
+                  </w:r>
+                </w:p>
+              </w:tc>
+              <w:tc>
+                <w:tcPr/>
+                <w:p>
+                  <w:pPr>
+                    <w:pStyle w:val="Compact"/>
+                    <w:jc w:val="center"/>
+                    <w:jc w:val="center"/>
+                  </w:pPr>
+                  <m:oMath>
+                    <m:r>
+                      <m:t>641</m:t>
+                    </m:r>
+                  </m:oMath>
+                  <w:r>
+                    <w:t xml:space="preserve">​</w:t>
+                  </w:r>
+                </w:p>
+              </w:tc>
+              <w:tc>
+                <w:tcPr/>
+                <w:p>
+                  <w:pPr>
+                    <w:pStyle w:val="Compact"/>
+                    <w:jc w:val="center"/>
+                    <w:jc w:val="center"/>
+                  </w:pPr>
+                  <m:oMath>
+                    <m:r>
+                      <m:t>108</m:t>
+                    </m:r>
+                  </m:oMath>
+                  <w:r>
+                    <w:t xml:space="preserve">​</w:t>
+                  </w:r>
+                </w:p>
+              </w:tc>
+              <w:tc>
+                <w:tcPr/>
+                <w:p>
+                  <w:pPr>
+                    <w:pStyle w:val="Compact"/>
+                    <w:jc w:val="center"/>
+                    <w:jc w:val="center"/>
+                  </w:pPr>
+                  <m:oMath>
+                    <m:r>
+                      <m:rPr>
+                        <m:sty m:val="b"/>
+                      </m:rPr>
+                      <m:t>0</m:t>
+                    </m:r>
+                    <m:r>
+                      <m:rPr>
+                        <m:sty m:val="b"/>
+                      </m:rPr>
+                      <m:t>,</m:t>
+                    </m:r>
+                    <m:r>
+                      <m:rPr>
+                        <m:sty m:val="b"/>
+                      </m:rPr>
+                      <m:t>939</m:t>
+                    </m:r>
+                  </m:oMath>
+                  <w:r>
+                    <w:t xml:space="preserve">​</w:t>
+                  </w:r>
+                </w:p>
+              </w:tc>
+              <w:tc>
+                <w:tcPr/>
+                <w:p>
+                  <w:pPr>
+                    <w:pStyle w:val="Compact"/>
+                    <w:jc w:val="center"/>
+                    <w:jc w:val="center"/>
+                  </w:pPr>
+                  <m:oMath>
+                    <m:r>
+                      <m:rPr>
+                        <m:sty m:val="b"/>
+                      </m:rPr>
+                      <m:t>0</m:t>
+                    </m:r>
+                    <m:r>
+                      <m:rPr>
+                        <m:sty m:val="b"/>
+                      </m:rPr>
+                      <m:t>,</m:t>
+                    </m:r>
+                    <m:r>
+                      <m:rPr>
+                        <m:sty m:val="b"/>
+                      </m:rPr>
+                      <m:t>956</m:t>
+                    </m:r>
+                  </m:oMath>
+                  <w:r>
+                    <w:t xml:space="preserve">​</w:t>
+                  </w:r>
+                </w:p>
+              </w:tc>
+              <w:tc>
+                <w:tcPr/>
+                <w:p>
+                  <w:pPr>
+                    <w:pStyle w:val="Compact"/>
+                    <w:jc w:val="center"/>
+                    <w:jc w:val="center"/>
+                  </w:pPr>
+                  <m:oMath>
+                    <m:r>
+                      <m:t>95</m:t>
+                    </m:r>
+                    <m:r>
+                      <m:rPr>
+                        <m:sty m:val="p"/>
+                      </m:rPr>
+                      <m:t>,</m:t>
+                    </m:r>
+                    <m:r>
+                      <m:t>6</m:t>
+                    </m:r>
+                    <m:r>
+                      <m:rPr>
+                        <m:nor/>
+                        <m:sty m:val="p"/>
+                      </m:rPr>
+                      <m:t> %</m:t>
+                    </m:r>
+                  </m:oMath>
+                  <w:r>
+                    <w:t xml:space="preserve">​</w:t>
                   </w:r>
                 </w:p>
               </w:tc>
@@ -10235,7 +10474,7 @@
                   </w:pPr>
                   <m:oMath>
                     <m:r>
-                      <m:t>91.802</m:t>
+                      <m:t>88.623</m:t>
                     </m:r>
                   </m:oMath>
                   <w:r>
@@ -10253,16 +10492,58 @@
                   </w:pPr>
                   <m:oMath>
                     <m:r>
+                      <m:t>757</m:t>
+                    </m:r>
+                  </m:oMath>
+                  <w:r>
+                    <w:t xml:space="preserve">​</w:t>
+                  </w:r>
+                </w:p>
+              </w:tc>
+              <w:tc>
+                <w:tcPr/>
+                <w:p>
+                  <w:pPr>
+                    <w:pStyle w:val="Compact"/>
+                    <w:jc w:val="center"/>
+                    <w:jc w:val="center"/>
+                  </w:pPr>
+                  <m:oMath>
+                    <m:r>
+                      <m:t>34</m:t>
+                    </m:r>
+                  </m:oMath>
+                  <w:r>
+                    <w:t xml:space="preserve">​</w:t>
+                  </w:r>
+                </w:p>
+              </w:tc>
+              <w:tc>
+                <w:tcPr/>
+                <w:p>
+                  <w:pPr>
+                    <w:pStyle w:val="Compact"/>
+                    <w:jc w:val="center"/>
+                    <w:jc w:val="center"/>
+                  </w:pPr>
+                  <m:oMath>
+                    <m:r>
+                      <m:rPr>
+                        <m:sty m:val="b"/>
+                      </m:rPr>
                       <m:t>0</m:t>
                     </m:r>
                     <m:r>
                       <m:rPr>
-                        <m:sty m:val="p"/>
+                        <m:sty m:val="b"/>
                       </m:rPr>
                       <m:t>,</m:t>
                     </m:r>
                     <m:r>
-                      <m:t>612</m:t>
+                      <m:rPr>
+                        <m:sty m:val="b"/>
+                      </m:rPr>
+                      <m:t>662</m:t>
                     </m:r>
                   </m:oMath>
                   <w:r>
@@ -10280,16 +10561,22 @@
                   </w:pPr>
                   <m:oMath>
                     <m:r>
+                      <m:rPr>
+                        <m:sty m:val="b"/>
+                      </m:rPr>
                       <m:t>0</m:t>
                     </m:r>
                     <m:r>
                       <m:rPr>
-                        <m:sty m:val="p"/>
+                        <m:sty m:val="b"/>
                       </m:rPr>
                       <m:t>,</m:t>
                     </m:r>
                     <m:r>
-                      <m:t>951</m:t>
+                      <m:rPr>
+                        <m:sty m:val="b"/>
+                      </m:rPr>
+                      <m:t>679</m:t>
                     </m:r>
                   </m:oMath>
                   <w:r>
@@ -10307,7 +10594,7 @@
                   </w:pPr>
                   <m:oMath>
                     <m:r>
-                      <m:t>98</m:t>
+                      <m:t>100</m:t>
                     </m:r>
                     <m:r>
                       <m:rPr>
@@ -10316,158 +10603,7 @@
                       <m:t>,</m:t>
                     </m:r>
                     <m:r>
-                      <m:t>1</m:t>
-                    </m:r>
-                    <m:r>
-                      <m:rPr>
-                        <m:nor/>
-                        <m:sty m:val="p"/>
-                      </m:rPr>
-                      <m:t> %</m:t>
-                    </m:r>
-                  </m:oMath>
-                  <w:r>
-                    <w:t xml:space="preserve">​</w:t>
-                  </w:r>
-                </w:p>
-              </w:tc>
-            </w:tr>
-            <w:tr>
-              <w:tc>
-                <w:tcPr/>
-                <w:p>
-                  <w:pPr>
-                    <w:pStyle w:val="Compact"/>
-                    <w:jc w:val="center"/>
-                    <w:jc w:val="center"/>
-                  </w:pPr>
-                  <w:r>
-                    <w:rPr>
-                      <w:b/>
-                      <w:bCs/>
-                    </w:rPr>
-                    <w:t xml:space="preserve">PY-17</w:t>
-                  </w:r>
-                </w:p>
-              </w:tc>
-              <w:tc>
-                <w:tcPr/>
-                <w:p>
-                  <w:pPr>
-                    <w:pStyle w:val="Compact"/>
-                    <w:jc w:val="left"/>
-                    <w:jc w:val="center"/>
-                  </w:pPr>
-                  <w:r>
-                    <w:t xml:space="preserve">Alto Paraguay</w:t>
-                  </w:r>
-                </w:p>
-              </w:tc>
-              <w:tc>
-                <w:tcPr/>
-                <w:p>
-                  <w:pPr>
-                    <w:pStyle w:val="Compact"/>
-                    <w:jc w:val="left"/>
-                    <w:jc w:val="center"/>
-                  </w:pPr>
-                  <w:r>
-                    <w:t xml:space="preserve">Chaco</w:t>
-                  </w:r>
-                </w:p>
-              </w:tc>
-              <w:tc>
-                <w:tcPr/>
-                <w:p>
-                  <w:pPr>
-                    <w:pStyle w:val="Compact"/>
-                    <w:jc w:val="center"/>
-                    <w:jc w:val="center"/>
-                  </w:pPr>
-                  <m:oMath>
-                    <m:r>
-                      <m:t>82.411</m:t>
-                    </m:r>
-                  </m:oMath>
-                  <w:r>
-                    <w:t xml:space="preserve">​</w:t>
-                  </w:r>
-                </w:p>
-              </w:tc>
-              <w:tc>
-                <w:tcPr/>
-                <w:p>
-                  <w:pPr>
-                    <w:pStyle w:val="Compact"/>
-                    <w:jc w:val="center"/>
-                    <w:jc w:val="center"/>
-                  </w:pPr>
-                  <m:oMath>
-                    <m:r>
                       <m:t>0</m:t>
-                    </m:r>
-                    <m:r>
-                      <m:rPr>
-                        <m:sty m:val="p"/>
-                      </m:rPr>
-                      <m:t>,</m:t>
-                    </m:r>
-                    <m:r>
-                      <m:t>589</m:t>
-                    </m:r>
-                  </m:oMath>
-                  <w:r>
-                    <w:t xml:space="preserve">​</w:t>
-                  </w:r>
-                </w:p>
-              </w:tc>
-              <w:tc>
-                <w:tcPr/>
-                <w:p>
-                  <w:pPr>
-                    <w:pStyle w:val="Compact"/>
-                    <w:jc w:val="center"/>
-                    <w:jc w:val="center"/>
-                  </w:pPr>
-                  <m:oMath>
-                    <m:r>
-                      <m:t>0</m:t>
-                    </m:r>
-                    <m:r>
-                      <m:rPr>
-                        <m:sty m:val="p"/>
-                      </m:rPr>
-                      <m:t>,</m:t>
-                    </m:r>
-                    <m:r>
-                      <m:t>938</m:t>
-                    </m:r>
-                  </m:oMath>
-                  <w:r>
-                    <w:t xml:space="preserve">​</w:t>
-                  </w:r>
-                </w:p>
-              </w:tc>
-              <w:tc>
-                <w:tcPr/>
-                <w:p>
-                  <w:pPr>
-                    <w:pStyle w:val="Compact"/>
-                    <w:jc w:val="center"/>
-                    <w:jc w:val="center"/>
-                  </w:pPr>
-                  <m:oMath>
-                    <m:r>
-                      <m:t>97</m:t>
-                    </m:r>
-                    <m:r>
-                      <m:rPr>
-                        <m:sty m:val="p"/>
-                      </m:rPr>
-                      <m:t>,</m:t>
-                    </m:r>
-                    <m:r>
-                      <m:t>4</m:t>
                     </m:r>
                     <m:r>
                       <m:rPr>
@@ -10537,7 +10673,7 @@
                   </w:pPr>
                   <m:oMath>
                     <m:r>
-                      <m:t>73.114</m:t>
+                      <m:t>73.644</m:t>
                     </m:r>
                   </m:oMath>
                   <w:r>
@@ -10555,16 +10691,58 @@
                   </w:pPr>
                   <m:oMath>
                     <m:r>
+                      <m:t>428</m:t>
+                    </m:r>
+                  </m:oMath>
+                  <w:r>
+                    <w:t xml:space="preserve">​</w:t>
+                  </w:r>
+                </w:p>
+              </w:tc>
+              <w:tc>
+                <w:tcPr/>
+                <w:p>
+                  <w:pPr>
+                    <w:pStyle w:val="Compact"/>
+                    <w:jc w:val="center"/>
+                    <w:jc w:val="center"/>
+                  </w:pPr>
+                  <m:oMath>
+                    <m:r>
+                      <m:t>24</m:t>
+                    </m:r>
+                  </m:oMath>
+                  <w:r>
+                    <w:t xml:space="preserve">​</w:t>
+                  </w:r>
+                </w:p>
+              </w:tc>
+              <w:tc>
+                <w:tcPr/>
+                <w:p>
+                  <w:pPr>
+                    <w:pStyle w:val="Compact"/>
+                    <w:jc w:val="center"/>
+                    <w:jc w:val="center"/>
+                  </w:pPr>
+                  <m:oMath>
+                    <m:r>
+                      <m:rPr>
+                        <m:sty m:val="b"/>
+                      </m:rPr>
                       <m:t>0</m:t>
                     </m:r>
                     <m:r>
                       <m:rPr>
-                        <m:sty m:val="p"/>
+                        <m:sty m:val="b"/>
                       </m:rPr>
                       <m:t>,</m:t>
                     </m:r>
                     <m:r>
-                      <m:t>594</m:t>
+                      <m:rPr>
+                        <m:sty m:val="b"/>
+                      </m:rPr>
+                      <m:t>581</m:t>
                     </m:r>
                   </m:oMath>
                   <w:r>
@@ -10582,16 +10760,22 @@
                   </w:pPr>
                   <m:oMath>
                     <m:r>
+                      <m:rPr>
+                        <m:sty m:val="b"/>
+                      </m:rPr>
                       <m:t>0</m:t>
                     </m:r>
                     <m:r>
                       <m:rPr>
-                        <m:sty m:val="p"/>
+                        <m:sty m:val="b"/>
                       </m:rPr>
                       <m:t>,</m:t>
                     </m:r>
                     <m:r>
-                      <m:t>942</m:t>
+                      <m:rPr>
+                        <m:sty m:val="b"/>
+                      </m:rPr>
+                      <m:t>599</m:t>
                     </m:r>
                   </m:oMath>
                   <w:r>
@@ -10609,7 +10793,7 @@
                   </w:pPr>
                   <m:oMath>
                     <m:r>
-                      <m:t>97</m:t>
+                      <m:t>100</m:t>
                     </m:r>
                     <m:r>
                       <m:rPr>
@@ -10618,7 +10802,206 @@
                       <m:t>,</m:t>
                     </m:r>
                     <m:r>
+                      <m:t>0</m:t>
+                    </m:r>
+                    <m:r>
+                      <m:rPr>
+                        <m:nor/>
+                        <m:sty m:val="p"/>
+                      </m:rPr>
+                      <m:t> %</m:t>
+                    </m:r>
+                  </m:oMath>
+                  <w:r>
+                    <w:t xml:space="preserve">​</w:t>
+                  </w:r>
+                </w:p>
+              </w:tc>
+            </w:tr>
+            <w:tr>
+              <w:tc>
+                <w:tcPr/>
+                <w:p>
+                  <w:pPr>
+                    <w:pStyle w:val="Compact"/>
+                    <w:jc w:val="center"/>
+                    <w:jc w:val="center"/>
+                  </w:pPr>
+                  <w:r>
+                    <w:rPr>
+                      <w:b/>
+                      <w:bCs/>
+                    </w:rPr>
+                    <w:t xml:space="preserve">PY-02</w:t>
+                  </w:r>
+                </w:p>
+              </w:tc>
+              <w:tc>
+                <w:tcPr/>
+                <w:p>
+                  <w:pPr>
+                    <w:pStyle w:val="Compact"/>
+                    <w:jc w:val="left"/>
+                    <w:jc w:val="center"/>
+                  </w:pPr>
+                  <w:r>
+                    <w:t xml:space="preserve">San Pedro</w:t>
+                  </w:r>
+                </w:p>
+              </w:tc>
+              <w:tc>
+                <w:tcPr/>
+                <w:p>
+                  <w:pPr>
+                    <w:pStyle w:val="Compact"/>
+                    <w:jc w:val="left"/>
+                    <w:jc w:val="center"/>
+                  </w:pPr>
+                  <w:r>
+                    <w:t xml:space="preserve">Oriental</w:t>
+                  </w:r>
+                </w:p>
+              </w:tc>
+              <w:tc>
+                <w:tcPr/>
+                <w:p>
+                  <w:pPr>
+                    <w:pStyle w:val="Compact"/>
+                    <w:jc w:val="center"/>
+                    <w:jc w:val="center"/>
+                  </w:pPr>
+                  <m:oMath>
+                    <m:r>
+                      <m:t>20.854</m:t>
+                    </m:r>
+                  </m:oMath>
+                  <w:r>
+                    <w:t xml:space="preserve">​</w:t>
+                  </w:r>
+                </w:p>
+              </w:tc>
+              <w:tc>
+                <w:tcPr/>
+                <w:p>
+                  <w:pPr>
+                    <w:pStyle w:val="Compact"/>
+                    <w:jc w:val="center"/>
+                    <w:jc w:val="center"/>
+                  </w:pPr>
+                  <m:oMath>
+                    <m:r>
+                      <m:t>15</m:t>
+                    </m:r>
+                  </m:oMath>
+                  <w:r>
+                    <w:t xml:space="preserve">​</w:t>
+                  </w:r>
+                </w:p>
+              </w:tc>
+              <w:tc>
+                <w:tcPr/>
+                <w:p>
+                  <w:pPr>
+                    <w:pStyle w:val="Compact"/>
+                    <w:jc w:val="center"/>
+                    <w:jc w:val="center"/>
+                  </w:pPr>
+                  <m:oMath>
+                    <m:r>
                       <m:t>8</m:t>
+                    </m:r>
+                  </m:oMath>
+                  <w:r>
+                    <w:t xml:space="preserve">​</w:t>
+                  </w:r>
+                </w:p>
+              </w:tc>
+              <w:tc>
+                <w:tcPr/>
+                <w:p>
+                  <w:pPr>
+                    <w:pStyle w:val="Compact"/>
+                    <w:jc w:val="center"/>
+                    <w:jc w:val="center"/>
+                  </w:pPr>
+                  <m:oMath>
+                    <m:r>
+                      <m:rPr>
+                        <m:sty m:val="b"/>
+                      </m:rPr>
+                      <m:t>0</m:t>
+                    </m:r>
+                    <m:r>
+                      <m:rPr>
+                        <m:sty m:val="b"/>
+                      </m:rPr>
+                      <m:t>,</m:t>
+                    </m:r>
+                    <m:r>
+                      <m:rPr>
+                        <m:sty m:val="b"/>
+                      </m:rPr>
+                      <m:t>804</m:t>
+                    </m:r>
+                  </m:oMath>
+                  <w:r>
+                    <w:t xml:space="preserve">​</w:t>
+                  </w:r>
+                </w:p>
+              </w:tc>
+              <w:tc>
+                <w:tcPr/>
+                <w:p>
+                  <w:pPr>
+                    <w:pStyle w:val="Compact"/>
+                    <w:jc w:val="center"/>
+                    <w:jc w:val="center"/>
+                  </w:pPr>
+                  <m:oMath>
+                    <m:r>
+                      <m:rPr>
+                        <m:sty m:val="b"/>
+                      </m:rPr>
+                      <m:t>0</m:t>
+                    </m:r>
+                    <m:r>
+                      <m:rPr>
+                        <m:sty m:val="b"/>
+                      </m:rPr>
+                      <m:t>,</m:t>
+                    </m:r>
+                    <m:r>
+                      <m:rPr>
+                        <m:sty m:val="b"/>
+                      </m:rPr>
+                      <m:t>616</m:t>
+                    </m:r>
+                  </m:oMath>
+                  <w:r>
+                    <w:t xml:space="preserve">​</w:t>
+                  </w:r>
+                </w:p>
+              </w:tc>
+              <w:tc>
+                <w:tcPr/>
+                <w:p>
+                  <w:pPr>
+                    <w:pStyle w:val="Compact"/>
+                    <w:jc w:val="center"/>
+                    <w:jc w:val="center"/>
+                  </w:pPr>
+                  <m:oMath>
+                    <m:r>
+                      <m:t>100</m:t>
+                    </m:r>
+                    <m:r>
+                      <m:rPr>
+                        <m:sty m:val="p"/>
+                      </m:rPr>
+                      <m:t>,</m:t>
+                    </m:r>
+                    <m:r>
+                      <m:t>0</m:t>
                     </m:r>
                     <m:r>
                       <m:rPr>
@@ -10688,7 +11071,7 @@
                   </w:pPr>
                   <m:oMath>
                     <m:r>
-                      <m:t>18.051</m:t>
+                      <m:t>18.523</m:t>
                     </m:r>
                   </m:oMath>
                   <w:r>
@@ -10706,16 +11089,58 @@
                   </w:pPr>
                   <m:oMath>
                     <m:r>
+                      <m:t>274</m:t>
+                    </m:r>
+                  </m:oMath>
+                  <w:r>
+                    <w:t xml:space="preserve">​</w:t>
+                  </w:r>
+                </w:p>
+              </w:tc>
+              <w:tc>
+                <w:tcPr/>
+                <w:p>
+                  <w:pPr>
+                    <w:pStyle w:val="Compact"/>
+                    <w:jc w:val="center"/>
+                    <w:jc w:val="center"/>
+                  </w:pPr>
+                  <m:oMath>
+                    <m:r>
+                      <m:t>20</m:t>
+                    </m:r>
+                  </m:oMath>
+                  <w:r>
+                    <w:t xml:space="preserve">​</w:t>
+                  </w:r>
+                </w:p>
+              </w:tc>
+              <w:tc>
+                <w:tcPr/>
+                <w:p>
+                  <w:pPr>
+                    <w:pStyle w:val="Compact"/>
+                    <w:jc w:val="center"/>
+                    <w:jc w:val="center"/>
+                  </w:pPr>
+                  <m:oMath>
+                    <m:r>
+                      <m:rPr>
+                        <m:sty m:val="b"/>
+                      </m:rPr>
                       <m:t>0</m:t>
                     </m:r>
                     <m:r>
                       <m:rPr>
-                        <m:sty m:val="p"/>
+                        <m:sty m:val="b"/>
                       </m:rPr>
                       <m:t>,</m:t>
                     </m:r>
                     <m:r>
-                      <m:t>782</m:t>
+                      <m:rPr>
+                        <m:sty m:val="b"/>
+                      </m:rPr>
+                      <m:t>761</m:t>
                     </m:r>
                   </m:oMath>
                   <w:r>
@@ -10733,16 +11158,22 @@
                   </w:pPr>
                   <m:oMath>
                     <m:r>
+                      <m:rPr>
+                        <m:sty m:val="b"/>
+                      </m:rPr>
                       <m:t>0</m:t>
                     </m:r>
                     <m:r>
                       <m:rPr>
-                        <m:sty m:val="p"/>
+                        <m:sty m:val="b"/>
                       </m:rPr>
                       <m:t>,</m:t>
                     </m:r>
                     <m:r>
-                      <m:t>874</m:t>
+                      <m:rPr>
+                        <m:sty m:val="b"/>
+                      </m:rPr>
+                      <m:t>752</m:t>
                     </m:r>
                   </m:oMath>
                   <w:r>
@@ -10799,20 +11230,20 @@
                       <w:b/>
                       <w:bCs/>
                     </w:rPr>
-                    <w:t xml:space="preserve">PY-02</w:t>
-                  </w:r>
-                </w:p>
-              </w:tc>
-              <w:tc>
-                <w:tcPr/>
-                <w:p>
-                  <w:pPr>
-                    <w:pStyle w:val="Compact"/>
-                    <w:jc w:val="left"/>
-                    <w:jc w:val="center"/>
-                  </w:pPr>
-                  <w:r>
-                    <w:t xml:space="preserve">San Pedro</w:t>
+                    <w:t xml:space="preserve">PY-13</w:t>
+                  </w:r>
+                </w:p>
+              </w:tc>
+              <w:tc>
+                <w:tcPr/>
+                <w:p>
+                  <w:pPr>
+                    <w:pStyle w:val="Compact"/>
+                    <w:jc w:val="left"/>
+                    <w:jc w:val="center"/>
+                  </w:pPr>
+                  <w:r>
+                    <w:t xml:space="preserve">Amambay</w:t>
                   </w:r>
                 </w:p>
               </w:tc>
@@ -10839,7 +11270,7 @@
                   </w:pPr>
                   <m:oMath>
                     <m:r>
-                      <m:t>20.002</m:t>
+                      <m:t>12.555</m:t>
                     </m:r>
                   </m:oMath>
                   <w:r>
@@ -10857,16 +11288,58 @@
                   </w:pPr>
                   <m:oMath>
                     <m:r>
+                      <m:t>85</m:t>
+                    </m:r>
+                  </m:oMath>
+                  <w:r>
+                    <w:t xml:space="preserve">​</w:t>
+                  </w:r>
+                </w:p>
+              </w:tc>
+              <w:tc>
+                <w:tcPr/>
+                <w:p>
+                  <w:pPr>
+                    <w:pStyle w:val="Compact"/>
+                    <w:jc w:val="center"/>
+                    <w:jc w:val="center"/>
+                  </w:pPr>
+                  <m:oMath>
+                    <m:r>
+                      <m:t>11</m:t>
+                    </m:r>
+                  </m:oMath>
+                  <w:r>
+                    <w:t xml:space="preserve">​</w:t>
+                  </w:r>
+                </w:p>
+              </w:tc>
+              <w:tc>
+                <w:tcPr/>
+                <w:p>
+                  <w:pPr>
+                    <w:pStyle w:val="Compact"/>
+                    <w:jc w:val="center"/>
+                    <w:jc w:val="center"/>
+                  </w:pPr>
+                  <m:oMath>
+                    <m:r>
+                      <m:rPr>
+                        <m:sty m:val="b"/>
+                      </m:rPr>
                       <m:t>0</m:t>
                     </m:r>
                     <m:r>
                       <m:rPr>
-                        <m:sty m:val="p"/>
+                        <m:sty m:val="b"/>
                       </m:rPr>
                       <m:t>,</m:t>
                     </m:r>
                     <m:r>
-                      <m:t>794</m:t>
+                      <m:rPr>
+                        <m:sty m:val="b"/>
+                      </m:rPr>
+                      <m:t>655</m:t>
                     </m:r>
                   </m:oMath>
                   <w:r>
@@ -10884,318 +11357,22 @@
                   </w:pPr>
                   <m:oMath>
                     <m:r>
+                      <m:rPr>
+                        <m:sty m:val="b"/>
+                      </m:rPr>
                       <m:t>0</m:t>
                     </m:r>
                     <m:r>
                       <m:rPr>
-                        <m:sty m:val="p"/>
+                        <m:sty m:val="b"/>
                       </m:rPr>
                       <m:t>,</m:t>
                     </m:r>
                     <m:r>
-                      <m:t>881</m:t>
-                    </m:r>
-                  </m:oMath>
-                  <w:r>
-                    <w:t xml:space="preserve">​</w:t>
-                  </w:r>
-                </w:p>
-              </w:tc>
-              <w:tc>
-                <w:tcPr/>
-                <w:p>
-                  <w:pPr>
-                    <w:pStyle w:val="Compact"/>
-                    <w:jc w:val="center"/>
-                    <w:jc w:val="center"/>
-                  </w:pPr>
-                  <m:oMath>
-                    <m:r>
-                      <m:t>100</m:t>
-                    </m:r>
-                    <m:r>
-                      <m:rPr>
-                        <m:sty m:val="p"/>
-                      </m:rPr>
-                      <m:t>,</m:t>
-                    </m:r>
-                    <m:r>
-                      <m:t>0</m:t>
-                    </m:r>
-                    <m:r>
-                      <m:rPr>
-                        <m:nor/>
-                        <m:sty m:val="p"/>
-                      </m:rPr>
-                      <m:t> %</m:t>
-                    </m:r>
-                  </m:oMath>
-                  <w:r>
-                    <w:t xml:space="preserve">​</w:t>
-                  </w:r>
-                </w:p>
-              </w:tc>
-            </w:tr>
-            <w:tr>
-              <w:tc>
-                <w:tcPr/>
-                <w:p>
-                  <w:pPr>
-                    <w:pStyle w:val="Compact"/>
-                    <w:jc w:val="center"/>
-                    <w:jc w:val="center"/>
-                  </w:pPr>
-                  <w:r>
-                    <w:rPr>
-                      <w:b/>
-                      <w:bCs/>
-                    </w:rPr>
-                    <w:t xml:space="preserve">PY-03</w:t>
-                  </w:r>
-                </w:p>
-              </w:tc>
-              <w:tc>
-                <w:tcPr/>
-                <w:p>
-                  <w:pPr>
-                    <w:pStyle w:val="Compact"/>
-                    <w:jc w:val="left"/>
-                    <w:jc w:val="center"/>
-                  </w:pPr>
-                  <w:r>
-                    <w:t xml:space="preserve">Cordillera</w:t>
-                  </w:r>
-                </w:p>
-              </w:tc>
-              <w:tc>
-                <w:tcPr/>
-                <w:p>
-                  <w:pPr>
-                    <w:pStyle w:val="Compact"/>
-                    <w:jc w:val="left"/>
-                    <w:jc w:val="center"/>
-                  </w:pPr>
-                  <w:r>
-                    <w:t xml:space="preserve">Oriental</w:t>
-                  </w:r>
-                </w:p>
-              </w:tc>
-              <w:tc>
-                <w:tcPr/>
-                <w:p>
-                  <w:pPr>
-                    <w:pStyle w:val="Compact"/>
-                    <w:jc w:val="center"/>
-                    <w:jc w:val="center"/>
-                  </w:pPr>
-                  <m:oMath>
-                    <m:r>
-                      <m:t>4.948</m:t>
-                    </m:r>
-                  </m:oMath>
-                  <w:r>
-                    <w:t xml:space="preserve">​</w:t>
-                  </w:r>
-                </w:p>
-              </w:tc>
-              <w:tc>
-                <w:tcPr/>
-                <w:p>
-                  <w:pPr>
-                    <w:pStyle w:val="Compact"/>
-                    <w:jc w:val="center"/>
-                    <w:jc w:val="center"/>
-                  </w:pPr>
-                  <m:oMath>
-                    <m:r>
-                      <m:t>0</m:t>
-                    </m:r>
-                    <m:r>
-                      <m:rPr>
-                        <m:sty m:val="p"/>
-                      </m:rPr>
-                      <m:t>,</m:t>
-                    </m:r>
-                    <m:r>
-                      <m:t>741</m:t>
-                    </m:r>
-                  </m:oMath>
-                  <w:r>
-                    <w:t xml:space="preserve">​</w:t>
-                  </w:r>
-                </w:p>
-              </w:tc>
-              <w:tc>
-                <w:tcPr/>
-                <w:p>
-                  <w:pPr>
-                    <w:pStyle w:val="Compact"/>
-                    <w:jc w:val="center"/>
-                    <w:jc w:val="center"/>
-                  </w:pPr>
-                  <m:oMath>
-                    <m:r>
-                      <m:t>0</m:t>
-                    </m:r>
-                    <m:r>
-                      <m:rPr>
-                        <m:sty m:val="p"/>
-                      </m:rPr>
-                      <m:t>,</m:t>
-                    </m:r>
-                    <m:r>
-                      <m:t>842</m:t>
-                    </m:r>
-                  </m:oMath>
-                  <w:r>
-                    <w:t xml:space="preserve">​</w:t>
-                  </w:r>
-                </w:p>
-              </w:tc>
-              <w:tc>
-                <w:tcPr/>
-                <w:p>
-                  <w:pPr>
-                    <w:pStyle w:val="Compact"/>
-                    <w:jc w:val="center"/>
-                    <w:jc w:val="center"/>
-                  </w:pPr>
-                  <m:oMath>
-                    <m:r>
-                      <m:t>100</m:t>
-                    </m:r>
-                    <m:r>
-                      <m:rPr>
-                        <m:sty m:val="p"/>
-                      </m:rPr>
-                      <m:t>,</m:t>
-                    </m:r>
-                    <m:r>
-                      <m:t>0</m:t>
-                    </m:r>
-                    <m:r>
-                      <m:rPr>
-                        <m:nor/>
-                        <m:sty m:val="p"/>
-                      </m:rPr>
-                      <m:t> %</m:t>
-                    </m:r>
-                  </m:oMath>
-                  <w:r>
-                    <w:t xml:space="preserve">​</w:t>
-                  </w:r>
-                </w:p>
-              </w:tc>
-            </w:tr>
-            <w:tr>
-              <w:tc>
-                <w:tcPr/>
-                <w:p>
-                  <w:pPr>
-                    <w:pStyle w:val="Compact"/>
-                    <w:jc w:val="center"/>
-                    <w:jc w:val="center"/>
-                  </w:pPr>
-                  <w:r>
-                    <w:rPr>
-                      <w:b/>
-                      <w:bCs/>
-                    </w:rPr>
-                    <w:t xml:space="preserve">PY-04</w:t>
-                  </w:r>
-                </w:p>
-              </w:tc>
-              <w:tc>
-                <w:tcPr/>
-                <w:p>
-                  <w:pPr>
-                    <w:pStyle w:val="Compact"/>
-                    <w:jc w:val="left"/>
-                    <w:jc w:val="center"/>
-                  </w:pPr>
-                  <w:r>
-                    <w:t xml:space="preserve">Guairá</w:t>
-                  </w:r>
-                </w:p>
-              </w:tc>
-              <w:tc>
-                <w:tcPr/>
-                <w:p>
-                  <w:pPr>
-                    <w:pStyle w:val="Compact"/>
-                    <w:jc w:val="left"/>
-                    <w:jc w:val="center"/>
-                  </w:pPr>
-                  <w:r>
-                    <w:t xml:space="preserve">Oriental</w:t>
-                  </w:r>
-                </w:p>
-              </w:tc>
-              <w:tc>
-                <w:tcPr/>
-                <w:p>
-                  <w:pPr>
-                    <w:pStyle w:val="Compact"/>
-                    <w:jc w:val="center"/>
-                    <w:jc w:val="center"/>
-                  </w:pPr>
-                  <m:oMath>
-                    <m:r>
-                      <m:t>3.856</m:t>
-                    </m:r>
-                  </m:oMath>
-                  <w:r>
-                    <w:t xml:space="preserve">​</w:t>
-                  </w:r>
-                </w:p>
-              </w:tc>
-              <w:tc>
-                <w:tcPr/>
-                <w:p>
-                  <w:pPr>
-                    <w:pStyle w:val="Compact"/>
-                    <w:jc w:val="center"/>
-                    <w:jc w:val="center"/>
-                  </w:pPr>
-                  <m:oMath>
-                    <m:r>
-                      <m:t>0</m:t>
-                    </m:r>
-                    <m:r>
-                      <m:rPr>
-                        <m:sty m:val="p"/>
-                      </m:rPr>
-                      <m:t>,</m:t>
-                    </m:r>
-                    <m:r>
-                      <m:t>753</m:t>
-                    </m:r>
-                  </m:oMath>
-                  <w:r>
-                    <w:t xml:space="preserve">​</w:t>
-                  </w:r>
-                </w:p>
-              </w:tc>
-              <w:tc>
-                <w:tcPr/>
-                <w:p>
-                  <w:pPr>
-                    <w:pStyle w:val="Compact"/>
-                    <w:jc w:val="center"/>
-                    <w:jc w:val="center"/>
-                  </w:pPr>
-                  <m:oMath>
-                    <m:r>
-                      <m:t>0</m:t>
-                    </m:r>
-                    <m:r>
-                      <m:rPr>
-                        <m:sty m:val="p"/>
-                      </m:rPr>
-                      <m:t>,</m:t>
-                    </m:r>
-                    <m:r>
-                      <m:t>839</m:t>
+                      <m:rPr>
+                        <m:sty m:val="b"/>
+                      </m:rPr>
+                      <m:t>589</m:t>
                     </m:r>
                   </m:oMath>
                   <w:r>
@@ -11292,7 +11469,7 @@
                   </w:pPr>
                   <m:oMath>
                     <m:r>
-                      <m:t>11.474</m:t>
+                      <m:t>12.901</m:t>
                     </m:r>
                   </m:oMath>
                   <w:r>
@@ -11310,17 +11487,26 @@
                   </w:pPr>
                   <m:oMath>
                     <m:r>
+                      <m:t>34</m:t>
+                    </m:r>
+                  </m:oMath>
+                  <w:r>
+                    <w:t xml:space="preserve">​</w:t>
+                  </w:r>
+                </w:p>
+              </w:tc>
+              <w:tc>
+                <w:tcPr/>
+                <w:p>
+                  <w:pPr>
+                    <w:pStyle w:val="Compact"/>
+                    <w:jc w:val="center"/>
+                    <w:jc w:val="center"/>
+                  </w:pPr>
+                  <m:oMath>
+                    <m:r>
                       <m:t>0</m:t>
                     </m:r>
-                    <m:r>
-                      <m:rPr>
-                        <m:sty m:val="p"/>
-                      </m:rPr>
-                      <m:t>,</m:t>
-                    </m:r>
-                    <m:r>
-                      <m:t>768</m:t>
-                    </m:r>
                   </m:oMath>
                   <w:r>
                     <w:t xml:space="preserve">​</w:t>
@@ -11335,22 +11521,21 @@
                     <w:jc w:val="center"/>
                     <w:jc w:val="center"/>
                   </w:pPr>
-                  <m:oMath>
-                    <m:r>
-                      <m:t>0</m:t>
-                    </m:r>
-                    <m:r>
-                      <m:rPr>
-                        <m:sty m:val="p"/>
-                      </m:rPr>
-                      <m:t>,</m:t>
-                    </m:r>
-                    <m:r>
-                      <m:t>865</m:t>
-                    </m:r>
-                  </m:oMath>
-                  <w:r>
-                    <w:t xml:space="preserve">​</w:t>
+                  <w:r>
+                    <w:t xml:space="preserve">—</w:t>
+                  </w:r>
+                </w:p>
+              </w:tc>
+              <w:tc>
+                <w:tcPr/>
+                <w:p>
+                  <w:pPr>
+                    <w:pStyle w:val="Compact"/>
+                    <w:jc w:val="center"/>
+                    <w:jc w:val="center"/>
+                  </w:pPr>
+                  <w:r>
+                    <w:t xml:space="preserve">—</w:t>
                   </w:r>
                 </w:p>
               </w:tc>
@@ -11403,20 +11588,20 @@
                       <w:b/>
                       <w:bCs/>
                     </w:rPr>
-                    <w:t xml:space="preserve">PY-06</w:t>
-                  </w:r>
-                </w:p>
-              </w:tc>
-              <w:tc>
-                <w:tcPr/>
-                <w:p>
-                  <w:pPr>
-                    <w:pStyle w:val="Compact"/>
-                    <w:jc w:val="left"/>
-                    <w:jc w:val="center"/>
-                  </w:pPr>
-                  <w:r>
-                    <w:t xml:space="preserve">Caazapá</w:t>
+                    <w:t xml:space="preserve">PY-12</w:t>
+                  </w:r>
+                </w:p>
+              </w:tc>
+              <w:tc>
+                <w:tcPr/>
+                <w:p>
+                  <w:pPr>
+                    <w:pStyle w:val="Compact"/>
+                    <w:jc w:val="left"/>
+                    <w:jc w:val="center"/>
+                  </w:pPr>
+                  <w:r>
+                    <w:t xml:space="preserve">Ñeembucú</w:t>
                   </w:r>
                 </w:p>
               </w:tc>
@@ -11443,7 +11628,7 @@
                   </w:pPr>
                   <m:oMath>
                     <m:r>
-                      <m:t>9.496</m:t>
+                      <m:t>11.672</m:t>
                     </m:r>
                   </m:oMath>
                   <w:r>
@@ -11461,17 +11646,26 @@
                   </w:pPr>
                   <m:oMath>
                     <m:r>
+                      <m:t>31</m:t>
+                    </m:r>
+                  </m:oMath>
+                  <w:r>
+                    <w:t xml:space="preserve">​</w:t>
+                  </w:r>
+                </w:p>
+              </w:tc>
+              <w:tc>
+                <w:tcPr/>
+                <w:p>
+                  <w:pPr>
+                    <w:pStyle w:val="Compact"/>
+                    <w:jc w:val="center"/>
+                    <w:jc w:val="center"/>
+                  </w:pPr>
+                  <m:oMath>
+                    <m:r>
                       <m:t>0</m:t>
                     </m:r>
-                    <m:r>
-                      <m:rPr>
-                        <m:sty m:val="p"/>
-                      </m:rPr>
-                      <m:t>,</m:t>
-                    </m:r>
-                    <m:r>
-                      <m:t>779</m:t>
-                    </m:r>
                   </m:oMath>
                   <w:r>
                     <w:t xml:space="preserve">​</w:t>
@@ -11486,173 +11680,21 @@
                     <w:jc w:val="center"/>
                     <w:jc w:val="center"/>
                   </w:pPr>
-                  <m:oMath>
-                    <m:r>
-                      <m:t>0</m:t>
-                    </m:r>
-                    <m:r>
-                      <m:rPr>
-                        <m:sty m:val="p"/>
-                      </m:rPr>
-                      <m:t>,</m:t>
-                    </m:r>
-                    <m:r>
-                      <m:t>871</m:t>
-                    </m:r>
-                  </m:oMath>
-                  <w:r>
-                    <w:t xml:space="preserve">​</w:t>
-                  </w:r>
-                </w:p>
-              </w:tc>
-              <w:tc>
-                <w:tcPr/>
-                <w:p>
-                  <w:pPr>
-                    <w:pStyle w:val="Compact"/>
-                    <w:jc w:val="center"/>
-                    <w:jc w:val="center"/>
-                  </w:pPr>
-                  <m:oMath>
-                    <m:r>
-                      <m:t>100</m:t>
-                    </m:r>
-                    <m:r>
-                      <m:rPr>
-                        <m:sty m:val="p"/>
-                      </m:rPr>
-                      <m:t>,</m:t>
-                    </m:r>
-                    <m:r>
-                      <m:t>0</m:t>
-                    </m:r>
-                    <m:r>
-                      <m:rPr>
-                        <m:nor/>
-                        <m:sty m:val="p"/>
-                      </m:rPr>
-                      <m:t> %</m:t>
-                    </m:r>
-                  </m:oMath>
-                  <w:r>
-                    <w:t xml:space="preserve">​</w:t>
-                  </w:r>
-                </w:p>
-              </w:tc>
-            </w:tr>
-            <w:tr>
-              <w:tc>
-                <w:tcPr/>
-                <w:p>
-                  <w:pPr>
-                    <w:pStyle w:val="Compact"/>
-                    <w:jc w:val="center"/>
-                    <w:jc w:val="center"/>
-                  </w:pPr>
-                  <w:r>
-                    <w:rPr>
-                      <w:b/>
-                      <w:bCs/>
-                    </w:rPr>
-                    <w:t xml:space="preserve">PY-07</w:t>
-                  </w:r>
-                </w:p>
-              </w:tc>
-              <w:tc>
-                <w:tcPr/>
-                <w:p>
-                  <w:pPr>
-                    <w:pStyle w:val="Compact"/>
-                    <w:jc w:val="left"/>
-                    <w:jc w:val="center"/>
-                  </w:pPr>
-                  <w:r>
-                    <w:t xml:space="preserve">Itapúa</w:t>
-                  </w:r>
-                </w:p>
-              </w:tc>
-              <w:tc>
-                <w:tcPr/>
-                <w:p>
-                  <w:pPr>
-                    <w:pStyle w:val="Compact"/>
-                    <w:jc w:val="left"/>
-                    <w:jc w:val="center"/>
-                  </w:pPr>
-                  <w:r>
-                    <w:t xml:space="preserve">Oriental</w:t>
-                  </w:r>
-                </w:p>
-              </w:tc>
-              <w:tc>
-                <w:tcPr/>
-                <w:p>
-                  <w:pPr>
-                    <w:pStyle w:val="Compact"/>
-                    <w:jc w:val="center"/>
-                    <w:jc w:val="center"/>
-                  </w:pPr>
-                  <m:oMath>
-                    <m:r>
-                      <m:t>16.525</m:t>
-                    </m:r>
-                  </m:oMath>
-                  <w:r>
-                    <w:t xml:space="preserve">​</w:t>
-                  </w:r>
-                </w:p>
-              </w:tc>
-              <w:tc>
-                <w:tcPr/>
-                <w:p>
-                  <w:pPr>
-                    <w:pStyle w:val="Compact"/>
-                    <w:jc w:val="center"/>
-                    <w:jc w:val="center"/>
-                  </w:pPr>
-                  <m:oMath>
-                    <m:r>
-                      <m:t>0</m:t>
-                    </m:r>
-                    <m:r>
-                      <m:rPr>
-                        <m:sty m:val="p"/>
-                      </m:rPr>
-                      <m:t>,</m:t>
-                    </m:r>
-                    <m:r>
-                      <m:t>762</m:t>
-                    </m:r>
-                  </m:oMath>
-                  <w:r>
-                    <w:t xml:space="preserve">​</w:t>
-                  </w:r>
-                </w:p>
-              </w:tc>
-              <w:tc>
-                <w:tcPr/>
-                <w:p>
-                  <w:pPr>
-                    <w:pStyle w:val="Compact"/>
-                    <w:jc w:val="center"/>
-                    <w:jc w:val="center"/>
-                  </w:pPr>
-                  <m:oMath>
-                    <m:r>
-                      <m:t>0</m:t>
-                    </m:r>
-                    <m:r>
-                      <m:rPr>
-                        <m:sty m:val="p"/>
-                      </m:rPr>
-                      <m:t>,</m:t>
-                    </m:r>
-                    <m:r>
-                      <m:t>859</m:t>
-                    </m:r>
-                  </m:oMath>
-                  <w:r>
-                    <w:t xml:space="preserve">​</w:t>
+                  <w:r>
+                    <w:t xml:space="preserve">—</w:t>
+                  </w:r>
+                </w:p>
+              </w:tc>
+              <w:tc>
+                <w:tcPr/>
+                <w:p>
+                  <w:pPr>
+                    <w:pStyle w:val="Compact"/>
+                    <w:jc w:val="center"/>
+                    <w:jc w:val="center"/>
+                  </w:pPr>
+                  <w:r>
+                    <w:t xml:space="preserve">—</w:t>
                   </w:r>
                 </w:p>
               </w:tc>
@@ -11745,7 +11787,7 @@
                   </w:pPr>
                   <m:oMath>
                     <m:r>
-                      <m:t>9.556</m:t>
+                      <m:t>8.157</m:t>
                     </m:r>
                   </m:oMath>
                   <w:r>
@@ -11763,16 +11805,7 @@
                   </w:pPr>
                   <m:oMath>
                     <m:r>
-                      <m:t>0</m:t>
-                    </m:r>
-                    <m:r>
-                      <m:rPr>
-                        <m:sty m:val="p"/>
-                      </m:rPr>
-                      <m:t>,</m:t>
-                    </m:r>
-                    <m:r>
-                      <m:t>735</m:t>
+                      <m:t>1</m:t>
                     </m:r>
                   </m:oMath>
                   <w:r>
@@ -11790,16 +11823,7 @@
                   </w:pPr>
                   <m:oMath>
                     <m:r>
-                      <m:t>0</m:t>
-                    </m:r>
-                    <m:r>
-                      <m:rPr>
-                        <m:sty m:val="p"/>
-                      </m:rPr>
-                      <m:t>,</m:t>
-                    </m:r>
-                    <m:r>
-                      <m:t>830</m:t>
+                      <m:t>1</m:t>
                     </m:r>
                   </m:oMath>
                   <w:r>
@@ -11815,29 +11839,34 @@
                     <w:jc w:val="center"/>
                     <w:jc w:val="center"/>
                   </w:pPr>
-                  <m:oMath>
-                    <m:r>
-                      <m:t>100</m:t>
-                    </m:r>
-                    <m:r>
-                      <m:rPr>
-                        <m:sty m:val="p"/>
-                      </m:rPr>
-                      <m:t>,</m:t>
-                    </m:r>
-                    <m:r>
-                      <m:t>0</m:t>
-                    </m:r>
-                    <m:r>
-                      <m:rPr>
-                        <m:nor/>
-                        <m:sty m:val="p"/>
-                      </m:rPr>
-                      <m:t> %</m:t>
-                    </m:r>
-                  </m:oMath>
-                  <w:r>
-                    <w:t xml:space="preserve">​</w:t>
+                  <w:r>
+                    <w:t xml:space="preserve">—</w:t>
+                  </w:r>
+                </w:p>
+              </w:tc>
+              <w:tc>
+                <w:tcPr/>
+                <w:p>
+                  <w:pPr>
+                    <w:pStyle w:val="Compact"/>
+                    <w:jc w:val="center"/>
+                    <w:jc w:val="center"/>
+                  </w:pPr>
+                  <w:r>
+                    <w:t xml:space="preserve">—</w:t>
+                  </w:r>
+                </w:p>
+              </w:tc>
+              <w:tc>
+                <w:tcPr/>
+                <w:p>
+                  <w:pPr>
+                    <w:pStyle w:val="Compact"/>
+                    <w:jc w:val="center"/>
+                    <w:jc w:val="center"/>
+                  </w:pPr>
+                  <w:r>
+                    <w:t xml:space="preserve">—</w:t>
                   </w:r>
                 </w:p>
               </w:tc>
@@ -11856,20 +11885,20 @@
                       <w:b/>
                       <w:bCs/>
                     </w:rPr>
-                    <w:t xml:space="preserve">PY-09</w:t>
-                  </w:r>
-                </w:p>
-              </w:tc>
-              <w:tc>
-                <w:tcPr/>
-                <w:p>
-                  <w:pPr>
-                    <w:pStyle w:val="Compact"/>
-                    <w:jc w:val="left"/>
-                    <w:jc w:val="center"/>
-                  </w:pPr>
-                  <w:r>
-                    <w:t xml:space="preserve">Paraguarí</w:t>
+                    <w:t xml:space="preserve">Resto ADM1</w:t>
+                  </w:r>
+                </w:p>
+              </w:tc>
+              <w:tc>
+                <w:tcPr/>
+                <w:p>
+                  <w:pPr>
+                    <w:pStyle w:val="Compact"/>
+                    <w:jc w:val="left"/>
+                    <w:jc w:val="center"/>
+                  </w:pPr>
+                  <w:r>
+                    <w:t xml:space="preserve">Otros 9 Deptos.</w:t>
                   </w:r>
                 </w:p>
               </w:tc>
@@ -11896,7 +11925,7 @@
                   </w:pPr>
                   <m:oMath>
                     <m:r>
-                      <m:t>8.705</m:t>
+                      <m:t>72.100</m:t>
                     </m:r>
                   </m:oMath>
                   <w:r>
@@ -11916,15 +11945,6 @@
                     <m:r>
                       <m:t>0</m:t>
                     </m:r>
-                    <m:r>
-                      <m:rPr>
-                        <m:sty m:val="p"/>
-                      </m:rPr>
-                      <m:t>,</m:t>
-                    </m:r>
-                    <m:r>
-                      <m:t>748</m:t>
-                    </m:r>
                   </m:oMath>
                   <w:r>
                     <w:t xml:space="preserve">​</w:t>
@@ -11943,15 +11963,6 @@
                     <m:r>
                       <m:t>0</m:t>
                     </m:r>
-                    <m:r>
-                      <m:rPr>
-                        <m:sty m:val="p"/>
-                      </m:rPr>
-                      <m:t>,</m:t>
-                    </m:r>
-                    <m:r>
-                      <m:t>845</m:t>
-                    </m:r>
                   </m:oMath>
                   <w:r>
                     <w:t xml:space="preserve">​</w:t>
@@ -11966,887 +11977,21 @@
                     <w:jc w:val="center"/>
                     <w:jc w:val="center"/>
                   </w:pPr>
-                  <m:oMath>
-                    <m:r>
-                      <m:t>100</m:t>
-                    </m:r>
-                    <m:r>
-                      <m:rPr>
-                        <m:sty m:val="p"/>
-                      </m:rPr>
-                      <m:t>,</m:t>
-                    </m:r>
-                    <m:r>
-                      <m:t>0</m:t>
-                    </m:r>
-                    <m:r>
-                      <m:rPr>
-                        <m:nor/>
-                        <m:sty m:val="p"/>
-                      </m:rPr>
-                      <m:t> %</m:t>
-                    </m:r>
-                  </m:oMath>
-                  <w:r>
-                    <w:t xml:space="preserve">​</w:t>
-                  </w:r>
-                </w:p>
-              </w:tc>
-            </w:tr>
-            <w:tr>
-              <w:tc>
-                <w:tcPr/>
-                <w:p>
-                  <w:pPr>
-                    <w:pStyle w:val="Compact"/>
-                    <w:jc w:val="center"/>
-                    <w:jc w:val="center"/>
-                  </w:pPr>
-                  <w:r>
-                    <w:rPr>
-                      <w:b/>
-                      <w:bCs/>
-                    </w:rPr>
-                    <w:t xml:space="preserve">PY-10</w:t>
-                  </w:r>
-                </w:p>
-              </w:tc>
-              <w:tc>
-                <w:tcPr/>
-                <w:p>
-                  <w:pPr>
-                    <w:pStyle w:val="Compact"/>
-                    <w:jc w:val="left"/>
-                    <w:jc w:val="center"/>
-                  </w:pPr>
-                  <w:r>
-                    <w:t xml:space="preserve">Alto Paraná</w:t>
-                  </w:r>
-                </w:p>
-              </w:tc>
-              <w:tc>
-                <w:tcPr/>
-                <w:p>
-                  <w:pPr>
-                    <w:pStyle w:val="Compact"/>
-                    <w:jc w:val="left"/>
-                    <w:jc w:val="center"/>
-                  </w:pPr>
-                  <w:r>
-                    <w:t xml:space="preserve">Oriental</w:t>
-                  </w:r>
-                </w:p>
-              </w:tc>
-              <w:tc>
-                <w:tcPr/>
-                <w:p>
-                  <w:pPr>
-                    <w:pStyle w:val="Compact"/>
-                    <w:jc w:val="center"/>
-                    <w:jc w:val="center"/>
-                  </w:pPr>
-                  <m:oMath>
-                    <m:r>
-                      <m:t>14.895</m:t>
-                    </m:r>
-                  </m:oMath>
-                  <w:r>
-                    <w:t xml:space="preserve">​</w:t>
-                  </w:r>
-                </w:p>
-              </w:tc>
-              <w:tc>
-                <w:tcPr/>
-                <w:p>
-                  <w:pPr>
-                    <w:pStyle w:val="Compact"/>
-                    <w:jc w:val="center"/>
-                    <w:jc w:val="center"/>
-                  </w:pPr>
-                  <m:oMath>
-                    <m:r>
-                      <m:t>0</m:t>
-                    </m:r>
-                    <m:r>
-                      <m:rPr>
-                        <m:sty m:val="p"/>
-                      </m:rPr>
-                      <m:t>,</m:t>
-                    </m:r>
-                    <m:r>
-                      <m:t>785</m:t>
-                    </m:r>
-                  </m:oMath>
-                  <w:r>
-                    <w:t xml:space="preserve">​</w:t>
-                  </w:r>
-                </w:p>
-              </w:tc>
-              <w:tc>
-                <w:tcPr/>
-                <w:p>
-                  <w:pPr>
-                    <w:pStyle w:val="Compact"/>
-                    <w:jc w:val="center"/>
-                    <w:jc w:val="center"/>
-                  </w:pPr>
-                  <m:oMath>
-                    <m:r>
-                      <m:t>0</m:t>
-                    </m:r>
-                    <m:r>
-                      <m:rPr>
-                        <m:sty m:val="p"/>
-                      </m:rPr>
-                      <m:t>,</m:t>
-                    </m:r>
-                    <m:r>
-                      <m:t>879</m:t>
-                    </m:r>
-                  </m:oMath>
-                  <w:r>
-                    <w:t xml:space="preserve">​</w:t>
-                  </w:r>
-                </w:p>
-              </w:tc>
-              <w:tc>
-                <w:tcPr/>
-                <w:p>
-                  <w:pPr>
-                    <w:pStyle w:val="Compact"/>
-                    <w:jc w:val="center"/>
-                    <w:jc w:val="center"/>
-                  </w:pPr>
-                  <m:oMath>
-                    <m:r>
-                      <m:t>100</m:t>
-                    </m:r>
-                    <m:r>
-                      <m:rPr>
-                        <m:sty m:val="p"/>
-                      </m:rPr>
-                      <m:t>,</m:t>
-                    </m:r>
-                    <m:r>
-                      <m:t>0</m:t>
-                    </m:r>
-                    <m:r>
-                      <m:rPr>
-                        <m:nor/>
-                        <m:sty m:val="p"/>
-                      </m:rPr>
-                      <m:t> %</m:t>
-                    </m:r>
-                  </m:oMath>
-                  <w:r>
-                    <w:t xml:space="preserve">​</w:t>
-                  </w:r>
-                </w:p>
-              </w:tc>
-            </w:tr>
-            <w:tr>
-              <w:tc>
-                <w:tcPr/>
-                <w:p>
-                  <w:pPr>
-                    <w:pStyle w:val="Compact"/>
-                    <w:jc w:val="center"/>
-                    <w:jc w:val="center"/>
-                  </w:pPr>
-                  <w:r>
-                    <w:rPr>
-                      <w:b/>
-                      <w:bCs/>
-                    </w:rPr>
-                    <w:t xml:space="preserve">PY-11</w:t>
-                  </w:r>
-                </w:p>
-              </w:tc>
-              <w:tc>
-                <w:tcPr/>
-                <w:p>
-                  <w:pPr>
-                    <w:pStyle w:val="Compact"/>
-                    <w:jc w:val="left"/>
-                    <w:jc w:val="center"/>
-                  </w:pPr>
-                  <w:r>
-                    <w:t xml:space="preserve">Central</w:t>
-                  </w:r>
-                </w:p>
-              </w:tc>
-              <w:tc>
-                <w:tcPr/>
-                <w:p>
-                  <w:pPr>
-                    <w:pStyle w:val="Compact"/>
-                    <w:jc w:val="left"/>
-                    <w:jc w:val="center"/>
-                  </w:pPr>
-                  <w:r>
-                    <w:t xml:space="preserve">Oriental</w:t>
-                  </w:r>
-                </w:p>
-              </w:tc>
-              <w:tc>
-                <w:tcPr/>
-                <w:p>
-                  <w:pPr>
-                    <w:pStyle w:val="Compact"/>
-                    <w:jc w:val="center"/>
-                    <w:jc w:val="center"/>
-                  </w:pPr>
-                  <m:oMath>
-                    <m:r>
-                      <m:t>2.465</m:t>
-                    </m:r>
-                  </m:oMath>
-                  <w:r>
-                    <w:t xml:space="preserve">​</w:t>
-                  </w:r>
-                </w:p>
-              </w:tc>
-              <w:tc>
-                <w:tcPr/>
-                <w:p>
-                  <w:pPr>
-                    <w:pStyle w:val="Compact"/>
-                    <w:jc w:val="center"/>
-                    <w:jc w:val="center"/>
-                  </w:pPr>
-                  <m:oMath>
-                    <m:r>
-                      <m:t>0</m:t>
-                    </m:r>
-                    <m:r>
-                      <m:rPr>
-                        <m:sty m:val="p"/>
-                      </m:rPr>
-                      <m:t>,</m:t>
-                    </m:r>
-                    <m:r>
-                      <m:t>712</m:t>
-                    </m:r>
-                  </m:oMath>
-                  <w:r>
-                    <w:t xml:space="preserve">​</w:t>
-                  </w:r>
-                </w:p>
-              </w:tc>
-              <w:tc>
-                <w:tcPr/>
-                <w:p>
-                  <w:pPr>
-                    <w:pStyle w:val="Compact"/>
-                    <w:jc w:val="center"/>
-                    <w:jc w:val="center"/>
-                  </w:pPr>
-                  <m:oMath>
-                    <m:r>
-                      <m:t>0</m:t>
-                    </m:r>
-                    <m:r>
-                      <m:rPr>
-                        <m:sty m:val="p"/>
-                      </m:rPr>
-                      <m:t>,</m:t>
-                    </m:r>
-                    <m:r>
-                      <m:t>810</m:t>
-                    </m:r>
-                  </m:oMath>
-                  <w:r>
-                    <w:t xml:space="preserve">​</w:t>
-                  </w:r>
-                </w:p>
-              </w:tc>
-              <w:tc>
-                <w:tcPr/>
-                <w:p>
-                  <w:pPr>
-                    <w:pStyle w:val="Compact"/>
-                    <w:jc w:val="center"/>
-                    <w:jc w:val="center"/>
-                  </w:pPr>
-                  <m:oMath>
-                    <m:r>
-                      <m:t>100</m:t>
-                    </m:r>
-                    <m:r>
-                      <m:rPr>
-                        <m:sty m:val="p"/>
-                      </m:rPr>
-                      <m:t>,</m:t>
-                    </m:r>
-                    <m:r>
-                      <m:t>0</m:t>
-                    </m:r>
-                    <m:r>
-                      <m:rPr>
-                        <m:nor/>
-                        <m:sty m:val="p"/>
-                      </m:rPr>
-                      <m:t> %</m:t>
-                    </m:r>
-                  </m:oMath>
-                  <w:r>
-                    <w:t xml:space="preserve">​</w:t>
-                  </w:r>
-                </w:p>
-              </w:tc>
-            </w:tr>
-            <w:tr>
-              <w:tc>
-                <w:tcPr/>
-                <w:p>
-                  <w:pPr>
-                    <w:pStyle w:val="Compact"/>
-                    <w:jc w:val="center"/>
-                    <w:jc w:val="center"/>
-                  </w:pPr>
-                  <w:r>
-                    <w:rPr>
-                      <w:b/>
-                      <w:bCs/>
-                    </w:rPr>
-                    <w:t xml:space="preserve">PY-12</w:t>
-                  </w:r>
-                </w:p>
-              </w:tc>
-              <w:tc>
-                <w:tcPr/>
-                <w:p>
-                  <w:pPr>
-                    <w:pStyle w:val="Compact"/>
-                    <w:jc w:val="left"/>
-                    <w:jc w:val="center"/>
-                  </w:pPr>
-                  <w:r>
-                    <w:t xml:space="preserve">Ñeembucú</w:t>
-                  </w:r>
-                </w:p>
-              </w:tc>
-              <w:tc>
-                <w:tcPr/>
-                <w:p>
-                  <w:pPr>
-                    <w:pStyle w:val="Compact"/>
-                    <w:jc w:val="left"/>
-                    <w:jc w:val="center"/>
-                  </w:pPr>
-                  <w:r>
-                    <w:t xml:space="preserve">Oriental</w:t>
-                  </w:r>
-                </w:p>
-              </w:tc>
-              <w:tc>
-                <w:tcPr/>
-                <w:p>
-                  <w:pPr>
-                    <w:pStyle w:val="Compact"/>
-                    <w:jc w:val="center"/>
-                    <w:jc w:val="center"/>
-                  </w:pPr>
-                  <m:oMath>
-                    <m:r>
-                      <m:t>12.147</m:t>
-                    </m:r>
-                  </m:oMath>
-                  <w:r>
-                    <w:t xml:space="preserve">​</w:t>
-                  </w:r>
-                </w:p>
-              </w:tc>
-              <w:tc>
-                <w:tcPr/>
-                <w:p>
-                  <w:pPr>
-                    <w:pStyle w:val="Compact"/>
-                    <w:jc w:val="center"/>
-                    <w:jc w:val="center"/>
-                  </w:pPr>
-                  <m:oMath>
-                    <m:r>
-                      <m:t>0</m:t>
-                    </m:r>
-                    <m:r>
-                      <m:rPr>
-                        <m:sty m:val="p"/>
-                      </m:rPr>
-                      <m:t>,</m:t>
-                    </m:r>
-                    <m:r>
-                      <m:t>729</m:t>
-                    </m:r>
-                  </m:oMath>
-                  <w:r>
-                    <w:t xml:space="preserve">​</w:t>
-                  </w:r>
-                </w:p>
-              </w:tc>
-              <w:tc>
-                <w:tcPr/>
-                <w:p>
-                  <w:pPr>
-                    <w:pStyle w:val="Compact"/>
-                    <w:jc w:val="center"/>
-                    <w:jc w:val="center"/>
-                  </w:pPr>
-                  <m:oMath>
-                    <m:r>
-                      <m:t>0</m:t>
-                    </m:r>
-                    <m:r>
-                      <m:rPr>
-                        <m:sty m:val="p"/>
-                      </m:rPr>
-                      <m:t>,</m:t>
-                    </m:r>
-                    <m:r>
-                      <m:t>825</m:t>
-                    </m:r>
-                  </m:oMath>
-                  <w:r>
-                    <w:t xml:space="preserve">​</w:t>
-                  </w:r>
-                </w:p>
-              </w:tc>
-              <w:tc>
-                <w:tcPr/>
-                <w:p>
-                  <w:pPr>
-                    <w:pStyle w:val="Compact"/>
-                    <w:jc w:val="center"/>
-                    <w:jc w:val="center"/>
-                  </w:pPr>
-                  <m:oMath>
-                    <m:r>
-                      <m:t>100</m:t>
-                    </m:r>
-                    <m:r>
-                      <m:rPr>
-                        <m:sty m:val="p"/>
-                      </m:rPr>
-                      <m:t>,</m:t>
-                    </m:r>
-                    <m:r>
-                      <m:t>0</m:t>
-                    </m:r>
-                    <m:r>
-                      <m:rPr>
-                        <m:nor/>
-                        <m:sty m:val="p"/>
-                      </m:rPr>
-                      <m:t> %</m:t>
-                    </m:r>
-                  </m:oMath>
-                  <w:r>
-                    <w:t xml:space="preserve">​</w:t>
-                  </w:r>
-                </w:p>
-              </w:tc>
-            </w:tr>
-            <w:tr>
-              <w:tc>
-                <w:tcPr/>
-                <w:p>
-                  <w:pPr>
-                    <w:pStyle w:val="Compact"/>
-                    <w:jc w:val="center"/>
-                    <w:jc w:val="center"/>
-                  </w:pPr>
-                  <w:r>
-                    <w:rPr>
-                      <w:b/>
-                      <w:bCs/>
-                    </w:rPr>
-                    <w:t xml:space="preserve">PY-13</w:t>
-                  </w:r>
-                </w:p>
-              </w:tc>
-              <w:tc>
-                <w:tcPr/>
-                <w:p>
-                  <w:pPr>
-                    <w:pStyle w:val="Compact"/>
-                    <w:jc w:val="left"/>
-                    <w:jc w:val="center"/>
-                  </w:pPr>
-                  <w:r>
-                    <w:t xml:space="preserve">Amambay</w:t>
-                  </w:r>
-                </w:p>
-              </w:tc>
-              <w:tc>
-                <w:tcPr/>
-                <w:p>
-                  <w:pPr>
-                    <w:pStyle w:val="Compact"/>
-                    <w:jc w:val="left"/>
-                    <w:jc w:val="center"/>
-                  </w:pPr>
-                  <w:r>
-                    <w:t xml:space="preserve">Oriental</w:t>
-                  </w:r>
-                </w:p>
-              </w:tc>
-              <w:tc>
-                <w:tcPr/>
-                <w:p>
-                  <w:pPr>
-                    <w:pStyle w:val="Compact"/>
-                    <w:jc w:val="center"/>
-                    <w:jc w:val="center"/>
-                  </w:pPr>
-                  <m:oMath>
-                    <m:r>
-                      <m:t>12.938</m:t>
-                    </m:r>
-                  </m:oMath>
-                  <w:r>
-                    <w:t xml:space="preserve">​</w:t>
-                  </w:r>
-                </w:p>
-              </w:tc>
-              <w:tc>
-                <w:tcPr/>
-                <w:p>
-                  <w:pPr>
-                    <w:pStyle w:val="Compact"/>
-                    <w:jc w:val="center"/>
-                    <w:jc w:val="center"/>
-                  </w:pPr>
-                  <m:oMath>
-                    <m:r>
-                      <m:t>0</m:t>
-                    </m:r>
-                    <m:r>
-                      <m:rPr>
-                        <m:sty m:val="p"/>
-                      </m:rPr>
-                      <m:t>,</m:t>
-                    </m:r>
-                    <m:r>
-                      <m:t>802</m:t>
-                    </m:r>
-                  </m:oMath>
-                  <w:r>
-                    <w:t xml:space="preserve">​</w:t>
-                  </w:r>
-                </w:p>
-              </w:tc>
-              <w:tc>
-                <w:tcPr/>
-                <w:p>
-                  <w:pPr>
-                    <w:pStyle w:val="Compact"/>
-                    <w:jc w:val="center"/>
-                    <w:jc w:val="center"/>
-                  </w:pPr>
-                  <m:oMath>
-                    <m:r>
-                      <m:t>0</m:t>
-                    </m:r>
-                    <m:r>
-                      <m:rPr>
-                        <m:sty m:val="p"/>
-                      </m:rPr>
-                      <m:t>,</m:t>
-                    </m:r>
-                    <m:r>
-                      <m:t>891</m:t>
-                    </m:r>
-                  </m:oMath>
-                  <w:r>
-                    <w:t xml:space="preserve">​</w:t>
-                  </w:r>
-                </w:p>
-              </w:tc>
-              <w:tc>
-                <w:tcPr/>
-                <w:p>
-                  <w:pPr>
-                    <w:pStyle w:val="Compact"/>
-                    <w:jc w:val="center"/>
-                    <w:jc w:val="center"/>
-                  </w:pPr>
-                  <m:oMath>
-                    <m:r>
-                      <m:t>100</m:t>
-                    </m:r>
-                    <m:r>
-                      <m:rPr>
-                        <m:sty m:val="p"/>
-                      </m:rPr>
-                      <m:t>,</m:t>
-                    </m:r>
-                    <m:r>
-                      <m:t>0</m:t>
-                    </m:r>
-                    <m:r>
-                      <m:rPr>
-                        <m:nor/>
-                        <m:sty m:val="p"/>
-                      </m:rPr>
-                      <m:t> %</m:t>
-                    </m:r>
-                  </m:oMath>
-                  <w:r>
-                    <w:t xml:space="preserve">​</w:t>
-                  </w:r>
-                </w:p>
-              </w:tc>
-            </w:tr>
-            <w:tr>
-              <w:tc>
-                <w:tcPr/>
-                <w:p>
-                  <w:pPr>
-                    <w:pStyle w:val="Compact"/>
-                    <w:jc w:val="center"/>
-                    <w:jc w:val="center"/>
-                  </w:pPr>
-                  <w:r>
-                    <w:rPr>
-                      <w:b/>
-                      <w:bCs/>
-                    </w:rPr>
-                    <w:t xml:space="preserve">PY-14</w:t>
-                  </w:r>
-                </w:p>
-              </w:tc>
-              <w:tc>
-                <w:tcPr/>
-                <w:p>
-                  <w:pPr>
-                    <w:pStyle w:val="Compact"/>
-                    <w:jc w:val="left"/>
-                    <w:jc w:val="center"/>
-                  </w:pPr>
-                  <w:r>
-                    <w:t xml:space="preserve">Canindeyú</w:t>
-                  </w:r>
-                </w:p>
-              </w:tc>
-              <w:tc>
-                <w:tcPr/>
-                <w:p>
-                  <w:pPr>
-                    <w:pStyle w:val="Compact"/>
-                    <w:jc w:val="left"/>
-                    <w:jc w:val="center"/>
-                  </w:pPr>
-                  <w:r>
-                    <w:t xml:space="preserve">Oriental</w:t>
-                  </w:r>
-                </w:p>
-              </w:tc>
-              <w:tc>
-                <w:tcPr/>
-                <w:p>
-                  <w:pPr>
-                    <w:pStyle w:val="Compact"/>
-                    <w:jc w:val="center"/>
-                    <w:jc w:val="center"/>
-                  </w:pPr>
-                  <m:oMath>
-                    <m:r>
-                      <m:t>14.604</m:t>
-                    </m:r>
-                  </m:oMath>
-                  <w:r>
-                    <w:t xml:space="preserve">​</w:t>
-                  </w:r>
-                </w:p>
-              </w:tc>
-              <w:tc>
-                <w:tcPr/>
-                <w:p>
-                  <w:pPr>
-                    <w:pStyle w:val="Compact"/>
-                    <w:jc w:val="center"/>
-                    <w:jc w:val="center"/>
-                  </w:pPr>
-                  <m:oMath>
-                    <m:r>
-                      <m:t>0</m:t>
-                    </m:r>
-                    <m:r>
-                      <m:rPr>
-                        <m:sty m:val="p"/>
-                      </m:rPr>
-                      <m:t>,</m:t>
-                    </m:r>
-                    <m:r>
-                      <m:t>791</m:t>
-                    </m:r>
-                  </m:oMath>
-                  <w:r>
-                    <w:t xml:space="preserve">​</w:t>
-                  </w:r>
-                </w:p>
-              </w:tc>
-              <w:tc>
-                <w:tcPr/>
-                <w:p>
-                  <w:pPr>
-                    <w:pStyle w:val="Compact"/>
-                    <w:jc w:val="center"/>
-                    <w:jc w:val="center"/>
-                  </w:pPr>
-                  <m:oMath>
-                    <m:r>
-                      <m:t>0</m:t>
-                    </m:r>
-                    <m:r>
-                      <m:rPr>
-                        <m:sty m:val="p"/>
-                      </m:rPr>
-                      <m:t>,</m:t>
-                    </m:r>
-                    <m:r>
-                      <m:t>886</m:t>
-                    </m:r>
-                  </m:oMath>
-                  <w:r>
-                    <w:t xml:space="preserve">​</w:t>
-                  </w:r>
-                </w:p>
-              </w:tc>
-              <w:tc>
-                <w:tcPr/>
-                <w:p>
-                  <w:pPr>
-                    <w:pStyle w:val="Compact"/>
-                    <w:jc w:val="center"/>
-                    <w:jc w:val="center"/>
-                  </w:pPr>
-                  <m:oMath>
-                    <m:r>
-                      <m:t>100</m:t>
-                    </m:r>
-                    <m:r>
-                      <m:rPr>
-                        <m:sty m:val="p"/>
-                      </m:rPr>
-                      <m:t>,</m:t>
-                    </m:r>
-                    <m:r>
-                      <m:t>0</m:t>
-                    </m:r>
-                    <m:r>
-                      <m:rPr>
-                        <m:nor/>
-                        <m:sty m:val="p"/>
-                      </m:rPr>
-                      <m:t> %</m:t>
-                    </m:r>
-                  </m:oMath>
-                  <w:r>
-                    <w:t xml:space="preserve">​</w:t>
-                  </w:r>
-                </w:p>
-              </w:tc>
-            </w:tr>
-            <w:tr>
-              <w:tc>
-                <w:tcPr/>
-                <w:p>
-                  <w:pPr>
-                    <w:pStyle w:val="Compact"/>
-                    <w:jc w:val="center"/>
-                    <w:jc w:val="center"/>
-                  </w:pPr>
-                  <w:r>
-                    <w:rPr>
-                      <w:b/>
-                      <w:bCs/>
-                    </w:rPr>
-                    <w:t xml:space="preserve">PY-ASU</w:t>
-                  </w:r>
-                </w:p>
-              </w:tc>
-              <w:tc>
-                <w:tcPr/>
-                <w:p>
-                  <w:pPr>
-                    <w:pStyle w:val="Compact"/>
-                    <w:jc w:val="left"/>
-                    <w:jc w:val="center"/>
-                  </w:pPr>
-                  <w:r>
-                    <w:t xml:space="preserve">Asunción (Capital)</w:t>
-                  </w:r>
-                </w:p>
-              </w:tc>
-              <w:tc>
-                <w:tcPr/>
-                <w:p>
-                  <w:pPr>
-                    <w:pStyle w:val="Compact"/>
-                    <w:jc w:val="left"/>
-                    <w:jc w:val="center"/>
-                  </w:pPr>
-                  <w:r>
-                    <w:t xml:space="preserve">Oriental</w:t>
-                  </w:r>
-                </w:p>
-              </w:tc>
-              <w:tc>
-                <w:tcPr/>
-                <w:p>
-                  <w:pPr>
-                    <w:pStyle w:val="Compact"/>
-                    <w:jc w:val="center"/>
-                    <w:jc w:val="center"/>
-                  </w:pPr>
-                  <m:oMath>
-                    <m:r>
-                      <m:t>117</m:t>
-                    </m:r>
-                  </m:oMath>
-                  <w:r>
-                    <w:t xml:space="preserve">​</w:t>
-                  </w:r>
-                </w:p>
-              </w:tc>
-              <w:tc>
-                <w:tcPr/>
-                <w:p>
-                  <w:pPr>
-                    <w:pStyle w:val="Compact"/>
-                    <w:jc w:val="center"/>
-                    <w:jc w:val="center"/>
-                  </w:pPr>
-                  <m:oMath>
-                    <m:r>
-                      <m:t>0</m:t>
-                    </m:r>
-                    <m:r>
-                      <m:rPr>
-                        <m:sty m:val="p"/>
-                      </m:rPr>
-                      <m:t>,</m:t>
-                    </m:r>
-                    <m:r>
-                      <m:t>684</m:t>
-                    </m:r>
-                  </m:oMath>
-                  <w:r>
-                    <w:t xml:space="preserve">​</w:t>
-                  </w:r>
-                </w:p>
-              </w:tc>
-              <w:tc>
-                <w:tcPr/>
-                <w:p>
-                  <w:pPr>
-                    <w:pStyle w:val="Compact"/>
-                    <w:jc w:val="center"/>
-                    <w:jc w:val="center"/>
-                  </w:pPr>
-                  <w:r>
-                    <w:t xml:space="preserve">— (Sin focos)</w:t>
+                  <w:r>
+                    <w:t xml:space="preserve">— (Sin fuegos en test)</w:t>
+                  </w:r>
+                </w:p>
+              </w:tc>
+              <w:tc>
+                <w:tcPr/>
+                <w:p>
+                  <w:pPr>
+                    <w:pStyle w:val="Compact"/>
+                    <w:jc w:val="center"/>
+                    <w:jc w:val="center"/>
+                  </w:pPr>
+                  <w:r>
+                    <w:t xml:space="preserve">—</w:t>
                   </w:r>
                 </w:p>
               </w:tc>

</xml_diff>

<commit_message>
fig(manuscrito): rehace figuras críticas y graphical abstract
</commit_message>
<xml_diff>
--- a/material_suplementario.docx
+++ b/material_suplementario.docx
@@ -29272,7 +29272,7 @@
       <w:r>
         <w:drawing>
           <wp:inline>
-            <wp:extent cx="5067300" cy="1948961"/>
+            <wp:extent cx="5067300" cy="2021682"/>
             <wp:effectExtent b="0" l="0" r="0" t="0"/>
             <wp:docPr descr="" title="" id="33" name="Picture"/>
             <a:graphic>
@@ -29293,7 +29293,7 @@
                   <pic:spPr bwMode="auto">
                     <a:xfrm>
                       <a:off x="0" y="0"/>
-                      <a:ext cx="5067300" cy="1948961"/>
+                      <a:ext cx="5067300" cy="2021682"/>
                     </a:xfrm>
                     <a:prstGeom prst="rect">
                       <a:avLst/>
@@ -29327,7 +29327,44 @@
         <w:t xml:space="preserve"> </w:t>
       </w:r>
       <w:r>
-        <w:t xml:space="preserve">Cost-loss curves. The figure complements Table S14.</w:t>
+        <w:t xml:space="preserve">Cost-loss curves. The propagation panel uses the full</w:t>
+      </w:r>
+      <w:r>
+        <w:t xml:space="preserve"> </w:t>
+      </w:r>
+      <m:oMath>
+        <m:r>
+          <m:t>α</m:t>
+        </m:r>
+      </m:oMath>
+      <w:r>
+        <w:t xml:space="preserve"> </w:t>
+      </w:r>
+      <w:r>
+        <w:t xml:space="preserve">range; the ignition panel is truncated at</w:t>
+      </w:r>
+      <w:r>
+        <w:t xml:space="preserve"> </w:t>
+      </w:r>
+      <m:oMath>
+        <m:r>
+          <m:t>α</m:t>
+        </m:r>
+        <m:r>
+          <m:rPr>
+            <m:sty m:val="p"/>
+          </m:rPr>
+          <m:t>=</m:t>
+        </m:r>
+        <m:r>
+          <m:t>0.006</m:t>
+        </m:r>
+      </m:oMath>
+      <w:r>
+        <w:t xml:space="preserve"> </w:t>
+      </w:r>
+      <w:r>
+        <w:t xml:space="preserve">because the decision value is zero or negligible at larger values. The figure complements Table S14.</w:t>
       </w:r>
     </w:p>
     <w:bookmarkEnd w:id="35"/>

</xml_diff>

<commit_message>
docs(paper): mueve M1 al suplemento y separa el bundle operativo
</commit_message>
<xml_diff>
--- a/material_suplementario.docx
+++ b/material_suplementario.docx
@@ -108,7 +108,7 @@
         <w:t xml:space="preserve"> </w:t>
       </w:r>
       <w:r>
-        <w:t xml:space="preserve">— Notes S1–S3, Tables S1–S15 and Figures S1–S3.</w:t>
+        <w:t xml:space="preserve">— Notes S1–S3, Tables S1–S16 and Figures S1–S3.</w:t>
       </w:r>
       <w:r>
         <w:br/>
@@ -278,13 +278,13 @@
           <w:b/>
           <w:bCs/>
         </w:rPr>
-        <w:t xml:space="preserve">Tables S1–S15:</w:t>
+        <w:t xml:space="preserve">Tables S1–S16:</w:t>
       </w:r>
       <w:r>
         <w:t xml:space="preserve"> </w:t>
       </w:r>
       <w:r>
-        <w:t xml:space="preserve">variable dictionary, hyperparameters, departmental results, computational profile, conformal coverage, population evaluation, paired significance, spatial blocks, lead time, sampling, full benchmark, ablation, SHAP, cost-loss and data audit.</w:t>
+        <w:t xml:space="preserve">variable dictionary, hyperparameters, departmental results, computational profile, conformal coverage, population evaluation, paired significance, spatial blocks, lead time, sampling, full benchmark, ablation, M1 baseline, SHAP, cost-loss and data audit.</w:t>
       </w:r>
     </w:p>
     <w:p>
@@ -31639,7 +31639,7 @@
               <w:jc w:val="right"/>
             </w:pPr>
             <w:r>
-              <w:t xml:space="preserve">44</w:t>
+              <w:t xml:space="preserve">69</w:t>
             </w:r>
           </w:p>
         </w:tc>
@@ -31664,6 +31664,378 @@
         </w:tc>
       </w:tr>
     </w:tbl>
+    <w:p>
+      <w:pPr>
+        <w:pStyle w:val="BodyText"/>
+      </w:pPr>
+      <w:r>
+        <w:rPr>
+          <w:b/>
+          <w:bCs/>
+        </w:rPr>
+        <w:t xml:space="preserve">Table S16.</w:t>
+      </w:r>
+      <w:r>
+        <w:t xml:space="preserve"> </w:t>
+      </w:r>
+      <w:r>
+        <w:t xml:space="preserve">M1 biophysical baseline on 2023 validation.</w:t>
+      </w:r>
+    </w:p>
+    <w:tbl>
+      <w:tblPr>
+        <w:tblStyle w:val="Table"/>
+        <w:tblW w:type="pct" w:w="5000"/>
+        <w:tblLayout w:type="fixed"/>
+        <w:tblLook w:firstRow="1" w:lastRow="0" w:firstColumn="0" w:lastColumn="0" w:noHBand="0" w:noVBand="0" w:val="0020"/>
+      </w:tblPr>
+      <w:tblGrid>
+        <w:gridCol w:w="1584"/>
+        <w:gridCol w:w="1584"/>
+        <w:gridCol w:w="1584"/>
+        <w:gridCol w:w="1584"/>
+        <w:gridCol w:w="1584"/>
+      </w:tblGrid>
+      <w:tr>
+        <w:trPr>
+          <w:tblHeader w:val="on"/>
+        </w:trPr>
+        <w:tc>
+          <w:tcPr/>
+          <w:p>
+            <w:pPr>
+              <w:pStyle w:val="Compact"/>
+              <w:jc w:val="left"/>
+            </w:pPr>
+            <w:r>
+              <w:t xml:space="preserve">Region</w:t>
+            </w:r>
+          </w:p>
+        </w:tc>
+        <w:tc>
+          <w:tcPr/>
+          <w:p>
+            <w:pPr>
+              <w:pStyle w:val="Compact"/>
+              <w:jc w:val="left"/>
+            </w:pPr>
+            <w:r>
+              <w:t xml:space="preserve">Evaluation</w:t>
+            </w:r>
+          </w:p>
+        </w:tc>
+        <w:tc>
+          <w:tcPr/>
+          <w:p>
+            <w:pPr>
+              <w:pStyle w:val="Compact"/>
+              <w:jc w:val="right"/>
+            </w:pPr>
+            <w:r>
+              <w:t xml:space="preserve">ROC-AUC</w:t>
+            </w:r>
+          </w:p>
+        </w:tc>
+        <w:tc>
+          <w:tcPr/>
+          <w:p>
+            <w:pPr>
+              <w:pStyle w:val="Compact"/>
+              <w:jc w:val="right"/>
+            </w:pPr>
+            <w:r>
+              <w:t xml:space="preserve">PR-AUC</w:t>
+            </w:r>
+          </w:p>
+        </w:tc>
+        <w:tc>
+          <w:tcPr/>
+          <w:p>
+            <w:pPr>
+              <w:pStyle w:val="Compact"/>
+              <w:jc w:val="right"/>
+            </w:pPr>
+            <w:r>
+              <w:t xml:space="preserve">F0.5</w:t>
+            </w:r>
+          </w:p>
+        </w:tc>
+      </w:tr>
+      <w:tr>
+        <w:tc>
+          <w:tcPr/>
+          <w:p>
+            <w:pPr>
+              <w:pStyle w:val="Compact"/>
+              <w:jc w:val="left"/>
+            </w:pPr>
+            <w:r>
+              <w:t xml:space="preserve">Chaco</w:t>
+            </w:r>
+          </w:p>
+        </w:tc>
+        <w:tc>
+          <w:tcPr/>
+          <w:p>
+            <w:pPr>
+              <w:pStyle w:val="Compact"/>
+              <w:jc w:val="left"/>
+            </w:pPr>
+            <w:r>
+              <w:t xml:space="preserve">Temporal 2023, all cells</w:t>
+            </w:r>
+          </w:p>
+        </w:tc>
+        <w:tc>
+          <w:tcPr/>
+          <w:p>
+            <w:pPr>
+              <w:pStyle w:val="Compact"/>
+              <w:jc w:val="right"/>
+            </w:pPr>
+            <w:r>
+              <w:t xml:space="preserve">0.6354</w:t>
+            </w:r>
+          </w:p>
+        </w:tc>
+        <w:tc>
+          <w:tcPr/>
+          <w:p>
+            <w:pPr>
+              <w:pStyle w:val="Compact"/>
+              <w:jc w:val="right"/>
+            </w:pPr>
+            <w:r>
+              <w:t xml:space="preserve">0.1480</w:t>
+            </w:r>
+          </w:p>
+        </w:tc>
+        <w:tc>
+          <w:tcPr/>
+          <w:p>
+            <w:pPr>
+              <w:pStyle w:val="Compact"/>
+              <w:jc w:val="right"/>
+            </w:pPr>
+            <w:r>
+              <w:t xml:space="preserve">0.1762</w:t>
+            </w:r>
+          </w:p>
+        </w:tc>
+      </w:tr>
+      <w:tr>
+        <w:tc>
+          <w:tcPr/>
+          <w:p>
+            <w:pPr>
+              <w:pStyle w:val="Compact"/>
+              <w:jc w:val="left"/>
+            </w:pPr>
+            <w:r>
+              <w:t xml:space="preserve">Oriental</w:t>
+            </w:r>
+          </w:p>
+        </w:tc>
+        <w:tc>
+          <w:tcPr/>
+          <w:p>
+            <w:pPr>
+              <w:pStyle w:val="Compact"/>
+              <w:jc w:val="left"/>
+            </w:pPr>
+            <w:r>
+              <w:t xml:space="preserve">Temporal 2023, all cells</w:t>
+            </w:r>
+          </w:p>
+        </w:tc>
+        <w:tc>
+          <w:tcPr/>
+          <w:p>
+            <w:pPr>
+              <w:pStyle w:val="Compact"/>
+              <w:jc w:val="right"/>
+            </w:pPr>
+            <w:r>
+              <w:t xml:space="preserve">0.7041</w:t>
+            </w:r>
+          </w:p>
+        </w:tc>
+        <w:tc>
+          <w:tcPr/>
+          <w:p>
+            <w:pPr>
+              <w:pStyle w:val="Compact"/>
+              <w:jc w:val="right"/>
+            </w:pPr>
+            <w:r>
+              <w:t xml:space="preserve">0.1818</w:t>
+            </w:r>
+          </w:p>
+        </w:tc>
+        <w:tc>
+          <w:tcPr/>
+          <w:p>
+            <w:pPr>
+              <w:pStyle w:val="Compact"/>
+              <w:jc w:val="right"/>
+            </w:pPr>
+            <w:r>
+              <w:t xml:space="preserve">0.2301</w:t>
+            </w:r>
+          </w:p>
+        </w:tc>
+      </w:tr>
+      <w:tr>
+        <w:tc>
+          <w:tcPr/>
+          <w:p>
+            <w:pPr>
+              <w:pStyle w:val="Compact"/>
+              <w:jc w:val="left"/>
+            </w:pPr>
+            <w:r>
+              <w:t xml:space="preserve">Chaco</w:t>
+            </w:r>
+          </w:p>
+        </w:tc>
+        <w:tc>
+          <w:tcPr/>
+          <w:p>
+            <w:pPr>
+              <w:pStyle w:val="Compact"/>
+              <w:jc w:val="left"/>
+            </w:pPr>
+            <w:r>
+              <w:t xml:space="preserve">Cells without history (</w:t>
+            </w:r>
+            <w:r>
+              <w:rPr>
+                <w:rStyle w:val="VerbatimChar"/>
+              </w:rPr>
+              <w:t xml:space="preserve">freq_hist_1km = 0</w:t>
+            </w:r>
+            <w:r>
+              <w:t xml:space="preserve">)</w:t>
+            </w:r>
+          </w:p>
+        </w:tc>
+        <w:tc>
+          <w:tcPr/>
+          <w:p>
+            <w:pPr>
+              <w:pStyle w:val="Compact"/>
+              <w:jc w:val="right"/>
+            </w:pPr>
+            <w:r>
+              <w:t xml:space="preserve">0.6650</w:t>
+            </w:r>
+          </w:p>
+        </w:tc>
+        <w:tc>
+          <w:tcPr/>
+          <w:p>
+            <w:pPr>
+              <w:pStyle w:val="Compact"/>
+              <w:jc w:val="right"/>
+            </w:pPr>
+            <w:r>
+              <w:t xml:space="preserve">0.0841</w:t>
+            </w:r>
+          </w:p>
+        </w:tc>
+        <w:tc>
+          <w:tcPr/>
+          <w:p>
+            <w:pPr>
+              <w:pStyle w:val="Compact"/>
+              <w:jc w:val="right"/>
+            </w:pPr>
+            <w:r>
+              <w:t xml:space="preserve">—</w:t>
+            </w:r>
+          </w:p>
+        </w:tc>
+      </w:tr>
+      <w:tr>
+        <w:tc>
+          <w:tcPr/>
+          <w:p>
+            <w:pPr>
+              <w:pStyle w:val="Compact"/>
+              <w:jc w:val="left"/>
+            </w:pPr>
+            <w:r>
+              <w:t xml:space="preserve">Oriental</w:t>
+            </w:r>
+          </w:p>
+        </w:tc>
+        <w:tc>
+          <w:tcPr/>
+          <w:p>
+            <w:pPr>
+              <w:pStyle w:val="Compact"/>
+              <w:jc w:val="left"/>
+            </w:pPr>
+            <w:r>
+              <w:t xml:space="preserve">Cells without history (</w:t>
+            </w:r>
+            <w:r>
+              <w:rPr>
+                <w:rStyle w:val="VerbatimChar"/>
+              </w:rPr>
+              <w:t xml:space="preserve">freq_hist_1km = 0</w:t>
+            </w:r>
+            <w:r>
+              <w:t xml:space="preserve">)</w:t>
+            </w:r>
+          </w:p>
+        </w:tc>
+        <w:tc>
+          <w:tcPr/>
+          <w:p>
+            <w:pPr>
+              <w:pStyle w:val="Compact"/>
+              <w:jc w:val="right"/>
+            </w:pPr>
+            <w:r>
+              <w:t xml:space="preserve">0.7018</w:t>
+            </w:r>
+          </w:p>
+        </w:tc>
+        <w:tc>
+          <w:tcPr/>
+          <w:p>
+            <w:pPr>
+              <w:pStyle w:val="Compact"/>
+              <w:jc w:val="right"/>
+            </w:pPr>
+            <w:r>
+              <w:t xml:space="preserve">0.0740</w:t>
+            </w:r>
+          </w:p>
+        </w:tc>
+        <w:tc>
+          <w:tcPr/>
+          <w:p>
+            <w:pPr>
+              <w:pStyle w:val="Compact"/>
+              <w:jc w:val="right"/>
+            </w:pPr>
+            <w:r>
+              <w:t xml:space="preserve">—</w:t>
+            </w:r>
+          </w:p>
+        </w:tc>
+      </w:tr>
+    </w:tbl>
+    <w:p>
+      <w:pPr>
+        <w:pStyle w:val="BodyText"/>
+      </w:pPr>
+      <w:r>
+        <w:t xml:space="preserve">M1 is a diagnostic biophysical baseline and was not used operationally. Spatial block results are in Table S8, lead-time results in Table S9, and the retrospective 2024–2025 ablation in Table S12.</w:t>
+      </w:r>
+    </w:p>
     <w:bookmarkEnd w:id="24"/>
     <w:bookmarkStart w:id="25" w:name="data-availability"/>
     <w:p>

</xml_diff>

<commit_message>
docs(paper): corrige la descripción del combustible anual
</commit_message>
<xml_diff>
--- a/material_suplementario.docx
+++ b/material_suplementario.docx
@@ -2147,7 +2147,7 @@
         <w:pStyle w:val="FirstParagraph"/>
       </w:pPr>
       <w:r>
-        <w:t xml:space="preserve">The 1-km² grid is the modeling unit. Fuel fractions come from MapBiomas Collection 2 (2023)</w:t>
+        <w:t xml:space="preserve">The 1-km² grid is the modeling unit. Fuel fractions come from annual MapBiomas Collection 2 maps (2017–2023), joined to each row with the prior-year map; 2024 uses 2023 with lag 1 and 2025 reuses 2023 with lag 2</w:t>
       </w:r>
       <w:r>
         <w:t xml:space="preserve"> </w:t>
@@ -2814,40 +2814,40 @@
               <w:pStyle w:val="Compact"/>
             </w:pPr>
             <w:r>
-              <w:t xml:space="preserve">ffmc</w:t>
-            </w:r>
-          </w:p>
-        </w:tc>
-        <w:tc>
-          <w:tcPr/>
-          <w:p>
-            <w:pPr>
-              <w:pStyle w:val="Compact"/>
-            </w:pPr>
-            <w:r>
-              <w:t xml:space="preserve">Fine Fuel Moisture Code</w:t>
-            </w:r>
-          </w:p>
-        </w:tc>
-        <w:tc>
-          <w:tcPr/>
-          <w:p>
-            <w:pPr>
-              <w:pStyle w:val="Compact"/>
-            </w:pPr>
-            <w:r>
-              <w:t xml:space="preserve">FWI derived</w:t>
-            </w:r>
-          </w:p>
-        </w:tc>
-        <w:tc>
-          <w:tcPr/>
-          <w:p>
-            <w:pPr>
-              <w:pStyle w:val="Compact"/>
-            </w:pPr>
-            <w:r>
-              <w:t xml:space="preserve">Ignition and propagation</w:t>
+              <w:t xml:space="preserve">swvl1_m3m3</w:t>
+            </w:r>
+          </w:p>
+        </w:tc>
+        <w:tc>
+          <w:tcPr/>
+          <w:p>
+            <w:pPr>
+              <w:pStyle w:val="Compact"/>
+            </w:pPr>
+            <w:r>
+              <w:t xml:space="preserve">Topsoil volumetric water content, 0–7 cm (m³/m³)</w:t>
+            </w:r>
+          </w:p>
+        </w:tc>
+        <w:tc>
+          <w:tcPr/>
+          <w:p>
+            <w:pPr>
+              <w:pStyle w:val="Compact"/>
+            </w:pPr>
+            <w:r>
+              <w:t xml:space="preserve">ERA5-Land</w:t>
+            </w:r>
+          </w:p>
+        </w:tc>
+        <w:tc>
+          <w:tcPr/>
+          <w:p>
+            <w:pPr>
+              <w:pStyle w:val="Compact"/>
+            </w:pPr>
+            <w:r>
+              <w:t xml:space="preserve">M1, M2, M3 and propagation</w:t>
             </w:r>
           </w:p>
         </w:tc>
@@ -2860,40 +2860,40 @@
               <w:pStyle w:val="Compact"/>
             </w:pPr>
             <w:r>
-              <w:t xml:space="preserve">isi</w:t>
-            </w:r>
-          </w:p>
-        </w:tc>
-        <w:tc>
-          <w:tcPr/>
-          <w:p>
-            <w:pPr>
-              <w:pStyle w:val="Compact"/>
-            </w:pPr>
-            <w:r>
-              <w:t xml:space="preserve">Initial Spread Index</w:t>
-            </w:r>
-          </w:p>
-        </w:tc>
-        <w:tc>
-          <w:tcPr/>
-          <w:p>
-            <w:pPr>
-              <w:pStyle w:val="Compact"/>
-            </w:pPr>
-            <w:r>
-              <w:t xml:space="preserve">FWI derived</w:t>
-            </w:r>
-          </w:p>
-        </w:tc>
-        <w:tc>
-          <w:tcPr/>
-          <w:p>
-            <w:pPr>
-              <w:pStyle w:val="Compact"/>
-            </w:pPr>
-            <w:r>
-              <w:t xml:space="preserve">Ignition and propagation</w:t>
+              <w:t xml:space="preserve">fdd_heladas_60d</w:t>
+            </w:r>
+          </w:p>
+        </w:tc>
+        <w:tc>
+          <w:tcPr/>
+          <w:p>
+            <w:pPr>
+              <w:pStyle w:val="Compact"/>
+            </w:pPr>
+            <w:r>
+              <w:t xml:space="preserve">Antecedent frost severity over 60 days (°C-days)</w:t>
+            </w:r>
+          </w:p>
+        </w:tc>
+        <w:tc>
+          <w:tcPr/>
+          <w:p>
+            <w:pPr>
+              <w:pStyle w:val="Compact"/>
+            </w:pPr>
+            <w:r>
+              <w:t xml:space="preserve">ERA5-Land; derived</w:t>
+            </w:r>
+          </w:p>
+        </w:tc>
+        <w:tc>
+          <w:tcPr/>
+          <w:p>
+            <w:pPr>
+              <w:pStyle w:val="Compact"/>
+            </w:pPr>
+            <w:r>
+              <w:t xml:space="preserve">M1, M2, M3 and propagation</w:t>
             </w:r>
           </w:p>
         </w:tc>
@@ -2906,40 +2906,40 @@
               <w:pStyle w:val="Compact"/>
             </w:pPr>
             <w:r>
-              <w:t xml:space="preserve">dia_semana</w:t>
-            </w:r>
-          </w:p>
-        </w:tc>
-        <w:tc>
-          <w:tcPr/>
-          <w:p>
-            <w:pPr>
-              <w:pStyle w:val="Compact"/>
-            </w:pPr>
-            <w:r>
-              <w:t xml:space="preserve">Civil weekday (0 = Monday … 6 = Sunday)</w:t>
-            </w:r>
-          </w:p>
-        </w:tc>
-        <w:tc>
-          <w:tcPr/>
-          <w:p>
-            <w:pPr>
-              <w:pStyle w:val="Compact"/>
-            </w:pPr>
-            <w:r>
-              <w:t xml:space="preserve">Calendar</w:t>
-            </w:r>
-          </w:p>
-        </w:tc>
-        <w:tc>
-          <w:tcPr/>
-          <w:p>
-            <w:pPr>
-              <w:pStyle w:val="Compact"/>
-            </w:pPr>
-            <w:r>
-              <w:t xml:space="preserve">Ignition and propagation</w:t>
+              <w:t xml:space="preserve">deficit_hidro_60d</w:t>
+            </w:r>
+          </w:p>
+        </w:tc>
+        <w:tc>
+          <w:tcPr/>
+          <w:p>
+            <w:pPr>
+              <w:pStyle w:val="Compact"/>
+            </w:pPr>
+            <w:r>
+              <w:t xml:space="preserve">Antecedent water deficit over 60 days (mm)</w:t>
+            </w:r>
+          </w:p>
+        </w:tc>
+        <w:tc>
+          <w:tcPr/>
+          <w:p>
+            <w:pPr>
+              <w:pStyle w:val="Compact"/>
+            </w:pPr>
+            <w:r>
+              <w:t xml:space="preserve">ERA5-Land; derived</w:t>
+            </w:r>
+          </w:p>
+        </w:tc>
+        <w:tc>
+          <w:tcPr/>
+          <w:p>
+            <w:pPr>
+              <w:pStyle w:val="Compact"/>
+            </w:pPr>
+            <w:r>
+              <w:t xml:space="preserve">M1, M2, M3 and propagation</w:t>
             </w:r>
           </w:p>
         </w:tc>
@@ -2952,40 +2952,40 @@
               <w:pStyle w:val="Compact"/>
             </w:pPr>
             <w:r>
-              <w:t xml:space="preserve">es_fin_de_semana</w:t>
-            </w:r>
-          </w:p>
-        </w:tc>
-        <w:tc>
-          <w:tcPr/>
-          <w:p>
-            <w:pPr>
-              <w:pStyle w:val="Compact"/>
-            </w:pPr>
-            <w:r>
-              <w:t xml:space="preserve">Weekend indicator (Saturday/Sunday)</w:t>
-            </w:r>
-          </w:p>
-        </w:tc>
-        <w:tc>
-          <w:tcPr/>
-          <w:p>
-            <w:pPr>
-              <w:pStyle w:val="Compact"/>
-            </w:pPr>
-            <w:r>
-              <w:t xml:space="preserve">Calendar</w:t>
-            </w:r>
-          </w:p>
-        </w:tc>
-        <w:tc>
-          <w:tcPr/>
-          <w:p>
-            <w:pPr>
-              <w:pStyle w:val="Compact"/>
-            </w:pPr>
-            <w:r>
-              <w:t xml:space="preserve">Ignition and propagation</w:t>
+              <w:t xml:space="preserve">riesgo_estero_seco</w:t>
+            </w:r>
+          </w:p>
+        </w:tc>
+        <w:tc>
+          <w:tcPr/>
+          <w:p>
+            <w:pPr>
+              <w:pStyle w:val="Compact"/>
+            </w:pPr>
+            <w:r>
+              <w:t xml:space="preserve">Dry estero risk (wetland × 60-day deficit)</w:t>
+            </w:r>
+          </w:p>
+        </w:tc>
+        <w:tc>
+          <w:tcPr/>
+          <w:p>
+            <w:pPr>
+              <w:pStyle w:val="Compact"/>
+            </w:pPr>
+            <w:r>
+              <w:t xml:space="preserve">Derived</w:t>
+            </w:r>
+          </w:p>
+        </w:tc>
+        <w:tc>
+          <w:tcPr/>
+          <w:p>
+            <w:pPr>
+              <w:pStyle w:val="Compact"/>
+            </w:pPr>
+            <w:r>
+              <w:t xml:space="preserve">M1, M2, M3 and propagation</w:t>
             </w:r>
           </w:p>
         </w:tc>
@@ -2998,40 +2998,40 @@
               <w:pStyle w:val="Compact"/>
             </w:pPr>
             <w:r>
-              <w:t xml:space="preserve">mes</w:t>
-            </w:r>
-          </w:p>
-        </w:tc>
-        <w:tc>
-          <w:tcPr/>
-          <w:p>
-            <w:pPr>
-              <w:pStyle w:val="Compact"/>
-            </w:pPr>
-            <w:r>
-              <w:t xml:space="preserve">Month of year (1–12)</w:t>
-            </w:r>
-          </w:p>
-        </w:tc>
-        <w:tc>
-          <w:tcPr/>
-          <w:p>
-            <w:pPr>
-              <w:pStyle w:val="Compact"/>
-            </w:pPr>
-            <w:r>
-              <w:t xml:space="preserve">Calendar</w:t>
-            </w:r>
-          </w:p>
-        </w:tc>
-        <w:tc>
-          <w:tcPr/>
-          <w:p>
-            <w:pPr>
-              <w:pStyle w:val="Compact"/>
-            </w:pPr>
-            <w:r>
-              <w:t xml:space="preserve">Ignition and propagation</w:t>
+              <w:t xml:space="preserve">combustible_curado_helada</w:t>
+            </w:r>
+          </w:p>
+        </w:tc>
+        <w:tc>
+          <w:tcPr/>
+          <w:p>
+            <w:pPr>
+              <w:pStyle w:val="Compact"/>
+            </w:pPr>
+            <w:r>
+              <w:t xml:space="preserve">Frost-cured pasture and grassland fuel</w:t>
+            </w:r>
+          </w:p>
+        </w:tc>
+        <w:tc>
+          <w:tcPr/>
+          <w:p>
+            <w:pPr>
+              <w:pStyle w:val="Compact"/>
+            </w:pPr>
+            <w:r>
+              <w:t xml:space="preserve">Derived</w:t>
+            </w:r>
+          </w:p>
+        </w:tc>
+        <w:tc>
+          <w:tcPr/>
+          <w:p>
+            <w:pPr>
+              <w:pStyle w:val="Compact"/>
+            </w:pPr>
+            <w:r>
+              <w:t xml:space="preserve">M1, M2, M3 and propagation</w:t>
             </w:r>
           </w:p>
         </w:tc>
@@ -3044,29 +3044,29 @@
               <w:pStyle w:val="Compact"/>
             </w:pPr>
             <w:r>
-              <w:t xml:space="preserve">dia_del_anio</w:t>
-            </w:r>
-          </w:p>
-        </w:tc>
-        <w:tc>
-          <w:tcPr/>
-          <w:p>
-            <w:pPr>
-              <w:pStyle w:val="Compact"/>
-            </w:pPr>
-            <w:r>
-              <w:t xml:space="preserve">Ordinal day of year (1–366)</w:t>
-            </w:r>
-          </w:p>
-        </w:tc>
-        <w:tc>
-          <w:tcPr/>
-          <w:p>
-            <w:pPr>
-              <w:pStyle w:val="Compact"/>
-            </w:pPr>
-            <w:r>
-              <w:t xml:space="preserve">Calendar</w:t>
+              <w:t xml:space="preserve">ffmc</w:t>
+            </w:r>
+          </w:p>
+        </w:tc>
+        <w:tc>
+          <w:tcPr/>
+          <w:p>
+            <w:pPr>
+              <w:pStyle w:val="Compact"/>
+            </w:pPr>
+            <w:r>
+              <w:t xml:space="preserve">Fine Fuel Moisture Code</w:t>
+            </w:r>
+          </w:p>
+        </w:tc>
+        <w:tc>
+          <w:tcPr/>
+          <w:p>
+            <w:pPr>
+              <w:pStyle w:val="Compact"/>
+            </w:pPr>
+            <w:r>
+              <w:t xml:space="preserve">FWI derived</w:t>
             </w:r>
           </w:p>
         </w:tc>
@@ -3090,29 +3090,29 @@
               <w:pStyle w:val="Compact"/>
             </w:pPr>
             <w:r>
-              <w:t xml:space="preserve">pct_pastura</w:t>
-            </w:r>
-          </w:p>
-        </w:tc>
-        <w:tc>
-          <w:tcPr/>
-          <w:p>
-            <w:pPr>
-              <w:pStyle w:val="Compact"/>
-            </w:pPr>
-            <w:r>
-              <w:t xml:space="preserve">Cultivated pasture fraction (0–100 %)</w:t>
-            </w:r>
-          </w:p>
-        </w:tc>
-        <w:tc>
-          <w:tcPr/>
-          <w:p>
-            <w:pPr>
-              <w:pStyle w:val="Compact"/>
-            </w:pPr>
-            <w:r>
-              <w:t xml:space="preserve">MapBiomas C2 2023</w:t>
+              <w:t xml:space="preserve">isi</w:t>
+            </w:r>
+          </w:p>
+        </w:tc>
+        <w:tc>
+          <w:tcPr/>
+          <w:p>
+            <w:pPr>
+              <w:pStyle w:val="Compact"/>
+            </w:pPr>
+            <w:r>
+              <w:t xml:space="preserve">Initial Spread Index</w:t>
+            </w:r>
+          </w:p>
+        </w:tc>
+        <w:tc>
+          <w:tcPr/>
+          <w:p>
+            <w:pPr>
+              <w:pStyle w:val="Compact"/>
+            </w:pPr>
+            <w:r>
+              <w:t xml:space="preserve">FWI derived</w:t>
             </w:r>
           </w:p>
         </w:tc>
@@ -3136,29 +3136,29 @@
               <w:pStyle w:val="Compact"/>
             </w:pPr>
             <w:r>
-              <w:t xml:space="preserve">pct_sabana_pastizal</w:t>
-            </w:r>
-          </w:p>
-        </w:tc>
-        <w:tc>
-          <w:tcPr/>
-          <w:p>
-            <w:pPr>
-              <w:pStyle w:val="Compact"/>
-            </w:pPr>
-            <w:r>
-              <w:t xml:space="preserve">Savanna and natural grassland fraction (0–100 %)</w:t>
-            </w:r>
-          </w:p>
-        </w:tc>
-        <w:tc>
-          <w:tcPr/>
-          <w:p>
-            <w:pPr>
-              <w:pStyle w:val="Compact"/>
-            </w:pPr>
-            <w:r>
-              <w:t xml:space="preserve">MapBiomas C2 2023</w:t>
+              <w:t xml:space="preserve">dia_semana</w:t>
+            </w:r>
+          </w:p>
+        </w:tc>
+        <w:tc>
+          <w:tcPr/>
+          <w:p>
+            <w:pPr>
+              <w:pStyle w:val="Compact"/>
+            </w:pPr>
+            <w:r>
+              <w:t xml:space="preserve">Civil weekday (0 = Monday … 6 = Sunday)</w:t>
+            </w:r>
+          </w:p>
+        </w:tc>
+        <w:tc>
+          <w:tcPr/>
+          <w:p>
+            <w:pPr>
+              <w:pStyle w:val="Compact"/>
+            </w:pPr>
+            <w:r>
+              <w:t xml:space="preserve">Calendar</w:t>
             </w:r>
           </w:p>
         </w:tc>
@@ -3182,29 +3182,29 @@
               <w:pStyle w:val="Compact"/>
             </w:pPr>
             <w:r>
-              <w:t xml:space="preserve">pct_humedal_palmar</w:t>
-            </w:r>
-          </w:p>
-        </w:tc>
-        <w:tc>
-          <w:tcPr/>
-          <w:p>
-            <w:pPr>
-              <w:pStyle w:val="Compact"/>
-            </w:pPr>
-            <w:r>
-              <w:t xml:space="preserve">Wetland and palm swamp fraction (0–100 %)</w:t>
-            </w:r>
-          </w:p>
-        </w:tc>
-        <w:tc>
-          <w:tcPr/>
-          <w:p>
-            <w:pPr>
-              <w:pStyle w:val="Compact"/>
-            </w:pPr>
-            <w:r>
-              <w:t xml:space="preserve">MapBiomas C2 2023</w:t>
+              <w:t xml:space="preserve">es_fin_de_semana</w:t>
+            </w:r>
+          </w:p>
+        </w:tc>
+        <w:tc>
+          <w:tcPr/>
+          <w:p>
+            <w:pPr>
+              <w:pStyle w:val="Compact"/>
+            </w:pPr>
+            <w:r>
+              <w:t xml:space="preserve">Weekend indicator (Saturday/Sunday)</w:t>
+            </w:r>
+          </w:p>
+        </w:tc>
+        <w:tc>
+          <w:tcPr/>
+          <w:p>
+            <w:pPr>
+              <w:pStyle w:val="Compact"/>
+            </w:pPr>
+            <w:r>
+              <w:t xml:space="preserve">Calendar</w:t>
             </w:r>
           </w:p>
         </w:tc>
@@ -3228,40 +3228,40 @@
               <w:pStyle w:val="Compact"/>
             </w:pPr>
             <w:r>
-              <w:t xml:space="preserve">pct_bosque_seco</w:t>
-            </w:r>
-          </w:p>
-        </w:tc>
-        <w:tc>
-          <w:tcPr/>
-          <w:p>
-            <w:pPr>
-              <w:pStyle w:val="Compact"/>
-            </w:pPr>
-            <w:r>
-              <w:t xml:space="preserve">Dry Chaco forest fraction (0–100 %)</w:t>
-            </w:r>
-          </w:p>
-        </w:tc>
-        <w:tc>
-          <w:tcPr/>
-          <w:p>
-            <w:pPr>
-              <w:pStyle w:val="Compact"/>
-            </w:pPr>
-            <w:r>
-              <w:t xml:space="preserve">MapBiomas C2 2023</w:t>
-            </w:r>
-          </w:p>
-        </w:tc>
-        <w:tc>
-          <w:tcPr/>
-          <w:p>
-            <w:pPr>
-              <w:pStyle w:val="Compact"/>
-            </w:pPr>
-            <w:r>
-              <w:t xml:space="preserve">Ignition and propagation (Chaco)</w:t>
+              <w:t xml:space="preserve">mes</w:t>
+            </w:r>
+          </w:p>
+        </w:tc>
+        <w:tc>
+          <w:tcPr/>
+          <w:p>
+            <w:pPr>
+              <w:pStyle w:val="Compact"/>
+            </w:pPr>
+            <w:r>
+              <w:t xml:space="preserve">Month of year (1–12)</w:t>
+            </w:r>
+          </w:p>
+        </w:tc>
+        <w:tc>
+          <w:tcPr/>
+          <w:p>
+            <w:pPr>
+              <w:pStyle w:val="Compact"/>
+            </w:pPr>
+            <w:r>
+              <w:t xml:space="preserve">Calendar</w:t>
+            </w:r>
+          </w:p>
+        </w:tc>
+        <w:tc>
+          <w:tcPr/>
+          <w:p>
+            <w:pPr>
+              <w:pStyle w:val="Compact"/>
+            </w:pPr>
+            <w:r>
+              <w:t xml:space="preserve">Ignition and propagation</w:t>
             </w:r>
           </w:p>
         </w:tc>
@@ -3274,40 +3274,40 @@
               <w:pStyle w:val="Compact"/>
             </w:pPr>
             <w:r>
-              <w:t xml:space="preserve">pct_bosque_humedo</w:t>
-            </w:r>
-          </w:p>
-        </w:tc>
-        <w:tc>
-          <w:tcPr/>
-          <w:p>
-            <w:pPr>
-              <w:pStyle w:val="Compact"/>
-            </w:pPr>
-            <w:r>
-              <w:t xml:space="preserve">Atlantic humid forest fraction (0–100 %)</w:t>
-            </w:r>
-          </w:p>
-        </w:tc>
-        <w:tc>
-          <w:tcPr/>
-          <w:p>
-            <w:pPr>
-              <w:pStyle w:val="Compact"/>
-            </w:pPr>
-            <w:r>
-              <w:t xml:space="preserve">MapBiomas C2 2023</w:t>
-            </w:r>
-          </w:p>
-        </w:tc>
-        <w:tc>
-          <w:tcPr/>
-          <w:p>
-            <w:pPr>
-              <w:pStyle w:val="Compact"/>
-            </w:pPr>
-            <w:r>
-              <w:t xml:space="preserve">Ignition and propagation (Oriental)</w:t>
+              <w:t xml:space="preserve">dia_del_anio</w:t>
+            </w:r>
+          </w:p>
+        </w:tc>
+        <w:tc>
+          <w:tcPr/>
+          <w:p>
+            <w:pPr>
+              <w:pStyle w:val="Compact"/>
+            </w:pPr>
+            <w:r>
+              <w:t xml:space="preserve">Ordinal day of year (1–366)</w:t>
+            </w:r>
+          </w:p>
+        </w:tc>
+        <w:tc>
+          <w:tcPr/>
+          <w:p>
+            <w:pPr>
+              <w:pStyle w:val="Compact"/>
+            </w:pPr>
+            <w:r>
+              <w:t xml:space="preserve">Calendar</w:t>
+            </w:r>
+          </w:p>
+        </w:tc>
+        <w:tc>
+          <w:tcPr/>
+          <w:p>
+            <w:pPr>
+              <w:pStyle w:val="Compact"/>
+            </w:pPr>
+            <w:r>
+              <w:t xml:space="preserve">Ignition and propagation</w:t>
             </w:r>
           </w:p>
         </w:tc>
@@ -3320,40 +3320,40 @@
               <w:pStyle w:val="Compact"/>
             </w:pPr>
             <w:r>
-              <w:t xml:space="preserve">indice_ecotono</w:t>
-            </w:r>
-          </w:p>
-        </w:tc>
-        <w:tc>
-          <w:tcPr/>
-          <w:p>
-            <w:pPr>
-              <w:pStyle w:val="Compact"/>
-            </w:pPr>
-            <w:r>
-              <w:t xml:space="preserve">Forest–pasture edge disruption index</w:t>
-            </w:r>
-          </w:p>
-        </w:tc>
-        <w:tc>
-          <w:tcPr/>
-          <w:p>
-            <w:pPr>
-              <w:pStyle w:val="Compact"/>
-            </w:pPr>
-            <w:r>
-              <w:t xml:space="preserve">Derived</w:t>
-            </w:r>
-          </w:p>
-        </w:tc>
-        <w:tc>
-          <w:tcPr/>
-          <w:p>
-            <w:pPr>
-              <w:pStyle w:val="Compact"/>
-            </w:pPr>
-            <w:r>
-              <w:t xml:space="preserve">Ignition and propagation</w:t>
+              <w:t xml:space="preserve">pct_pastura</w:t>
+            </w:r>
+          </w:p>
+        </w:tc>
+        <w:tc>
+          <w:tcPr/>
+          <w:p>
+            <w:pPr>
+              <w:pStyle w:val="Compact"/>
+            </w:pPr>
+            <w:r>
+              <w:t xml:space="preserve">Total pasture, annual agriculture and forest plantation (0–100 %)</w:t>
+            </w:r>
+          </w:p>
+        </w:tc>
+        <w:tc>
+          <w:tcPr/>
+          <w:p>
+            <w:pPr>
+              <w:pStyle w:val="Compact"/>
+            </w:pPr>
+            <w:r>
+              <w:t xml:space="preserve">Derived from MapBiomas C2 annual (Y-1)</w:t>
+            </w:r>
+          </w:p>
+        </w:tc>
+        <w:tc>
+          <w:tcPr/>
+          <w:p>
+            <w:pPr>
+              <w:pStyle w:val="Compact"/>
+            </w:pPr>
+            <w:r>
+              <w:t xml:space="preserve">INPE benchmark only; not a model feature</w:t>
             </w:r>
           </w:p>
         </w:tc>
@@ -3366,40 +3366,40 @@
               <w:pStyle w:val="Compact"/>
             </w:pPr>
             <w:r>
-              <w:t xml:space="preserve">dist_foco_hist_km</w:t>
-            </w:r>
-          </w:p>
-        </w:tc>
-        <w:tc>
-          <w:tcPr/>
-          <w:p>
-            <w:pPr>
-              <w:pStyle w:val="Compact"/>
-            </w:pPr>
-            <w:r>
-              <w:t xml:space="preserve">Minimum distance to training fires (km)</w:t>
-            </w:r>
-          </w:p>
-        </w:tc>
-        <w:tc>
-          <w:tcPr/>
-          <w:p>
-            <w:pPr>
-              <w:pStyle w:val="Compact"/>
-            </w:pPr>
-            <w:r>
-              <w:t xml:space="preserve">FIRMS, causal 3-year window</w:t>
-            </w:r>
-          </w:p>
-        </w:tc>
-        <w:tc>
-          <w:tcPr/>
-          <w:p>
-            <w:pPr>
-              <w:pStyle w:val="Compact"/>
-            </w:pPr>
-            <w:r>
-              <w:t xml:space="preserve">Ignition and propagation</w:t>
+              <w:t xml:space="preserve">pct_pastura_ganadera</w:t>
+            </w:r>
+          </w:p>
+        </w:tc>
+        <w:tc>
+          <w:tcPr/>
+          <w:p>
+            <w:pPr>
+              <w:pStyle w:val="Compact"/>
+            </w:pPr>
+            <w:r>
+              <w:t xml:space="preserve">Cultivated pasture fraction (0–100 %)</w:t>
+            </w:r>
+          </w:p>
+        </w:tc>
+        <w:tc>
+          <w:tcPr/>
+          <w:p>
+            <w:pPr>
+              <w:pStyle w:val="Compact"/>
+            </w:pPr>
+            <w:r>
+              <w:t xml:space="preserve">MapBiomas C2 annual (Y-1)</w:t>
+            </w:r>
+          </w:p>
+        </w:tc>
+        <w:tc>
+          <w:tcPr/>
+          <w:p>
+            <w:pPr>
+              <w:pStyle w:val="Compact"/>
+            </w:pPr>
+            <w:r>
+              <w:t xml:space="preserve">M1, M2, M3 and propagation</w:t>
             </w:r>
           </w:p>
         </w:tc>
@@ -3412,40 +3412,40 @@
               <w:pStyle w:val="Compact"/>
             </w:pPr>
             <w:r>
-              <w:t xml:space="preserve">densidad_hist_25km</w:t>
-            </w:r>
-          </w:p>
-        </w:tc>
-        <w:tc>
-          <w:tcPr/>
-          <w:p>
-            <w:pPr>
-              <w:pStyle w:val="Compact"/>
-            </w:pPr>
-            <w:r>
-              <w:t xml:space="preserve">Cumulative historical fire density within 25 km</w:t>
-            </w:r>
-          </w:p>
-        </w:tc>
-        <w:tc>
-          <w:tcPr/>
-          <w:p>
-            <w:pPr>
-              <w:pStyle w:val="Compact"/>
-            </w:pPr>
-            <w:r>
-              <w:t xml:space="preserve">FIRMS, causal 3-year window</w:t>
-            </w:r>
-          </w:p>
-        </w:tc>
-        <w:tc>
-          <w:tcPr/>
-          <w:p>
-            <w:pPr>
-              <w:pStyle w:val="Compact"/>
-            </w:pPr>
-            <w:r>
-              <w:t xml:space="preserve">Ignition and propagation</w:t>
+              <w:t xml:space="preserve">pct_agricultura_anual</w:t>
+            </w:r>
+          </w:p>
+        </w:tc>
+        <w:tc>
+          <w:tcPr/>
+          <w:p>
+            <w:pPr>
+              <w:pStyle w:val="Compact"/>
+            </w:pPr>
+            <w:r>
+              <w:t xml:space="preserve">Annual agriculture fraction (0–100 %)</w:t>
+            </w:r>
+          </w:p>
+        </w:tc>
+        <w:tc>
+          <w:tcPr/>
+          <w:p>
+            <w:pPr>
+              <w:pStyle w:val="Compact"/>
+            </w:pPr>
+            <w:r>
+              <w:t xml:space="preserve">MapBiomas C2 annual (Y-1)</w:t>
+            </w:r>
+          </w:p>
+        </w:tc>
+        <w:tc>
+          <w:tcPr/>
+          <w:p>
+            <w:pPr>
+              <w:pStyle w:val="Compact"/>
+            </w:pPr>
+            <w:r>
+              <w:t xml:space="preserve">M1, M2, M3 and propagation</w:t>
             </w:r>
           </w:p>
         </w:tc>
@@ -3458,40 +3458,40 @@
               <w:pStyle w:val="Compact"/>
             </w:pPr>
             <w:r>
-              <w:t xml:space="preserve">dist_foco_t1_km</w:t>
-            </w:r>
-          </w:p>
-        </w:tc>
-        <w:tc>
-          <w:tcPr/>
-          <w:p>
-            <w:pPr>
-              <w:pStyle w:val="Compact"/>
-            </w:pPr>
-            <w:r>
-              <w:t xml:space="preserve">Minimum distance to an active t-1 fire (km)</w:t>
-            </w:r>
-          </w:p>
-        </w:tc>
-        <w:tc>
-          <w:tcPr/>
-          <w:p>
-            <w:pPr>
-              <w:pStyle w:val="Compact"/>
-            </w:pPr>
-            <w:r>
-              <w:t xml:space="preserve">Causal spatial kernel</w:t>
-            </w:r>
-          </w:p>
-        </w:tc>
-        <w:tc>
-          <w:tcPr/>
-          <w:p>
-            <w:pPr>
-              <w:pStyle w:val="Compact"/>
-            </w:pPr>
-            <w:r>
-              <w:t xml:space="preserve">Propagation only</w:t>
+              <w:t xml:space="preserve">pct_plantacion_forestal</w:t>
+            </w:r>
+          </w:p>
+        </w:tc>
+        <w:tc>
+          <w:tcPr/>
+          <w:p>
+            <w:pPr>
+              <w:pStyle w:val="Compact"/>
+            </w:pPr>
+            <w:r>
+              <w:t xml:space="preserve">Forest plantation fraction (0–100 %)</w:t>
+            </w:r>
+          </w:p>
+        </w:tc>
+        <w:tc>
+          <w:tcPr/>
+          <w:p>
+            <w:pPr>
+              <w:pStyle w:val="Compact"/>
+            </w:pPr>
+            <w:r>
+              <w:t xml:space="preserve">MapBiomas C2 annual (Y-1)</w:t>
+            </w:r>
+          </w:p>
+        </w:tc>
+        <w:tc>
+          <w:tcPr/>
+          <w:p>
+            <w:pPr>
+              <w:pStyle w:val="Compact"/>
+            </w:pPr>
+            <w:r>
+              <w:t xml:space="preserve">M1, M2, M3 and propagation</w:t>
             </w:r>
           </w:p>
         </w:tc>
@@ -3504,40 +3504,40 @@
               <w:pStyle w:val="Compact"/>
             </w:pPr>
             <w:r>
-              <w:t xml:space="preserve">focos_25km_t1</w:t>
-            </w:r>
-          </w:p>
-        </w:tc>
-        <w:tc>
-          <w:tcPr/>
-          <w:p>
-            <w:pPr>
-              <w:pStyle w:val="Compact"/>
-            </w:pPr>
-            <w:r>
-              <w:t xml:space="preserve">Active t-1 fires within 25 km</w:t>
-            </w:r>
-          </w:p>
-        </w:tc>
-        <w:tc>
-          <w:tcPr/>
-          <w:p>
-            <w:pPr>
-              <w:pStyle w:val="Compact"/>
-            </w:pPr>
-            <w:r>
-              <w:t xml:space="preserve">Causal spatial kernel</w:t>
-            </w:r>
-          </w:p>
-        </w:tc>
-        <w:tc>
-          <w:tcPr/>
-          <w:p>
-            <w:pPr>
-              <w:pStyle w:val="Compact"/>
-            </w:pPr>
-            <w:r>
-              <w:t xml:space="preserve">Propagation only</w:t>
+              <w:t xml:space="preserve">pct_sabana_pastizal</w:t>
+            </w:r>
+          </w:p>
+        </w:tc>
+        <w:tc>
+          <w:tcPr/>
+          <w:p>
+            <w:pPr>
+              <w:pStyle w:val="Compact"/>
+            </w:pPr>
+            <w:r>
+              <w:t xml:space="preserve">Savanna and natural grassland fraction (0–100 %)</w:t>
+            </w:r>
+          </w:p>
+        </w:tc>
+        <w:tc>
+          <w:tcPr/>
+          <w:p>
+            <w:pPr>
+              <w:pStyle w:val="Compact"/>
+            </w:pPr>
+            <w:r>
+              <w:t xml:space="preserve">MapBiomas C2 annual (Y-1)</w:t>
+            </w:r>
+          </w:p>
+        </w:tc>
+        <w:tc>
+          <w:tcPr/>
+          <w:p>
+            <w:pPr>
+              <w:pStyle w:val="Compact"/>
+            </w:pPr>
+            <w:r>
+              <w:t xml:space="preserve">Ignition and propagation</w:t>
             </w:r>
           </w:p>
         </w:tc>
@@ -3550,40 +3550,40 @@
               <w:pStyle w:val="Compact"/>
             </w:pPr>
             <w:r>
-              <w:t xml:space="preserve">frp_25km_t1</w:t>
-            </w:r>
-          </w:p>
-        </w:tc>
-        <w:tc>
-          <w:tcPr/>
-          <w:p>
-            <w:pPr>
-              <w:pStyle w:val="Compact"/>
-            </w:pPr>
-            <w:r>
-              <w:t xml:space="preserve">Accumulated t-1 FRP within 25 km (MW)</w:t>
-            </w:r>
-          </w:p>
-        </w:tc>
-        <w:tc>
-          <w:tcPr/>
-          <w:p>
-            <w:pPr>
-              <w:pStyle w:val="Compact"/>
-            </w:pPr>
-            <w:r>
-              <w:t xml:space="preserve">Causal spatial kernel</w:t>
-            </w:r>
-          </w:p>
-        </w:tc>
-        <w:tc>
-          <w:tcPr/>
-          <w:p>
-            <w:pPr>
-              <w:pStyle w:val="Compact"/>
-            </w:pPr>
-            <w:r>
-              <w:t xml:space="preserve">Propagation only</w:t>
+              <w:t xml:space="preserve">pct_humedal_palmar</w:t>
+            </w:r>
+          </w:p>
+        </w:tc>
+        <w:tc>
+          <w:tcPr/>
+          <w:p>
+            <w:pPr>
+              <w:pStyle w:val="Compact"/>
+            </w:pPr>
+            <w:r>
+              <w:t xml:space="preserve">Wetland and palm swamp fraction (0–100 %)</w:t>
+            </w:r>
+          </w:p>
+        </w:tc>
+        <w:tc>
+          <w:tcPr/>
+          <w:p>
+            <w:pPr>
+              <w:pStyle w:val="Compact"/>
+            </w:pPr>
+            <w:r>
+              <w:t xml:space="preserve">MapBiomas C2 annual (Y-1)</w:t>
+            </w:r>
+          </w:p>
+        </w:tc>
+        <w:tc>
+          <w:tcPr/>
+          <w:p>
+            <w:pPr>
+              <w:pStyle w:val="Compact"/>
+            </w:pPr>
+            <w:r>
+              <w:t xml:space="preserve">Ignition and propagation</w:t>
             </w:r>
           </w:p>
         </w:tc>
@@ -3596,40 +3596,40 @@
               <w:pStyle w:val="Compact"/>
             </w:pPr>
             <w:r>
-              <w:t xml:space="preserve">dist_corredor_antropico_km</w:t>
-            </w:r>
-          </w:p>
-        </w:tc>
-        <w:tc>
-          <w:tcPr/>
-          <w:p>
-            <w:pPr>
-              <w:pStyle w:val="Compact"/>
-            </w:pPr>
-            <w:r>
-              <w:t xml:space="preserve">Distance to chronic-recurrence cells (≥3 events, 2018–2022)</w:t>
-            </w:r>
-          </w:p>
-        </w:tc>
-        <w:tc>
-          <w:tcPr/>
-          <w:p>
-            <w:pPr>
-              <w:pStyle w:val="Compact"/>
-            </w:pPr>
-            <w:r>
-              <w:t xml:space="preserve">Anthropogenic prior</w:t>
-            </w:r>
-          </w:p>
-        </w:tc>
-        <w:tc>
-          <w:tcPr/>
-          <w:p>
-            <w:pPr>
-              <w:pStyle w:val="Compact"/>
-            </w:pPr>
-            <w:r>
-              <w:t xml:space="preserve">M3 only</w:t>
+              <w:t xml:space="preserve">pct_bosque_seco</w:t>
+            </w:r>
+          </w:p>
+        </w:tc>
+        <w:tc>
+          <w:tcPr/>
+          <w:p>
+            <w:pPr>
+              <w:pStyle w:val="Compact"/>
+            </w:pPr>
+            <w:r>
+              <w:t xml:space="preserve">Dry Chaco forest fraction (0–100 %)</w:t>
+            </w:r>
+          </w:p>
+        </w:tc>
+        <w:tc>
+          <w:tcPr/>
+          <w:p>
+            <w:pPr>
+              <w:pStyle w:val="Compact"/>
+            </w:pPr>
+            <w:r>
+              <w:t xml:space="preserve">MapBiomas C2 annual (Y-1)</w:t>
+            </w:r>
+          </w:p>
+        </w:tc>
+        <w:tc>
+          <w:tcPr/>
+          <w:p>
+            <w:pPr>
+              <w:pStyle w:val="Compact"/>
+            </w:pPr>
+            <w:r>
+              <w:t xml:space="preserve">Ignition and propagation (Chaco)</w:t>
             </w:r>
           </w:p>
         </w:tc>
@@ -3642,40 +3642,40 @@
               <w:pStyle w:val="Compact"/>
             </w:pPr>
             <w:r>
-              <w:t xml:space="preserve">densidad_hist_5km</w:t>
-            </w:r>
-          </w:p>
-        </w:tc>
-        <w:tc>
-          <w:tcPr/>
-          <w:p>
-            <w:pPr>
-              <w:pStyle w:val="Compact"/>
-            </w:pPr>
-            <w:r>
-              <w:t xml:space="preserve">Kernel density of historical fires within 5 km</w:t>
-            </w:r>
-          </w:p>
-        </w:tc>
-        <w:tc>
-          <w:tcPr/>
-          <w:p>
-            <w:pPr>
-              <w:pStyle w:val="Compact"/>
-            </w:pPr>
-            <w:r>
-              <w:t xml:space="preserve">Anthropogenic prior</w:t>
-            </w:r>
-          </w:p>
-        </w:tc>
-        <w:tc>
-          <w:tcPr/>
-          <w:p>
-            <w:pPr>
-              <w:pStyle w:val="Compact"/>
-            </w:pPr>
-            <w:r>
-              <w:t xml:space="preserve">M3 only</w:t>
+              <w:t xml:space="preserve">pct_bosque_humedo</w:t>
+            </w:r>
+          </w:p>
+        </w:tc>
+        <w:tc>
+          <w:tcPr/>
+          <w:p>
+            <w:pPr>
+              <w:pStyle w:val="Compact"/>
+            </w:pPr>
+            <w:r>
+              <w:t xml:space="preserve">Atlantic humid forest fraction (0–100 %)</w:t>
+            </w:r>
+          </w:p>
+        </w:tc>
+        <w:tc>
+          <w:tcPr/>
+          <w:p>
+            <w:pPr>
+              <w:pStyle w:val="Compact"/>
+            </w:pPr>
+            <w:r>
+              <w:t xml:space="preserve">MapBiomas C2 annual (Y-1)</w:t>
+            </w:r>
+          </w:p>
+        </w:tc>
+        <w:tc>
+          <w:tcPr/>
+          <w:p>
+            <w:pPr>
+              <w:pStyle w:val="Compact"/>
+            </w:pPr>
+            <w:r>
+              <w:t xml:space="preserve">Ignition and propagation (Oriental)</w:t>
             </w:r>
           </w:p>
         </w:tc>
@@ -3688,40 +3688,40 @@
               <w:pStyle w:val="Compact"/>
             </w:pPr>
             <w:r>
-              <w:t xml:space="preserve">densidad_hist_10km</w:t>
-            </w:r>
-          </w:p>
-        </w:tc>
-        <w:tc>
-          <w:tcPr/>
-          <w:p>
-            <w:pPr>
-              <w:pStyle w:val="Compact"/>
-            </w:pPr>
-            <w:r>
-              <w:t xml:space="preserve">Kernel density of historical fires within 10 km</w:t>
-            </w:r>
-          </w:p>
-        </w:tc>
-        <w:tc>
-          <w:tcPr/>
-          <w:p>
-            <w:pPr>
-              <w:pStyle w:val="Compact"/>
-            </w:pPr>
-            <w:r>
-              <w:t xml:space="preserve">Anthropogenic prior</w:t>
-            </w:r>
-          </w:p>
-        </w:tc>
-        <w:tc>
-          <w:tcPr/>
-          <w:p>
-            <w:pPr>
-              <w:pStyle w:val="Compact"/>
-            </w:pPr>
-            <w:r>
-              <w:t xml:space="preserve">M3 only</w:t>
+              <w:t xml:space="preserve">indice_ecotono</w:t>
+            </w:r>
+          </w:p>
+        </w:tc>
+        <w:tc>
+          <w:tcPr/>
+          <w:p>
+            <w:pPr>
+              <w:pStyle w:val="Compact"/>
+            </w:pPr>
+            <w:r>
+              <w:t xml:space="preserve">Forest–pasture edge disruption index</w:t>
+            </w:r>
+          </w:p>
+        </w:tc>
+        <w:tc>
+          <w:tcPr/>
+          <w:p>
+            <w:pPr>
+              <w:pStyle w:val="Compact"/>
+            </w:pPr>
+            <w:r>
+              <w:t xml:space="preserve">Derived</w:t>
+            </w:r>
+          </w:p>
+        </w:tc>
+        <w:tc>
+          <w:tcPr/>
+          <w:p>
+            <w:pPr>
+              <w:pStyle w:val="Compact"/>
+            </w:pPr>
+            <w:r>
+              <w:t xml:space="preserve">Ignition and propagation</w:t>
             </w:r>
           </w:p>
         </w:tc>
@@ -3734,40 +3734,40 @@
               <w:pStyle w:val="Compact"/>
             </w:pPr>
             <w:r>
-              <w:t xml:space="preserve">freq_hist_1km</w:t>
-            </w:r>
-          </w:p>
-        </w:tc>
-        <w:tc>
-          <w:tcPr/>
-          <w:p>
-            <w:pPr>
-              <w:pStyle w:val="Compact"/>
-            </w:pPr>
-            <w:r>
-              <w:t xml:space="preserve">Point recurrence in the 1-km² cell (2018–2022)</w:t>
-            </w:r>
-          </w:p>
-        </w:tc>
-        <w:tc>
-          <w:tcPr/>
-          <w:p>
-            <w:pPr>
-              <w:pStyle w:val="Compact"/>
-            </w:pPr>
-            <w:r>
-              <w:t xml:space="preserve">Anthropogenic prior</w:t>
-            </w:r>
-          </w:p>
-        </w:tc>
-        <w:tc>
-          <w:tcPr/>
-          <w:p>
-            <w:pPr>
-              <w:pStyle w:val="Compact"/>
-            </w:pPr>
-            <w:r>
-              <w:t xml:space="preserve">M3 Oriental and M2 fallback selector</w:t>
+              <w:t xml:space="preserve">borde_bosque_agro_pct</w:t>
+            </w:r>
+          </w:p>
+        </w:tc>
+        <w:tc>
+          <w:tcPr/>
+          <w:p>
+            <w:pPr>
+              <w:pStyle w:val="Compact"/>
+            </w:pPr>
+            <w:r>
+              <w:t xml:space="preserve">Forest–agriculture edge fraction (0–100 %)</w:t>
+            </w:r>
+          </w:p>
+        </w:tc>
+        <w:tc>
+          <w:tcPr/>
+          <w:p>
+            <w:pPr>
+              <w:pStyle w:val="Compact"/>
+            </w:pPr>
+            <w:r>
+              <w:t xml:space="preserve">Derived from MapBiomas C2 annual (Y-1)</w:t>
+            </w:r>
+          </w:p>
+        </w:tc>
+        <w:tc>
+          <w:tcPr/>
+          <w:p>
+            <w:pPr>
+              <w:pStyle w:val="Compact"/>
+            </w:pPr>
+            <w:r>
+              <w:t xml:space="preserve">M2, M3 and propagation</w:t>
             </w:r>
           </w:p>
         </w:tc>
@@ -3780,40 +3780,40 @@
               <w:pStyle w:val="Compact"/>
             </w:pPr>
             <w:r>
-              <w:t xml:space="preserve">temporada_quema_ganadera</w:t>
-            </w:r>
-          </w:p>
-        </w:tc>
-        <w:tc>
-          <w:tcPr/>
-          <w:p>
-            <w:pPr>
-              <w:pStyle w:val="Compact"/>
-            </w:pPr>
-            <w:r>
-              <w:t xml:space="preserve">Livestock burning season indicator (August–October)</w:t>
-            </w:r>
-          </w:p>
-        </w:tc>
-        <w:tc>
-          <w:tcPr/>
-          <w:p>
-            <w:pPr>
-              <w:pStyle w:val="Compact"/>
-            </w:pPr>
-            <w:r>
-              <w:t xml:space="preserve">Anthropogenic calendar</w:t>
-            </w:r>
-          </w:p>
-        </w:tc>
-        <w:tc>
-          <w:tcPr/>
-          <w:p>
-            <w:pPr>
-              <w:pStyle w:val="Compact"/>
-            </w:pPr>
-            <w:r>
-              <w:t xml:space="preserve">M3 only</w:t>
+              <w:t xml:space="preserve">pct_desmonte_t1</w:t>
+            </w:r>
+          </w:p>
+        </w:tc>
+        <w:tc>
+          <w:tcPr/>
+          <w:p>
+            <w:pPr>
+              <w:pStyle w:val="Compact"/>
+            </w:pPr>
+            <w:r>
+              <w:t xml:space="preserve">Tree-cover loss in the prior year (0–100 %)</w:t>
+            </w:r>
+          </w:p>
+        </w:tc>
+        <w:tc>
+          <w:tcPr/>
+          <w:p>
+            <w:pPr>
+              <w:pStyle w:val="Compact"/>
+            </w:pPr>
+            <w:r>
+              <w:t xml:space="preserve">Hansen GFC-2025 v1.13 (Y-1)</w:t>
+            </w:r>
+          </w:p>
+        </w:tc>
+        <w:tc>
+          <w:tcPr/>
+          <w:p>
+            <w:pPr>
+              <w:pStyle w:val="Compact"/>
+            </w:pPr>
+            <w:r>
+              <w:t xml:space="preserve">M2, M3 and propagation</w:t>
             </w:r>
           </w:p>
         </w:tc>
@@ -3826,40 +3826,40 @@
               <w:pStyle w:val="Compact"/>
             </w:pPr>
             <w:r>
-              <w:t xml:space="preserve">doy_sin</w:t>
-            </w:r>
-          </w:p>
-        </w:tc>
-        <w:tc>
-          <w:tcPr/>
-          <w:p>
-            <w:pPr>
-              <w:pStyle w:val="Compact"/>
-            </w:pPr>
-            <w:r>
-              <w:t xml:space="preserve">Continuous seasonal sine harmonic</w:t>
-            </w:r>
-          </w:p>
-        </w:tc>
-        <w:tc>
-          <w:tcPr/>
-          <w:p>
-            <w:pPr>
-              <w:pStyle w:val="Compact"/>
-            </w:pPr>
-            <w:r>
-              <w:t xml:space="preserve">Derived</w:t>
-            </w:r>
-          </w:p>
-        </w:tc>
-        <w:tc>
-          <w:tcPr/>
-          <w:p>
-            <w:pPr>
-              <w:pStyle w:val="Compact"/>
-            </w:pPr>
-            <w:r>
-              <w:t xml:space="preserve">M3 only</w:t>
+              <w:t xml:space="preserve">pct_desmonte_t2</w:t>
+            </w:r>
+          </w:p>
+        </w:tc>
+        <w:tc>
+          <w:tcPr/>
+          <w:p>
+            <w:pPr>
+              <w:pStyle w:val="Compact"/>
+            </w:pPr>
+            <w:r>
+              <w:t xml:space="preserve">Tree-cover loss two years before (0–100 %)</w:t>
+            </w:r>
+          </w:p>
+        </w:tc>
+        <w:tc>
+          <w:tcPr/>
+          <w:p>
+            <w:pPr>
+              <w:pStyle w:val="Compact"/>
+            </w:pPr>
+            <w:r>
+              <w:t xml:space="preserve">Hansen GFC-2025 v1.13 (Y-2)</w:t>
+            </w:r>
+          </w:p>
+        </w:tc>
+        <w:tc>
+          <w:tcPr/>
+          <w:p>
+            <w:pPr>
+              <w:pStyle w:val="Compact"/>
+            </w:pPr>
+            <w:r>
+              <w:t xml:space="preserve">M2, M3 and propagation</w:t>
             </w:r>
           </w:p>
         </w:tc>
@@ -3872,40 +3872,40 @@
               <w:pStyle w:val="Compact"/>
             </w:pPr>
             <w:r>
-              <w:t xml:space="preserve">doy_cos</w:t>
-            </w:r>
-          </w:p>
-        </w:tc>
-        <w:tc>
-          <w:tcPr/>
-          <w:p>
-            <w:pPr>
-              <w:pStyle w:val="Compact"/>
-            </w:pPr>
-            <w:r>
-              <w:t xml:space="preserve">Continuous seasonal cosine harmonic</w:t>
-            </w:r>
-          </w:p>
-        </w:tc>
-        <w:tc>
-          <w:tcPr/>
-          <w:p>
-            <w:pPr>
-              <w:pStyle w:val="Compact"/>
-            </w:pPr>
-            <w:r>
-              <w:t xml:space="preserve">Derived</w:t>
-            </w:r>
-          </w:p>
-        </w:tc>
-        <w:tc>
-          <w:tcPr/>
-          <w:p>
-            <w:pPr>
-              <w:pStyle w:val="Compact"/>
-            </w:pPr>
-            <w:r>
-              <w:t xml:space="preserve">M3 only</w:t>
+              <w:t xml:space="preserve">presion_desmonte_vpd</w:t>
+            </w:r>
+          </w:p>
+        </w:tc>
+        <w:tc>
+          <w:tcPr/>
+          <w:p>
+            <w:pPr>
+              <w:pStyle w:val="Compact"/>
+            </w:pPr>
+            <w:r>
+              <w:t xml:space="preserve">Deforestation × VPD pressure</w:t>
+            </w:r>
+          </w:p>
+        </w:tc>
+        <w:tc>
+          <w:tcPr/>
+          <w:p>
+            <w:pPr>
+              <w:pStyle w:val="Compact"/>
+            </w:pPr>
+            <w:r>
+              <w:t xml:space="preserve">Derived (Hansen Y-1 × VPD)</w:t>
+            </w:r>
+          </w:p>
+        </w:tc>
+        <w:tc>
+          <w:tcPr/>
+          <w:p>
+            <w:pPr>
+              <w:pStyle w:val="Compact"/>
+            </w:pPr>
+            <w:r>
+              <w:t xml:space="preserve">M2, M3 and propagation</w:t>
             </w:r>
           </w:p>
         </w:tc>
@@ -3918,40 +3918,40 @@
               <w:pStyle w:val="Compact"/>
             </w:pPr>
             <w:r>
-              <w:t xml:space="preserve">presion_quema_pastura</w:t>
-            </w:r>
-          </w:p>
-        </w:tc>
-        <w:tc>
-          <w:tcPr/>
-          <w:p>
-            <w:pPr>
-              <w:pStyle w:val="Compact"/>
-            </w:pPr>
-            <w:r>
-              <w:t xml:space="preserve">Pasture burning pressure (pasture × VPD × month weight)</w:t>
-            </w:r>
-          </w:p>
-        </w:tc>
-        <w:tc>
-          <w:tcPr/>
-          <w:p>
-            <w:pPr>
-              <w:pStyle w:val="Compact"/>
-            </w:pPr>
-            <w:r>
-              <w:t xml:space="preserve">Human–climate interaction</w:t>
-            </w:r>
-          </w:p>
-        </w:tc>
-        <w:tc>
-          <w:tcPr/>
-          <w:p>
-            <w:pPr>
-              <w:pStyle w:val="Compact"/>
-            </w:pPr>
-            <w:r>
-              <w:t xml:space="preserve">M3 only</w:t>
+              <w:t xml:space="preserve">dist_foco_hist_km</w:t>
+            </w:r>
+          </w:p>
+        </w:tc>
+        <w:tc>
+          <w:tcPr/>
+          <w:p>
+            <w:pPr>
+              <w:pStyle w:val="Compact"/>
+            </w:pPr>
+            <w:r>
+              <w:t xml:space="preserve">Minimum distance to training fires (km)</w:t>
+            </w:r>
+          </w:p>
+        </w:tc>
+        <w:tc>
+          <w:tcPr/>
+          <w:p>
+            <w:pPr>
+              <w:pStyle w:val="Compact"/>
+            </w:pPr>
+            <w:r>
+              <w:t xml:space="preserve">FIRMS, causal 3-year window</w:t>
+            </w:r>
+          </w:p>
+        </w:tc>
+        <w:tc>
+          <w:tcPr/>
+          <w:p>
+            <w:pPr>
+              <w:pStyle w:val="Compact"/>
+            </w:pPr>
+            <w:r>
+              <w:t xml:space="preserve">Ignition and propagation</w:t>
             </w:r>
           </w:p>
         </w:tc>
@@ -3964,40 +3964,40 @@
               <w:pStyle w:val="Compact"/>
             </w:pPr>
             <w:r>
-              <w:t xml:space="preserve">focalizacion_antropica_local</w:t>
-            </w:r>
-          </w:p>
-        </w:tc>
-        <w:tc>
-          <w:tcPr/>
-          <w:p>
-            <w:pPr>
-              <w:pStyle w:val="Compact"/>
-            </w:pPr>
-            <w:r>
-              <w:t xml:space="preserve">Local-to-macro concentration ratio (5 km / 25 km)</w:t>
-            </w:r>
-          </w:p>
-        </w:tc>
-        <w:tc>
-          <w:tcPr/>
-          <w:p>
-            <w:pPr>
-              <w:pStyle w:val="Compact"/>
-            </w:pPr>
-            <w:r>
-              <w:t xml:space="preserve">Multiscale ratio</w:t>
-            </w:r>
-          </w:p>
-        </w:tc>
-        <w:tc>
-          <w:tcPr/>
-          <w:p>
-            <w:pPr>
-              <w:pStyle w:val="Compact"/>
-            </w:pPr>
-            <w:r>
-              <w:t xml:space="preserve">M3 only</w:t>
+              <w:t xml:space="preserve">densidad_hist_25km</w:t>
+            </w:r>
+          </w:p>
+        </w:tc>
+        <w:tc>
+          <w:tcPr/>
+          <w:p>
+            <w:pPr>
+              <w:pStyle w:val="Compact"/>
+            </w:pPr>
+            <w:r>
+              <w:t xml:space="preserve">Cumulative historical fire density within 25 km</w:t>
+            </w:r>
+          </w:p>
+        </w:tc>
+        <w:tc>
+          <w:tcPr/>
+          <w:p>
+            <w:pPr>
+              <w:pStyle w:val="Compact"/>
+            </w:pPr>
+            <w:r>
+              <w:t xml:space="preserve">FIRMS, causal 3-year window</w:t>
+            </w:r>
+          </w:p>
+        </w:tc>
+        <w:tc>
+          <w:tcPr/>
+          <w:p>
+            <w:pPr>
+              <w:pStyle w:val="Compact"/>
+            </w:pPr>
+            <w:r>
+              <w:t xml:space="preserve">Ignition and propagation</w:t>
             </w:r>
           </w:p>
         </w:tc>
@@ -4010,40 +4010,40 @@
               <w:pStyle w:val="Compact"/>
             </w:pPr>
             <w:r>
-              <w:t xml:space="preserve">interaccion_acceso_vpd</w:t>
-            </w:r>
-          </w:p>
-        </w:tc>
-        <w:tc>
-          <w:tcPr/>
-          <w:p>
-            <w:pPr>
-              <w:pStyle w:val="Compact"/>
-            </w:pPr>
-            <w:r>
-              <w:t xml:space="preserve">Accessibility–desiccation synergy (exp(−d_hist/5) × VPD)</w:t>
-            </w:r>
-          </w:p>
-        </w:tc>
-        <w:tc>
-          <w:tcPr/>
-          <w:p>
-            <w:pPr>
-              <w:pStyle w:val="Compact"/>
-            </w:pPr>
-            <w:r>
-              <w:t xml:space="preserve">Human–climate interaction</w:t>
-            </w:r>
-          </w:p>
-        </w:tc>
-        <w:tc>
-          <w:tcPr/>
-          <w:p>
-            <w:pPr>
-              <w:pStyle w:val="Compact"/>
-            </w:pPr>
-            <w:r>
-              <w:t xml:space="preserve">M3 only</w:t>
+              <w:t xml:space="preserve">dist_foco_t1_km</w:t>
+            </w:r>
+          </w:p>
+        </w:tc>
+        <w:tc>
+          <w:tcPr/>
+          <w:p>
+            <w:pPr>
+              <w:pStyle w:val="Compact"/>
+            </w:pPr>
+            <w:r>
+              <w:t xml:space="preserve">Minimum distance to an active t-1 fire (km)</w:t>
+            </w:r>
+          </w:p>
+        </w:tc>
+        <w:tc>
+          <w:tcPr/>
+          <w:p>
+            <w:pPr>
+              <w:pStyle w:val="Compact"/>
+            </w:pPr>
+            <w:r>
+              <w:t xml:space="preserve">Causal spatial kernel</w:t>
+            </w:r>
+          </w:p>
+        </w:tc>
+        <w:tc>
+          <w:tcPr/>
+          <w:p>
+            <w:pPr>
+              <w:pStyle w:val="Compact"/>
+            </w:pPr>
+            <w:r>
+              <w:t xml:space="preserve">Propagation only</w:t>
             </w:r>
           </w:p>
         </w:tc>
@@ -4056,6 +4056,558 @@
               <w:pStyle w:val="Compact"/>
             </w:pPr>
             <w:r>
+              <w:t xml:space="preserve">focos_25km_t1</w:t>
+            </w:r>
+          </w:p>
+        </w:tc>
+        <w:tc>
+          <w:tcPr/>
+          <w:p>
+            <w:pPr>
+              <w:pStyle w:val="Compact"/>
+            </w:pPr>
+            <w:r>
+              <w:t xml:space="preserve">Active t-1 fires within 25 km</w:t>
+            </w:r>
+          </w:p>
+        </w:tc>
+        <w:tc>
+          <w:tcPr/>
+          <w:p>
+            <w:pPr>
+              <w:pStyle w:val="Compact"/>
+            </w:pPr>
+            <w:r>
+              <w:t xml:space="preserve">Causal spatial kernel</w:t>
+            </w:r>
+          </w:p>
+        </w:tc>
+        <w:tc>
+          <w:tcPr/>
+          <w:p>
+            <w:pPr>
+              <w:pStyle w:val="Compact"/>
+            </w:pPr>
+            <w:r>
+              <w:t xml:space="preserve">Propagation only</w:t>
+            </w:r>
+          </w:p>
+        </w:tc>
+      </w:tr>
+      <w:tr>
+        <w:tc>
+          <w:tcPr/>
+          <w:p>
+            <w:pPr>
+              <w:pStyle w:val="Compact"/>
+            </w:pPr>
+            <w:r>
+              <w:t xml:space="preserve">frp_25km_t1</w:t>
+            </w:r>
+          </w:p>
+        </w:tc>
+        <w:tc>
+          <w:tcPr/>
+          <w:p>
+            <w:pPr>
+              <w:pStyle w:val="Compact"/>
+            </w:pPr>
+            <w:r>
+              <w:t xml:space="preserve">Accumulated t-1 FRP within 25 km (MW)</w:t>
+            </w:r>
+          </w:p>
+        </w:tc>
+        <w:tc>
+          <w:tcPr/>
+          <w:p>
+            <w:pPr>
+              <w:pStyle w:val="Compact"/>
+            </w:pPr>
+            <w:r>
+              <w:t xml:space="preserve">Causal spatial kernel</w:t>
+            </w:r>
+          </w:p>
+        </w:tc>
+        <w:tc>
+          <w:tcPr/>
+          <w:p>
+            <w:pPr>
+              <w:pStyle w:val="Compact"/>
+            </w:pPr>
+            <w:r>
+              <w:t xml:space="preserve">Propagation only</w:t>
+            </w:r>
+          </w:p>
+        </w:tc>
+      </w:tr>
+      <w:tr>
+        <w:tc>
+          <w:tcPr/>
+          <w:p>
+            <w:pPr>
+              <w:pStyle w:val="Compact"/>
+            </w:pPr>
+            <w:r>
+              <w:t xml:space="preserve">dist_corredor_antropico_km</w:t>
+            </w:r>
+          </w:p>
+        </w:tc>
+        <w:tc>
+          <w:tcPr/>
+          <w:p>
+            <w:pPr>
+              <w:pStyle w:val="Compact"/>
+            </w:pPr>
+            <w:r>
+              <w:t xml:space="preserve">Distance to chronic-recurrence cells (≥3 events, 2018–2022)</w:t>
+            </w:r>
+          </w:p>
+        </w:tc>
+        <w:tc>
+          <w:tcPr/>
+          <w:p>
+            <w:pPr>
+              <w:pStyle w:val="Compact"/>
+            </w:pPr>
+            <w:r>
+              <w:t xml:space="preserve">Anthropogenic prior</w:t>
+            </w:r>
+          </w:p>
+        </w:tc>
+        <w:tc>
+          <w:tcPr/>
+          <w:p>
+            <w:pPr>
+              <w:pStyle w:val="Compact"/>
+            </w:pPr>
+            <w:r>
+              <w:t xml:space="preserve">M3 only</w:t>
+            </w:r>
+          </w:p>
+        </w:tc>
+      </w:tr>
+      <w:tr>
+        <w:tc>
+          <w:tcPr/>
+          <w:p>
+            <w:pPr>
+              <w:pStyle w:val="Compact"/>
+            </w:pPr>
+            <w:r>
+              <w:t xml:space="preserve">densidad_hist_5km</w:t>
+            </w:r>
+          </w:p>
+        </w:tc>
+        <w:tc>
+          <w:tcPr/>
+          <w:p>
+            <w:pPr>
+              <w:pStyle w:val="Compact"/>
+            </w:pPr>
+            <w:r>
+              <w:t xml:space="preserve">Kernel density of historical fires within 5 km</w:t>
+            </w:r>
+          </w:p>
+        </w:tc>
+        <w:tc>
+          <w:tcPr/>
+          <w:p>
+            <w:pPr>
+              <w:pStyle w:val="Compact"/>
+            </w:pPr>
+            <w:r>
+              <w:t xml:space="preserve">Anthropogenic prior</w:t>
+            </w:r>
+          </w:p>
+        </w:tc>
+        <w:tc>
+          <w:tcPr/>
+          <w:p>
+            <w:pPr>
+              <w:pStyle w:val="Compact"/>
+            </w:pPr>
+            <w:r>
+              <w:t xml:space="preserve">M3 only</w:t>
+            </w:r>
+          </w:p>
+        </w:tc>
+      </w:tr>
+      <w:tr>
+        <w:tc>
+          <w:tcPr/>
+          <w:p>
+            <w:pPr>
+              <w:pStyle w:val="Compact"/>
+            </w:pPr>
+            <w:r>
+              <w:t xml:space="preserve">densidad_hist_10km</w:t>
+            </w:r>
+          </w:p>
+        </w:tc>
+        <w:tc>
+          <w:tcPr/>
+          <w:p>
+            <w:pPr>
+              <w:pStyle w:val="Compact"/>
+            </w:pPr>
+            <w:r>
+              <w:t xml:space="preserve">Kernel density of historical fires within 10 km</w:t>
+            </w:r>
+          </w:p>
+        </w:tc>
+        <w:tc>
+          <w:tcPr/>
+          <w:p>
+            <w:pPr>
+              <w:pStyle w:val="Compact"/>
+            </w:pPr>
+            <w:r>
+              <w:t xml:space="preserve">Anthropogenic prior</w:t>
+            </w:r>
+          </w:p>
+        </w:tc>
+        <w:tc>
+          <w:tcPr/>
+          <w:p>
+            <w:pPr>
+              <w:pStyle w:val="Compact"/>
+            </w:pPr>
+            <w:r>
+              <w:t xml:space="preserve">M3 only</w:t>
+            </w:r>
+          </w:p>
+        </w:tc>
+      </w:tr>
+      <w:tr>
+        <w:tc>
+          <w:tcPr/>
+          <w:p>
+            <w:pPr>
+              <w:pStyle w:val="Compact"/>
+            </w:pPr>
+            <w:r>
+              <w:t xml:space="preserve">freq_hist_1km</w:t>
+            </w:r>
+          </w:p>
+        </w:tc>
+        <w:tc>
+          <w:tcPr/>
+          <w:p>
+            <w:pPr>
+              <w:pStyle w:val="Compact"/>
+            </w:pPr>
+            <w:r>
+              <w:t xml:space="preserve">Point recurrence in the 1-km² cell (2018–2022)</w:t>
+            </w:r>
+          </w:p>
+        </w:tc>
+        <w:tc>
+          <w:tcPr/>
+          <w:p>
+            <w:pPr>
+              <w:pStyle w:val="Compact"/>
+            </w:pPr>
+            <w:r>
+              <w:t xml:space="preserve">Anthropogenic prior</w:t>
+            </w:r>
+          </w:p>
+        </w:tc>
+        <w:tc>
+          <w:tcPr/>
+          <w:p>
+            <w:pPr>
+              <w:pStyle w:val="Compact"/>
+            </w:pPr>
+            <w:r>
+              <w:t xml:space="preserve">M3 Oriental and M2 fallback selector</w:t>
+            </w:r>
+          </w:p>
+        </w:tc>
+      </w:tr>
+      <w:tr>
+        <w:tc>
+          <w:tcPr/>
+          <w:p>
+            <w:pPr>
+              <w:pStyle w:val="Compact"/>
+            </w:pPr>
+            <w:r>
+              <w:t xml:space="preserve">temporada_quema_ganadera</w:t>
+            </w:r>
+          </w:p>
+        </w:tc>
+        <w:tc>
+          <w:tcPr/>
+          <w:p>
+            <w:pPr>
+              <w:pStyle w:val="Compact"/>
+            </w:pPr>
+            <w:r>
+              <w:t xml:space="preserve">Livestock burning season indicator (August–October)</w:t>
+            </w:r>
+          </w:p>
+        </w:tc>
+        <w:tc>
+          <w:tcPr/>
+          <w:p>
+            <w:pPr>
+              <w:pStyle w:val="Compact"/>
+            </w:pPr>
+            <w:r>
+              <w:t xml:space="preserve">Anthropogenic calendar</w:t>
+            </w:r>
+          </w:p>
+        </w:tc>
+        <w:tc>
+          <w:tcPr/>
+          <w:p>
+            <w:pPr>
+              <w:pStyle w:val="Compact"/>
+            </w:pPr>
+            <w:r>
+              <w:t xml:space="preserve">M3 only</w:t>
+            </w:r>
+          </w:p>
+        </w:tc>
+      </w:tr>
+      <w:tr>
+        <w:tc>
+          <w:tcPr/>
+          <w:p>
+            <w:pPr>
+              <w:pStyle w:val="Compact"/>
+            </w:pPr>
+            <w:r>
+              <w:t xml:space="preserve">doy_sin</w:t>
+            </w:r>
+          </w:p>
+        </w:tc>
+        <w:tc>
+          <w:tcPr/>
+          <w:p>
+            <w:pPr>
+              <w:pStyle w:val="Compact"/>
+            </w:pPr>
+            <w:r>
+              <w:t xml:space="preserve">Continuous seasonal sine harmonic</w:t>
+            </w:r>
+          </w:p>
+        </w:tc>
+        <w:tc>
+          <w:tcPr/>
+          <w:p>
+            <w:pPr>
+              <w:pStyle w:val="Compact"/>
+            </w:pPr>
+            <w:r>
+              <w:t xml:space="preserve">Derived</w:t>
+            </w:r>
+          </w:p>
+        </w:tc>
+        <w:tc>
+          <w:tcPr/>
+          <w:p>
+            <w:pPr>
+              <w:pStyle w:val="Compact"/>
+            </w:pPr>
+            <w:r>
+              <w:t xml:space="preserve">M3 only</w:t>
+            </w:r>
+          </w:p>
+        </w:tc>
+      </w:tr>
+      <w:tr>
+        <w:tc>
+          <w:tcPr/>
+          <w:p>
+            <w:pPr>
+              <w:pStyle w:val="Compact"/>
+            </w:pPr>
+            <w:r>
+              <w:t xml:space="preserve">doy_cos</w:t>
+            </w:r>
+          </w:p>
+        </w:tc>
+        <w:tc>
+          <w:tcPr/>
+          <w:p>
+            <w:pPr>
+              <w:pStyle w:val="Compact"/>
+            </w:pPr>
+            <w:r>
+              <w:t xml:space="preserve">Continuous seasonal cosine harmonic</w:t>
+            </w:r>
+          </w:p>
+        </w:tc>
+        <w:tc>
+          <w:tcPr/>
+          <w:p>
+            <w:pPr>
+              <w:pStyle w:val="Compact"/>
+            </w:pPr>
+            <w:r>
+              <w:t xml:space="preserve">Derived</w:t>
+            </w:r>
+          </w:p>
+        </w:tc>
+        <w:tc>
+          <w:tcPr/>
+          <w:p>
+            <w:pPr>
+              <w:pStyle w:val="Compact"/>
+            </w:pPr>
+            <w:r>
+              <w:t xml:space="preserve">M3 only</w:t>
+            </w:r>
+          </w:p>
+        </w:tc>
+      </w:tr>
+      <w:tr>
+        <w:tc>
+          <w:tcPr/>
+          <w:p>
+            <w:pPr>
+              <w:pStyle w:val="Compact"/>
+            </w:pPr>
+            <w:r>
+              <w:t xml:space="preserve">presion_quema_pastura</w:t>
+            </w:r>
+          </w:p>
+        </w:tc>
+        <w:tc>
+          <w:tcPr/>
+          <w:p>
+            <w:pPr>
+              <w:pStyle w:val="Compact"/>
+            </w:pPr>
+            <w:r>
+              <w:t xml:space="preserve">Pasture burning pressure (pasture × VPD × month weight)</w:t>
+            </w:r>
+          </w:p>
+        </w:tc>
+        <w:tc>
+          <w:tcPr/>
+          <w:p>
+            <w:pPr>
+              <w:pStyle w:val="Compact"/>
+            </w:pPr>
+            <w:r>
+              <w:t xml:space="preserve">Human–climate interaction</w:t>
+            </w:r>
+          </w:p>
+        </w:tc>
+        <w:tc>
+          <w:tcPr/>
+          <w:p>
+            <w:pPr>
+              <w:pStyle w:val="Compact"/>
+            </w:pPr>
+            <w:r>
+              <w:t xml:space="preserve">M3 only</w:t>
+            </w:r>
+          </w:p>
+        </w:tc>
+      </w:tr>
+      <w:tr>
+        <w:tc>
+          <w:tcPr/>
+          <w:p>
+            <w:pPr>
+              <w:pStyle w:val="Compact"/>
+            </w:pPr>
+            <w:r>
+              <w:t xml:space="preserve">focalizacion_antropica_local</w:t>
+            </w:r>
+          </w:p>
+        </w:tc>
+        <w:tc>
+          <w:tcPr/>
+          <w:p>
+            <w:pPr>
+              <w:pStyle w:val="Compact"/>
+            </w:pPr>
+            <w:r>
+              <w:t xml:space="preserve">Local-to-macro concentration ratio (5 km / 25 km)</w:t>
+            </w:r>
+          </w:p>
+        </w:tc>
+        <w:tc>
+          <w:tcPr/>
+          <w:p>
+            <w:pPr>
+              <w:pStyle w:val="Compact"/>
+            </w:pPr>
+            <w:r>
+              <w:t xml:space="preserve">Multiscale ratio</w:t>
+            </w:r>
+          </w:p>
+        </w:tc>
+        <w:tc>
+          <w:tcPr/>
+          <w:p>
+            <w:pPr>
+              <w:pStyle w:val="Compact"/>
+            </w:pPr>
+            <w:r>
+              <w:t xml:space="preserve">M3 only</w:t>
+            </w:r>
+          </w:p>
+        </w:tc>
+      </w:tr>
+      <w:tr>
+        <w:tc>
+          <w:tcPr/>
+          <w:p>
+            <w:pPr>
+              <w:pStyle w:val="Compact"/>
+            </w:pPr>
+            <w:r>
+              <w:t xml:space="preserve">interaccion_acceso_vpd</w:t>
+            </w:r>
+          </w:p>
+        </w:tc>
+        <w:tc>
+          <w:tcPr/>
+          <w:p>
+            <w:pPr>
+              <w:pStyle w:val="Compact"/>
+            </w:pPr>
+            <w:r>
+              <w:t xml:space="preserve">Accessibility–desiccation synergy (exp(−d_hist/5) × VPD)</w:t>
+            </w:r>
+          </w:p>
+        </w:tc>
+        <w:tc>
+          <w:tcPr/>
+          <w:p>
+            <w:pPr>
+              <w:pStyle w:val="Compact"/>
+            </w:pPr>
+            <w:r>
+              <w:t xml:space="preserve">Human–climate interaction</w:t>
+            </w:r>
+          </w:p>
+        </w:tc>
+        <w:tc>
+          <w:tcPr/>
+          <w:p>
+            <w:pPr>
+              <w:pStyle w:val="Compact"/>
+            </w:pPr>
+            <w:r>
+              <w:t xml:space="preserve">M3 only</w:t>
+            </w:r>
+          </w:p>
+        </w:tc>
+      </w:tr>
+      <w:tr>
+        <w:tc>
+          <w:tcPr/>
+          <w:p>
+            <w:pPr>
+              <w:pStyle w:val="Compact"/>
+            </w:pPr>
+            <w:r>
               <w:t xml:space="preserve">es_combustible</w:t>
             </w:r>
           </w:p>
@@ -4078,7 +4630,7 @@
               <w:pStyle w:val="Compact"/>
             </w:pPr>
             <w:r>
-              <w:t xml:space="preserve">MapBiomas C2 2023</w:t>
+              <w:t xml:space="preserve">MapBiomas C2 annual (Y-1)</w:t>
             </w:r>
           </w:p>
         </w:tc>

</xml_diff>